<commit_message>
Say what the train is in the workshop's railway analogy
The material spoke of the train ("composição", "trem vistoriado") without
saying what it stands for. The train is the product version, the
contract's text in the other analogy; the tracks and stations are its
path and record. Slide 10, the facilitator script and the pocket card
now say so.

Co-Authored-By: Claude Opus 5.5 <noreply@anthropic.com>
Claude-Session: https://claude.ai/code/session_017z8RJ8WcvgeWy5Kw7goBXT
</commit_message>
<xml_diff>
--- a/treinamento/oficina-nos-trilhos/2-roteiro-do-facilitador.docx
+++ b/treinamento/oficina-nos-trilhos/2-roteiro-do-facilitador.docx
@@ -564,7 +564,7 @@
         <w:spacing w:after="120" w:line="300"/>
       </w:pPr>
       <w:r>
-        <w:t xml:space="preserve">A oficina usa duas lentes, sempre juntas e sempre com o mesmo papel. A ferrovia é a lente para ver: todo desenho é de trilhos. O contrato é a lente para entender o motivo: toda regra é explicada com as minutas de um contrato. Não troque os papéis no meio da oficina, e não traga uma terceira analogia.</w:t>
+        <w:t xml:space="preserve">A oficina usa duas lentes, sempre juntas e sempre com o mesmo papel. A ferrovia é a lente para ver: todo desenho é de trilhos. O contrato é a lente para entender o motivo: toda regra é explicada com as minutas de um contrato. Não troque os papéis no meio da oficina, e não traga uma terceira analogia. O trem, a composição, é a versão do produto: o que se monta na develop, para na vistoria e entra em operação na main. Ele corresponde ao texto do contrato. Os trilhos e as estações não são o trem: são o caminho e o registro dele.</w:t>
       </w:r>
     </w:p>
     <w:tbl>
@@ -678,6 +678,87 @@
                 <w:color w:val="FFFFFF"/>
               </w:rPr>
               <w:t xml:space="preserve">No contrato</w:t>
+            </w:r>
+          </w:p>
+        </w:tc>
+      </w:tr>
+      <w:tr>
+        <w:tc>
+          <w:tcPr>
+            <w:tcW w:type="dxa" w:w="2000"/>
+            <w:tcBorders>
+              <w:top w:val="single" w:color="C2D2D6" w:sz="4"/>
+              <w:left w:val="single" w:color="C2D2D6" w:sz="4"/>
+              <w:bottom w:val="single" w:color="C2D2D6" w:sz="4"/>
+              <w:right w:val="single" w:color="C2D2D6" w:sz="4"/>
+            </w:tcBorders>
+            <w:tcMar>
+              <w:top w:type="dxa" w:w="80"/>
+              <w:left w:type="dxa" w:w="120"/>
+              <w:bottom w:type="dxa" w:w="80"/>
+              <w:right w:type="dxa" w:w="120"/>
+            </w:tcMar>
+          </w:tcPr>
+          <w:p>
+            <w:pPr>
+              <w:spacing w:after="0" w:line="270"/>
+            </w:pPr>
+            <w:r>
+              <w:rPr>
+                <w:b/>
+                <w:bCs/>
+              </w:rPr>
+              <w:t xml:space="preserve">A versão do produto</w:t>
+            </w:r>
+          </w:p>
+        </w:tc>
+        <w:tc>
+          <w:tcPr>
+            <w:tcW w:type="dxa" w:w="3326"/>
+            <w:tcBorders>
+              <w:top w:val="single" w:color="C2D2D6" w:sz="4"/>
+              <w:left w:val="single" w:color="C2D2D6" w:sz="4"/>
+              <w:bottom w:val="single" w:color="C2D2D6" w:sz="4"/>
+              <w:right w:val="single" w:color="C2D2D6" w:sz="4"/>
+            </w:tcBorders>
+            <w:tcMar>
+              <w:top w:type="dxa" w:w="80"/>
+              <w:left w:type="dxa" w:w="120"/>
+              <w:bottom w:type="dxa" w:w="80"/>
+              <w:right w:type="dxa" w:w="120"/>
+            </w:tcMar>
+          </w:tcPr>
+          <w:p>
+            <w:pPr>
+              <w:spacing w:after="0" w:line="270"/>
+            </w:pPr>
+            <w:r>
+              <w:t xml:space="preserve">a composição: o trem</w:t>
+            </w:r>
+          </w:p>
+        </w:tc>
+        <w:tc>
+          <w:tcPr>
+            <w:tcW w:type="dxa" w:w="3700"/>
+            <w:tcBorders>
+              <w:top w:val="single" w:color="C2D2D6" w:sz="4"/>
+              <w:left w:val="single" w:color="C2D2D6" w:sz="4"/>
+              <w:bottom w:val="single" w:color="C2D2D6" w:sz="4"/>
+              <w:right w:val="single" w:color="C2D2D6" w:sz="4"/>
+            </w:tcBorders>
+            <w:tcMar>
+              <w:top w:type="dxa" w:w="80"/>
+              <w:left w:type="dxa" w:w="120"/>
+              <w:bottom w:type="dxa" w:w="80"/>
+              <w:right w:type="dxa" w:w="120"/>
+            </w:tcMar>
+          </w:tcPr>
+          <w:p>
+            <w:pPr>
+              <w:spacing w:after="0" w:line="270"/>
+            </w:pPr>
+            <w:r>
+              <w:t xml:space="preserve">o texto do contrato</w:t>
             </w:r>
           </w:p>
         </w:tc>
@@ -3749,7 +3830,7 @@
           <w:iCs/>
           <w:color w:val="22292E"/>
         </w:rPr>
-        <w:t xml:space="preserve">A linha azul é um trilho. Cada bolinha é uma estação, um commit. Em B sai um desvio: alguém foi trabalhar separado, sem fechar a linha. F1 e F2 são as paradas desse trabalho. Em M, o desvio volta: isso é o merge.</w:t>
+        <w:t xml:space="preserve">A linha azul é um trilho. Cada bolinha é uma estação, um commit. Em B sai um desvio: alguém foi trabalhar separado, sem fechar a linha. F1 e F2 são as paradas desse trabalho. Em M, o desvio volta: isso é o merge. E o trem? O trem é a versão do produto, o texto do contrato. Os trilhos e as estações são o caminho e o registro dela.</w:t>
       </w:r>
     </w:p>
     <w:p>

</xml_diff>

<commit_message>
Split the GitFlow workshop into a train part and a contract part
The railway analogy was stretched over versions and merge types, which
it cannot explain. The workshop now teaches in two steps: part 1 uses
a train (the software) whose wagons are features, to explain only the
branches, where each starts and where it returns; part 2 switches to a
contract and its drafts for commits, the four merge types, conflicts,
version numbers and the VIC guidelines.

New drawings show wagons on the tracks in part 1 and the same layout as
contract timelines in part 2. The opening poll asks how to rebuild a
wagon without stopping the train, and activity 3 is now "A vida de uma
versão". Slides, facilitator script, activity material and pocket card
are regenerated; the deck goes from 39 to 41 slides.

Co-Authored-By: Claude Opus 5.5 <noreply@anthropic.com>
Claude-Session: https://claude.ai/code/session_017z8RJ8WcvgeWy5Kw7goBXT
</commit_message>
<xml_diff>
--- a/treinamento/oficina-nos-trilhos/2-roteiro-do-facilitador.docx
+++ b/treinamento/oficina-nos-trilhos/2-roteiro-do-facilitador.docx
@@ -342,7 +342,7 @@
         <w:rPr>
           <w:color w:val="525F66"/>
         </w:rPr>
-        <w:t xml:space="preserve"> — objetivos, as duas analogias e os papéis</w:t>
+        <w:t xml:space="preserve"> — objetivos, as duas partes e os papéis</w:t>
       </w:r>
     </w:p>
     <w:p>
@@ -467,7 +467,7 @@
         <w:spacing w:after="120" w:line="300"/>
       </w:pPr>
       <w:r>
-        <w:t xml:space="preserve">A oficina apresenta o GitFlow a quem nunca programou: a pessoa de negócio que acompanha entregas, conversa com o time técnico e ouve falar de branch, merge e release sem saber o que cada coisa quer dizer. Ao fim, ela entende o desenho do fluxo, os tipos de merge e as regras do Modelo VIC que tocam o seu dia a dia, e sabe que perguntas fazer ao time.</w:t>
+        <w:t xml:space="preserve">A oficina apresenta o GitFlow a quem nunca programou: a pessoa de negócio que acompanha entregas, conversa com o time técnico e ouve falar de branch, merge e release sem saber o que cada coisa quer dizer. Ao fim, ela entende para que servem as branches, os tipos de merge e as regras do Modelo VIC que tocam o seu dia a dia, e sabe que perguntas fazer ao time.</w:t>
       </w:r>
     </w:p>
     <w:p>
@@ -496,7 +496,7 @@
         <w:spacing w:after="80" w:line="290"/>
       </w:pPr>
       <w:r>
-        <w:t xml:space="preserve">Explicar em uma frase o que é um commit, uma branch e um merge.</w:t>
+        <w:t xml:space="preserve">Explicar para que serve uma branch: trabalhar num trilho separado sem parar o que está rodando.</w:t>
       </w:r>
     </w:p>
     <w:p>
@@ -522,7 +522,7 @@
         <w:spacing w:after="80" w:line="290"/>
       </w:pPr>
       <w:r>
-        <w:t xml:space="preserve">Reconhecer, num desenho, os quatro tipos de merge (fast-forward, merge commit, squash e rebase) e dizer o que cada um deixa no histórico.</w:t>
+        <w:t xml:space="preserve">Explicar em uma frase o que é um commit e um merge.</w:t>
       </w:r>
     </w:p>
     <w:p>
@@ -535,7 +535,7 @@
         <w:spacing w:after="80" w:line="290"/>
       </w:pPr>
       <w:r>
-        <w:t xml:space="preserve">Explicar o que é um conflito e por que a decisão pode ser de negócio.</w:t>
+        <w:t xml:space="preserve">Reconhecer, num desenho, os quatro tipos de merge (fast-forward, merge commit, squash e rebase) e dizer o que cada um deixa no histórico.</w:t>
       </w:r>
     </w:p>
     <w:p>
@@ -548,6 +548,19 @@
         <w:spacing w:after="80" w:line="290"/>
       </w:pPr>
       <w:r>
+        <w:t xml:space="preserve">Explicar o que é um conflito e por que a decisão pode ser de negócio.</w:t>
+      </w:r>
+    </w:p>
+    <w:p>
+      <w:pPr>
+        <w:pStyle w:val="ListParagraph"/>
+        <w:numPr>
+          <w:ilvl w:val="0"/>
+          <w:numId w:val="2"/>
+        </w:numPr>
+        <w:spacing w:after="80" w:line="290"/>
+      </w:pPr>
+      <w:r>
         <w:t xml:space="preserve">Relacionar o fluxo com as regras do Modelo VIC: pull request, proteção das branches, merge back, número da versão e divergência.</w:t>
       </w:r>
     </w:p>
@@ -556,7 +569,7 @@
         <w:pStyle w:val="Heading2"/>
       </w:pPr>
       <w:r>
-        <w:t xml:space="preserve">As duas analogias</w:t>
+        <w:t xml:space="preserve">Duas partes, duas analogias</w:t>
       </w:r>
     </w:p>
     <w:p>
@@ -564,7 +577,22 @@
         <w:spacing w:after="120" w:line="300"/>
       </w:pPr>
       <w:r>
-        <w:t xml:space="preserve">A oficina usa duas lentes, sempre juntas e sempre com o mesmo papel. A ferrovia é a lente para ver: todo desenho é de trilhos. O contrato é a lente para entender o motivo: toda regra é explicada com as minutas de um contrato. Não troque os papéis no meio da oficina, e não traga uma terceira analogia. O trem, a composição, é a versão do produto: o que se monta na develop, para na vistoria e entra em operação na main. Ele corresponde ao texto do contrato. Os trilhos e as estações não são o trem: são o caminho e o registro dele.</w:t>
+        <w:t xml:space="preserve">A oficina ensina em degraus, e cada degrau tem a sua analogia. Não misture as duas: o trem não fala de versões nem de tipos de merge, e o contrato só entra depois do intervalo.</w:t>
+      </w:r>
+    </w:p>
+    <w:p>
+      <w:pPr>
+        <w:spacing w:after="120" w:line="300"/>
+      </w:pPr>
+      <w:r>
+        <w:rPr>
+          <w:b/>
+          <w:bCs/>
+        </w:rPr>
+        <w:t xml:space="preserve">Parte 1 — o trem, para entender as branches. </w:t>
+      </w:r>
+      <w:r>
+        <w:t xml:space="preserve">O trem é o software, e cada vagão é uma funcionalidade. Mudar o software é mexer nos vagões: um vagão novo, uma melhoria num vagão ou o conserto de um vagão com defeito. O trem não pode parar, porque tem passageiros. Por isso o trabalho é feito em outros trilhos, e o que fica pronto é engatado de volta.</w:t>
       </w:r>
     </w:p>
     <w:tbl>
@@ -580,9 +608,10 @@
         </w:tblBorders>
       </w:tblPr>
       <w:tblGrid>
+        <w:gridCol w:w="1500"/>
         <w:gridCol w:w="2000"/>
-        <w:gridCol w:w="3326"/>
-        <w:gridCol w:w="3700"/>
+        <w:gridCol w:w="3226"/>
+        <w:gridCol w:w="2300"/>
       </w:tblGrid>
       <w:tr>
         <w:trPr>
@@ -590,7 +619,698 @@
         </w:trPr>
         <w:tc>
           <w:tcPr>
+            <w:tcW w:type="dxa" w:w="1500"/>
+            <w:tcBorders>
+              <w:top w:val="single" w:color="C2D2D6" w:sz="4"/>
+              <w:left w:val="single" w:color="C2D2D6" w:sz="4"/>
+              <w:bottom w:val="single" w:color="C2D2D6" w:sz="4"/>
+              <w:right w:val="single" w:color="C2D2D6" w:sz="4"/>
+            </w:tcBorders>
+            <w:shd w:fill="005CA9" w:color="auto" w:val="clear"/>
+            <w:tcMar>
+              <w:top w:type="dxa" w:w="80"/>
+              <w:left w:type="dxa" w:w="120"/>
+              <w:bottom w:type="dxa" w:w="80"/>
+              <w:right w:type="dxa" w:w="120"/>
+            </w:tcMar>
+          </w:tcPr>
+          <w:p>
+            <w:pPr>
+              <w:spacing w:after="0" w:line="270"/>
+            </w:pPr>
+            <w:r>
+              <w:rPr>
+                <w:b/>
+                <w:bCs/>
+                <w:color w:val="FFFFFF"/>
+              </w:rPr>
+              <w:t xml:space="preserve">Trilho</w:t>
+            </w:r>
+          </w:p>
+        </w:tc>
+        <w:tc>
+          <w:tcPr>
             <w:tcW w:type="dxa" w:w="2000"/>
+            <w:tcBorders>
+              <w:top w:val="single" w:color="C2D2D6" w:sz="4"/>
+              <w:left w:val="single" w:color="C2D2D6" w:sz="4"/>
+              <w:bottom w:val="single" w:color="C2D2D6" w:sz="4"/>
+              <w:right w:val="single" w:color="C2D2D6" w:sz="4"/>
+            </w:tcBorders>
+            <w:shd w:fill="005CA9" w:color="auto" w:val="clear"/>
+            <w:tcMar>
+              <w:top w:type="dxa" w:w="80"/>
+              <w:left w:type="dxa" w:w="120"/>
+              <w:bottom w:type="dxa" w:w="80"/>
+              <w:right w:type="dxa" w:w="120"/>
+            </w:tcMar>
+          </w:tcPr>
+          <w:p>
+            <w:pPr>
+              <w:spacing w:after="0" w:line="270"/>
+            </w:pPr>
+            <w:r>
+              <w:rPr>
+                <w:b/>
+                <w:bCs/>
+                <w:color w:val="FFFFFF"/>
+              </w:rPr>
+              <w:t xml:space="preserve">Na ferrovia</w:t>
+            </w:r>
+          </w:p>
+        </w:tc>
+        <w:tc>
+          <w:tcPr>
+            <w:tcW w:type="dxa" w:w="3226"/>
+            <w:tcBorders>
+              <w:top w:val="single" w:color="C2D2D6" w:sz="4"/>
+              <w:left w:val="single" w:color="C2D2D6" w:sz="4"/>
+              <w:bottom w:val="single" w:color="C2D2D6" w:sz="4"/>
+              <w:right w:val="single" w:color="C2D2D6" w:sz="4"/>
+            </w:tcBorders>
+            <w:shd w:fill="005CA9" w:color="auto" w:val="clear"/>
+            <w:tcMar>
+              <w:top w:type="dxa" w:w="80"/>
+              <w:left w:type="dxa" w:w="120"/>
+              <w:bottom w:type="dxa" w:w="80"/>
+              <w:right w:type="dxa" w:w="120"/>
+            </w:tcMar>
+          </w:tcPr>
+          <w:p>
+            <w:pPr>
+              <w:spacing w:after="0" w:line="270"/>
+            </w:pPr>
+            <w:r>
+              <w:rPr>
+                <w:b/>
+                <w:bCs/>
+                <w:color w:val="FFFFFF"/>
+              </w:rPr>
+              <w:t xml:space="preserve">O que roda</w:t>
+            </w:r>
+          </w:p>
+        </w:tc>
+        <w:tc>
+          <w:tcPr>
+            <w:tcW w:type="dxa" w:w="2300"/>
+            <w:tcBorders>
+              <w:top w:val="single" w:color="C2D2D6" w:sz="4"/>
+              <w:left w:val="single" w:color="C2D2D6" w:sz="4"/>
+              <w:bottom w:val="single" w:color="C2D2D6" w:sz="4"/>
+              <w:right w:val="single" w:color="C2D2D6" w:sz="4"/>
+            </w:tcBorders>
+            <w:shd w:fill="005CA9" w:color="auto" w:val="clear"/>
+            <w:tcMar>
+              <w:top w:type="dxa" w:w="80"/>
+              <w:left w:type="dxa" w:w="120"/>
+              <w:bottom w:type="dxa" w:w="80"/>
+              <w:right w:type="dxa" w:w="120"/>
+            </w:tcMar>
+          </w:tcPr>
+          <w:p>
+            <w:pPr>
+              <w:spacing w:after="0" w:line="270"/>
+            </w:pPr>
+            <w:r>
+              <w:rPr>
+                <w:b/>
+                <w:bCs/>
+                <w:color w:val="FFFFFF"/>
+              </w:rPr>
+              <w:t xml:space="preserve">Sai de → vai para</w:t>
+            </w:r>
+          </w:p>
+        </w:tc>
+      </w:tr>
+      <w:tr>
+        <w:tc>
+          <w:tcPr>
+            <w:tcW w:type="dxa" w:w="1500"/>
+            <w:tcBorders>
+              <w:top w:val="single" w:color="C2D2D6" w:sz="4"/>
+              <w:left w:val="single" w:color="C2D2D6" w:sz="4"/>
+              <w:bottom w:val="single" w:color="C2D2D6" w:sz="4"/>
+              <w:right w:val="single" w:color="C2D2D6" w:sz="4"/>
+            </w:tcBorders>
+            <w:tcMar>
+              <w:top w:type="dxa" w:w="80"/>
+              <w:left w:type="dxa" w:w="120"/>
+              <w:bottom w:type="dxa" w:w="80"/>
+              <w:right w:type="dxa" w:w="120"/>
+            </w:tcMar>
+          </w:tcPr>
+          <w:p>
+            <w:pPr>
+              <w:spacing w:after="0" w:line="270"/>
+            </w:pPr>
+            <w:r>
+              <w:rPr>
+                <w:rFonts w:ascii="Consolas" w:cs="Consolas" w:eastAsia="Consolas" w:hAnsi="Consolas"/>
+              </w:rPr>
+              <w:t xml:space="preserve">main</w:t>
+            </w:r>
+          </w:p>
+        </w:tc>
+        <w:tc>
+          <w:tcPr>
+            <w:tcW w:type="dxa" w:w="2000"/>
+            <w:tcBorders>
+              <w:top w:val="single" w:color="C2D2D6" w:sz="4"/>
+              <w:left w:val="single" w:color="C2D2D6" w:sz="4"/>
+              <w:bottom w:val="single" w:color="C2D2D6" w:sz="4"/>
+              <w:right w:val="single" w:color="C2D2D6" w:sz="4"/>
+            </w:tcBorders>
+            <w:tcMar>
+              <w:top w:type="dxa" w:w="80"/>
+              <w:left w:type="dxa" w:w="120"/>
+              <w:bottom w:type="dxa" w:w="80"/>
+              <w:right w:type="dxa" w:w="120"/>
+            </w:tcMar>
+          </w:tcPr>
+          <w:p>
+            <w:pPr>
+              <w:spacing w:after="0" w:line="270"/>
+            </w:pPr>
+            <w:r>
+              <w:t xml:space="preserve">a linha comercial</w:t>
+            </w:r>
+          </w:p>
+        </w:tc>
+        <w:tc>
+          <w:tcPr>
+            <w:tcW w:type="dxa" w:w="3226"/>
+            <w:tcBorders>
+              <w:top w:val="single" w:color="C2D2D6" w:sz="4"/>
+              <w:left w:val="single" w:color="C2D2D6" w:sz="4"/>
+              <w:bottom w:val="single" w:color="C2D2D6" w:sz="4"/>
+              <w:right w:val="single" w:color="C2D2D6" w:sz="4"/>
+            </w:tcBorders>
+            <w:tcMar>
+              <w:top w:type="dxa" w:w="80"/>
+              <w:left w:type="dxa" w:w="120"/>
+              <w:bottom w:type="dxa" w:w="80"/>
+              <w:right w:type="dxa" w:w="120"/>
+            </w:tcMar>
+          </w:tcPr>
+          <w:p>
+            <w:pPr>
+              <w:spacing w:after="0" w:line="270"/>
+            </w:pPr>
+            <w:r>
+              <w:t xml:space="preserve">o trem completo, com passageiros</w:t>
+            </w:r>
+          </w:p>
+        </w:tc>
+        <w:tc>
+          <w:tcPr>
+            <w:tcW w:type="dxa" w:w="2300"/>
+            <w:tcBorders>
+              <w:top w:val="single" w:color="C2D2D6" w:sz="4"/>
+              <w:left w:val="single" w:color="C2D2D6" w:sz="4"/>
+              <w:bottom w:val="single" w:color="C2D2D6" w:sz="4"/>
+              <w:right w:val="single" w:color="C2D2D6" w:sz="4"/>
+            </w:tcBorders>
+            <w:tcMar>
+              <w:top w:type="dxa" w:w="80"/>
+              <w:left w:type="dxa" w:w="120"/>
+              <w:bottom w:type="dxa" w:w="80"/>
+              <w:right w:type="dxa" w:w="120"/>
+            </w:tcMar>
+          </w:tcPr>
+          <w:p>
+            <w:pPr>
+              <w:spacing w:after="0" w:line="270"/>
+            </w:pPr>
+            <w:r>
+              <w:t xml:space="preserve">permanente</w:t>
+            </w:r>
+          </w:p>
+        </w:tc>
+      </w:tr>
+      <w:tr>
+        <w:tc>
+          <w:tcPr>
+            <w:tcW w:type="dxa" w:w="1500"/>
+            <w:tcBorders>
+              <w:top w:val="single" w:color="C2D2D6" w:sz="4"/>
+              <w:left w:val="single" w:color="C2D2D6" w:sz="4"/>
+              <w:bottom w:val="single" w:color="C2D2D6" w:sz="4"/>
+              <w:right w:val="single" w:color="C2D2D6" w:sz="4"/>
+            </w:tcBorders>
+            <w:tcMar>
+              <w:top w:type="dxa" w:w="80"/>
+              <w:left w:type="dxa" w:w="120"/>
+              <w:bottom w:type="dxa" w:w="80"/>
+              <w:right w:type="dxa" w:w="120"/>
+            </w:tcMar>
+          </w:tcPr>
+          <w:p>
+            <w:pPr>
+              <w:spacing w:after="0" w:line="270"/>
+            </w:pPr>
+            <w:r>
+              <w:rPr>
+                <w:rFonts w:ascii="Consolas" w:cs="Consolas" w:eastAsia="Consolas" w:hAnsi="Consolas"/>
+              </w:rPr>
+              <w:t xml:space="preserve">develop</w:t>
+            </w:r>
+          </w:p>
+        </w:tc>
+        <w:tc>
+          <w:tcPr>
+            <w:tcW w:type="dxa" w:w="2000"/>
+            <w:tcBorders>
+              <w:top w:val="single" w:color="C2D2D6" w:sz="4"/>
+              <w:left w:val="single" w:color="C2D2D6" w:sz="4"/>
+              <w:bottom w:val="single" w:color="C2D2D6" w:sz="4"/>
+              <w:right w:val="single" w:color="C2D2D6" w:sz="4"/>
+            </w:tcBorders>
+            <w:tcMar>
+              <w:top w:type="dxa" w:w="80"/>
+              <w:left w:type="dxa" w:w="120"/>
+              <w:bottom w:type="dxa" w:w="80"/>
+              <w:right w:type="dxa" w:w="120"/>
+            </w:tcMar>
+          </w:tcPr>
+          <w:p>
+            <w:pPr>
+              <w:spacing w:after="0" w:line="270"/>
+            </w:pPr>
+            <w:r>
+              <w:t xml:space="preserve">o pátio de montagem</w:t>
+            </w:r>
+          </w:p>
+        </w:tc>
+        <w:tc>
+          <w:tcPr>
+            <w:tcW w:type="dxa" w:w="3226"/>
+            <w:tcBorders>
+              <w:top w:val="single" w:color="C2D2D6" w:sz="4"/>
+              <w:left w:val="single" w:color="C2D2D6" w:sz="4"/>
+              <w:bottom w:val="single" w:color="C2D2D6" w:sz="4"/>
+              <w:right w:val="single" w:color="C2D2D6" w:sz="4"/>
+            </w:tcBorders>
+            <w:tcMar>
+              <w:top w:type="dxa" w:w="80"/>
+              <w:left w:type="dxa" w:w="120"/>
+              <w:bottom w:type="dxa" w:w="80"/>
+              <w:right w:type="dxa" w:w="120"/>
+            </w:tcMar>
+          </w:tcPr>
+          <w:p>
+            <w:pPr>
+              <w:spacing w:after="0" w:line="270"/>
+            </w:pPr>
+            <w:r>
+              <w:t xml:space="preserve">a próxima composição, com os vagões já prontos</w:t>
+            </w:r>
+          </w:p>
+        </w:tc>
+        <w:tc>
+          <w:tcPr>
+            <w:tcW w:type="dxa" w:w="2300"/>
+            <w:tcBorders>
+              <w:top w:val="single" w:color="C2D2D6" w:sz="4"/>
+              <w:left w:val="single" w:color="C2D2D6" w:sz="4"/>
+              <w:bottom w:val="single" w:color="C2D2D6" w:sz="4"/>
+              <w:right w:val="single" w:color="C2D2D6" w:sz="4"/>
+            </w:tcBorders>
+            <w:tcMar>
+              <w:top w:type="dxa" w:w="80"/>
+              <w:left w:type="dxa" w:w="120"/>
+              <w:bottom w:type="dxa" w:w="80"/>
+              <w:right w:type="dxa" w:w="120"/>
+            </w:tcMar>
+          </w:tcPr>
+          <w:p>
+            <w:pPr>
+              <w:spacing w:after="0" w:line="270"/>
+            </w:pPr>
+            <w:r>
+              <w:t xml:space="preserve">permanente</w:t>
+            </w:r>
+          </w:p>
+        </w:tc>
+      </w:tr>
+      <w:tr>
+        <w:tc>
+          <w:tcPr>
+            <w:tcW w:type="dxa" w:w="1500"/>
+            <w:tcBorders>
+              <w:top w:val="single" w:color="C2D2D6" w:sz="4"/>
+              <w:left w:val="single" w:color="C2D2D6" w:sz="4"/>
+              <w:bottom w:val="single" w:color="C2D2D6" w:sz="4"/>
+              <w:right w:val="single" w:color="C2D2D6" w:sz="4"/>
+            </w:tcBorders>
+            <w:tcMar>
+              <w:top w:type="dxa" w:w="80"/>
+              <w:left w:type="dxa" w:w="120"/>
+              <w:bottom w:type="dxa" w:w="80"/>
+              <w:right w:type="dxa" w:w="120"/>
+            </w:tcMar>
+          </w:tcPr>
+          <w:p>
+            <w:pPr>
+              <w:spacing w:after="0" w:line="270"/>
+            </w:pPr>
+            <w:r>
+              <w:rPr>
+                <w:rFonts w:ascii="Consolas" w:cs="Consolas" w:eastAsia="Consolas" w:hAnsi="Consolas"/>
+              </w:rPr>
+              <w:t xml:space="preserve">feature/*</w:t>
+            </w:r>
+          </w:p>
+        </w:tc>
+        <w:tc>
+          <w:tcPr>
+            <w:tcW w:type="dxa" w:w="2000"/>
+            <w:tcBorders>
+              <w:top w:val="single" w:color="C2D2D6" w:sz="4"/>
+              <w:left w:val="single" w:color="C2D2D6" w:sz="4"/>
+              <w:bottom w:val="single" w:color="C2D2D6" w:sz="4"/>
+              <w:right w:val="single" w:color="C2D2D6" w:sz="4"/>
+            </w:tcBorders>
+            <w:tcMar>
+              <w:top w:type="dxa" w:w="80"/>
+              <w:left w:type="dxa" w:w="120"/>
+              <w:bottom w:type="dxa" w:w="80"/>
+              <w:right w:type="dxa" w:w="120"/>
+            </w:tcMar>
+          </w:tcPr>
+          <w:p>
+            <w:pPr>
+              <w:spacing w:after="0" w:line="270"/>
+            </w:pPr>
+            <w:r>
+              <w:t xml:space="preserve">a oficina</w:t>
+            </w:r>
+          </w:p>
+        </w:tc>
+        <w:tc>
+          <w:tcPr>
+            <w:tcW w:type="dxa" w:w="3226"/>
+            <w:tcBorders>
+              <w:top w:val="single" w:color="C2D2D6" w:sz="4"/>
+              <w:left w:val="single" w:color="C2D2D6" w:sz="4"/>
+              <w:bottom w:val="single" w:color="C2D2D6" w:sz="4"/>
+              <w:right w:val="single" w:color="C2D2D6" w:sz="4"/>
+            </w:tcBorders>
+            <w:tcMar>
+              <w:top w:type="dxa" w:w="80"/>
+              <w:left w:type="dxa" w:w="120"/>
+              <w:bottom w:type="dxa" w:w="80"/>
+              <w:right w:type="dxa" w:w="120"/>
+            </w:tcMar>
+          </w:tcPr>
+          <w:p>
+            <w:pPr>
+              <w:spacing w:after="0" w:line="270"/>
+            </w:pPr>
+            <w:r>
+              <w:t xml:space="preserve">um vagão, novo ou em melhoria</w:t>
+            </w:r>
+          </w:p>
+        </w:tc>
+        <w:tc>
+          <w:tcPr>
+            <w:tcW w:type="dxa" w:w="2300"/>
+            <w:tcBorders>
+              <w:top w:val="single" w:color="C2D2D6" w:sz="4"/>
+              <w:left w:val="single" w:color="C2D2D6" w:sz="4"/>
+              <w:bottom w:val="single" w:color="C2D2D6" w:sz="4"/>
+              <w:right w:val="single" w:color="C2D2D6" w:sz="4"/>
+            </w:tcBorders>
+            <w:tcMar>
+              <w:top w:type="dxa" w:w="80"/>
+              <w:left w:type="dxa" w:w="120"/>
+              <w:bottom w:type="dxa" w:w="80"/>
+              <w:right w:type="dxa" w:w="120"/>
+            </w:tcMar>
+          </w:tcPr>
+          <w:p>
+            <w:pPr>
+              <w:spacing w:after="0" w:line="270"/>
+            </w:pPr>
+            <w:r>
+              <w:t xml:space="preserve">develop → develop</w:t>
+            </w:r>
+          </w:p>
+        </w:tc>
+      </w:tr>
+      <w:tr>
+        <w:tc>
+          <w:tcPr>
+            <w:tcW w:type="dxa" w:w="1500"/>
+            <w:tcBorders>
+              <w:top w:val="single" w:color="C2D2D6" w:sz="4"/>
+              <w:left w:val="single" w:color="C2D2D6" w:sz="4"/>
+              <w:bottom w:val="single" w:color="C2D2D6" w:sz="4"/>
+              <w:right w:val="single" w:color="C2D2D6" w:sz="4"/>
+            </w:tcBorders>
+            <w:tcMar>
+              <w:top w:type="dxa" w:w="80"/>
+              <w:left w:type="dxa" w:w="120"/>
+              <w:bottom w:type="dxa" w:w="80"/>
+              <w:right w:type="dxa" w:w="120"/>
+            </w:tcMar>
+          </w:tcPr>
+          <w:p>
+            <w:pPr>
+              <w:spacing w:after="0" w:line="270"/>
+            </w:pPr>
+            <w:r>
+              <w:rPr>
+                <w:rFonts w:ascii="Consolas" w:cs="Consolas" w:eastAsia="Consolas" w:hAnsi="Consolas"/>
+              </w:rPr>
+              <w:t xml:space="preserve">release/*</w:t>
+            </w:r>
+          </w:p>
+        </w:tc>
+        <w:tc>
+          <w:tcPr>
+            <w:tcW w:type="dxa" w:w="2000"/>
+            <w:tcBorders>
+              <w:top w:val="single" w:color="C2D2D6" w:sz="4"/>
+              <w:left w:val="single" w:color="C2D2D6" w:sz="4"/>
+              <w:bottom w:val="single" w:color="C2D2D6" w:sz="4"/>
+              <w:right w:val="single" w:color="C2D2D6" w:sz="4"/>
+            </w:tcBorders>
+            <w:tcMar>
+              <w:top w:type="dxa" w:w="80"/>
+              <w:left w:type="dxa" w:w="120"/>
+              <w:bottom w:type="dxa" w:w="80"/>
+              <w:right w:type="dxa" w:w="120"/>
+            </w:tcMar>
+          </w:tcPr>
+          <w:p>
+            <w:pPr>
+              <w:spacing w:after="0" w:line="270"/>
+            </w:pPr>
+            <w:r>
+              <w:t xml:space="preserve">a vistoria</w:t>
+            </w:r>
+          </w:p>
+        </w:tc>
+        <w:tc>
+          <w:tcPr>
+            <w:tcW w:type="dxa" w:w="3226"/>
+            <w:tcBorders>
+              <w:top w:val="single" w:color="C2D2D6" w:sz="4"/>
+              <w:left w:val="single" w:color="C2D2D6" w:sz="4"/>
+              <w:bottom w:val="single" w:color="C2D2D6" w:sz="4"/>
+              <w:right w:val="single" w:color="C2D2D6" w:sz="4"/>
+            </w:tcBorders>
+            <w:tcMar>
+              <w:top w:type="dxa" w:w="80"/>
+              <w:left w:type="dxa" w:w="120"/>
+              <w:bottom w:type="dxa" w:w="80"/>
+              <w:right w:type="dxa" w:w="120"/>
+            </w:tcMar>
+          </w:tcPr>
+          <w:p>
+            <w:pPr>
+              <w:spacing w:after="0" w:line="270"/>
+            </w:pPr>
+            <w:r>
+              <w:t xml:space="preserve">a composição inteira; só se conserta</w:t>
+            </w:r>
+          </w:p>
+        </w:tc>
+        <w:tc>
+          <w:tcPr>
+            <w:tcW w:type="dxa" w:w="2300"/>
+            <w:tcBorders>
+              <w:top w:val="single" w:color="C2D2D6" w:sz="4"/>
+              <w:left w:val="single" w:color="C2D2D6" w:sz="4"/>
+              <w:bottom w:val="single" w:color="C2D2D6" w:sz="4"/>
+              <w:right w:val="single" w:color="C2D2D6" w:sz="4"/>
+            </w:tcBorders>
+            <w:tcMar>
+              <w:top w:type="dxa" w:w="80"/>
+              <w:left w:type="dxa" w:w="120"/>
+              <w:bottom w:type="dxa" w:w="80"/>
+              <w:right w:type="dxa" w:w="120"/>
+            </w:tcMar>
+          </w:tcPr>
+          <w:p>
+            <w:pPr>
+              <w:spacing w:after="0" w:line="270"/>
+            </w:pPr>
+            <w:r>
+              <w:t xml:space="preserve">develop → main e develop</w:t>
+            </w:r>
+          </w:p>
+        </w:tc>
+      </w:tr>
+      <w:tr>
+        <w:tc>
+          <w:tcPr>
+            <w:tcW w:type="dxa" w:w="1500"/>
+            <w:tcBorders>
+              <w:top w:val="single" w:color="C2D2D6" w:sz="4"/>
+              <w:left w:val="single" w:color="C2D2D6" w:sz="4"/>
+              <w:bottom w:val="single" w:color="C2D2D6" w:sz="4"/>
+              <w:right w:val="single" w:color="C2D2D6" w:sz="4"/>
+            </w:tcBorders>
+            <w:tcMar>
+              <w:top w:type="dxa" w:w="80"/>
+              <w:left w:type="dxa" w:w="120"/>
+              <w:bottom w:type="dxa" w:w="80"/>
+              <w:right w:type="dxa" w:w="120"/>
+            </w:tcMar>
+          </w:tcPr>
+          <w:p>
+            <w:pPr>
+              <w:spacing w:after="0" w:line="270"/>
+            </w:pPr>
+            <w:r>
+              <w:rPr>
+                <w:rFonts w:ascii="Consolas" w:cs="Consolas" w:eastAsia="Consolas" w:hAnsi="Consolas"/>
+              </w:rPr>
+              <w:t xml:space="preserve">hotfix/*</w:t>
+            </w:r>
+          </w:p>
+        </w:tc>
+        <w:tc>
+          <w:tcPr>
+            <w:tcW w:type="dxa" w:w="2000"/>
+            <w:tcBorders>
+              <w:top w:val="single" w:color="C2D2D6" w:sz="4"/>
+              <w:left w:val="single" w:color="C2D2D6" w:sz="4"/>
+              <w:bottom w:val="single" w:color="C2D2D6" w:sz="4"/>
+              <w:right w:val="single" w:color="C2D2D6" w:sz="4"/>
+            </w:tcBorders>
+            <w:tcMar>
+              <w:top w:type="dxa" w:w="80"/>
+              <w:left w:type="dxa" w:w="120"/>
+              <w:bottom w:type="dxa" w:w="80"/>
+              <w:right w:type="dxa" w:w="120"/>
+            </w:tcMar>
+          </w:tcPr>
+          <w:p>
+            <w:pPr>
+              <w:spacing w:after="0" w:line="270"/>
+            </w:pPr>
+            <w:r>
+              <w:t xml:space="preserve">a emergência</w:t>
+            </w:r>
+          </w:p>
+        </w:tc>
+        <w:tc>
+          <w:tcPr>
+            <w:tcW w:type="dxa" w:w="3226"/>
+            <w:tcBorders>
+              <w:top w:val="single" w:color="C2D2D6" w:sz="4"/>
+              <w:left w:val="single" w:color="C2D2D6" w:sz="4"/>
+              <w:bottom w:val="single" w:color="C2D2D6" w:sz="4"/>
+              <w:right w:val="single" w:color="C2D2D6" w:sz="4"/>
+            </w:tcBorders>
+            <w:tcMar>
+              <w:top w:type="dxa" w:w="80"/>
+              <w:left w:type="dxa" w:w="120"/>
+              <w:bottom w:type="dxa" w:w="80"/>
+              <w:right w:type="dxa" w:w="120"/>
+            </w:tcMar>
+          </w:tcPr>
+          <w:p>
+            <w:pPr>
+              <w:spacing w:after="0" w:line="270"/>
+            </w:pPr>
+            <w:r>
+              <w:t xml:space="preserve">um vagão: o que deu defeito no trem comercial</w:t>
+            </w:r>
+          </w:p>
+        </w:tc>
+        <w:tc>
+          <w:tcPr>
+            <w:tcW w:type="dxa" w:w="2300"/>
+            <w:tcBorders>
+              <w:top w:val="single" w:color="C2D2D6" w:sz="4"/>
+              <w:left w:val="single" w:color="C2D2D6" w:sz="4"/>
+              <w:bottom w:val="single" w:color="C2D2D6" w:sz="4"/>
+              <w:right w:val="single" w:color="C2D2D6" w:sz="4"/>
+            </w:tcBorders>
+            <w:tcMar>
+              <w:top w:type="dxa" w:w="80"/>
+              <w:left w:type="dxa" w:w="120"/>
+              <w:bottom w:type="dxa" w:w="80"/>
+              <w:right w:type="dxa" w:w="120"/>
+            </w:tcMar>
+          </w:tcPr>
+          <w:p>
+            <w:pPr>
+              <w:spacing w:after="0" w:line="270"/>
+            </w:pPr>
+            <w:r>
+              <w:t xml:space="preserve">main → main e develop</w:t>
+            </w:r>
+          </w:p>
+        </w:tc>
+      </w:tr>
+    </w:tbl>
+    <w:p>
+      <w:pPr>
+        <w:spacing w:after="120"/>
+      </w:pPr>
+    </w:p>
+    <w:p>
+      <w:pPr>
+        <w:spacing w:after="120" w:line="300"/>
+      </w:pPr>
+      <w:r>
+        <w:rPr>
+          <w:b/>
+          <w:bCs/>
+        </w:rPr>
+        <w:t xml:space="preserve">Parte 2 — o contrato, para entender o que fica registrado e como os trilhos se juntam. </w:t>
+      </w:r>
+      <w:r>
+        <w:t xml:space="preserve">Os trilhos viram linhas do tempo de um contrato. Cada bolinha é uma versão rubricada; cada linha, uma cópia de trabalho; o vagão vira cláusula. É com o contrato que entram o commit, os quatro merges, o conflito, o número da versão, o pull request e o merge back.</w:t>
+      </w:r>
+    </w:p>
+    <w:tbl>
+      <w:tblPr>
+        <w:tblW w:type="dxa" w:w="9026"/>
+        <w:tblBorders>
+          <w:top w:val="single" w:color="auto" w:sz="4"/>
+          <w:left w:val="single" w:color="auto" w:sz="4"/>
+          <w:bottom w:val="single" w:color="auto" w:sz="4"/>
+          <w:right w:val="single" w:color="auto" w:sz="4"/>
+          <w:insideH w:val="single" w:color="auto" w:sz="4"/>
+          <w:insideV w:val="single" w:color="auto" w:sz="4"/>
+        </w:tblBorders>
+      </w:tblPr>
+      <w:tblGrid>
+        <w:gridCol w:w="2400"/>
+        <w:gridCol w:w="6626"/>
+      </w:tblGrid>
+      <w:tr>
+        <w:trPr>
+          <w:tblHeader/>
+        </w:trPr>
+        <w:tc>
+          <w:tcPr>
+            <w:tcW w:type="dxa" w:w="2400"/>
             <w:tcBorders>
               <w:top w:val="single" w:color="C2D2D6" w:sz="4"/>
               <w:left w:val="single" w:color="C2D2D6" w:sz="4"/>
@@ -621,38 +1341,7 @@
         </w:tc>
         <w:tc>
           <w:tcPr>
-            <w:tcW w:type="dxa" w:w="3326"/>
-            <w:tcBorders>
-              <w:top w:val="single" w:color="C2D2D6" w:sz="4"/>
-              <w:left w:val="single" w:color="C2D2D6" w:sz="4"/>
-              <w:bottom w:val="single" w:color="C2D2D6" w:sz="4"/>
-              <w:right w:val="single" w:color="C2D2D6" w:sz="4"/>
-            </w:tcBorders>
-            <w:shd w:fill="005CA9" w:color="auto" w:val="clear"/>
-            <w:tcMar>
-              <w:top w:type="dxa" w:w="80"/>
-              <w:left w:type="dxa" w:w="120"/>
-              <w:bottom w:type="dxa" w:w="80"/>
-              <w:right w:type="dxa" w:w="120"/>
-            </w:tcMar>
-          </w:tcPr>
-          <w:p>
-            <w:pPr>
-              <w:spacing w:after="0" w:line="270"/>
-            </w:pPr>
-            <w:r>
-              <w:rPr>
-                <w:b/>
-                <w:bCs/>
-                <w:color w:val="FFFFFF"/>
-              </w:rPr>
-              <w:t xml:space="preserve">Na ferrovia</w:t>
-            </w:r>
-          </w:p>
-        </w:tc>
-        <w:tc>
-          <w:tcPr>
-            <w:tcW w:type="dxa" w:w="3700"/>
+            <w:tcW w:type="dxa" w:w="6626"/>
             <w:tcBorders>
               <w:top w:val="single" w:color="C2D2D6" w:sz="4"/>
               <w:left w:val="single" w:color="C2D2D6" w:sz="4"/>
@@ -685,88 +1374,7 @@
       <w:tr>
         <w:tc>
           <w:tcPr>
-            <w:tcW w:type="dxa" w:w="2000"/>
-            <w:tcBorders>
-              <w:top w:val="single" w:color="C2D2D6" w:sz="4"/>
-              <w:left w:val="single" w:color="C2D2D6" w:sz="4"/>
-              <w:bottom w:val="single" w:color="C2D2D6" w:sz="4"/>
-              <w:right w:val="single" w:color="C2D2D6" w:sz="4"/>
-            </w:tcBorders>
-            <w:tcMar>
-              <w:top w:type="dxa" w:w="80"/>
-              <w:left w:type="dxa" w:w="120"/>
-              <w:bottom w:type="dxa" w:w="80"/>
-              <w:right w:type="dxa" w:w="120"/>
-            </w:tcMar>
-          </w:tcPr>
-          <w:p>
-            <w:pPr>
-              <w:spacing w:after="0" w:line="270"/>
-            </w:pPr>
-            <w:r>
-              <w:rPr>
-                <w:b/>
-                <w:bCs/>
-              </w:rPr>
-              <w:t xml:space="preserve">A versão do produto</w:t>
-            </w:r>
-          </w:p>
-        </w:tc>
-        <w:tc>
-          <w:tcPr>
-            <w:tcW w:type="dxa" w:w="3326"/>
-            <w:tcBorders>
-              <w:top w:val="single" w:color="C2D2D6" w:sz="4"/>
-              <w:left w:val="single" w:color="C2D2D6" w:sz="4"/>
-              <w:bottom w:val="single" w:color="C2D2D6" w:sz="4"/>
-              <w:right w:val="single" w:color="C2D2D6" w:sz="4"/>
-            </w:tcBorders>
-            <w:tcMar>
-              <w:top w:type="dxa" w:w="80"/>
-              <w:left w:type="dxa" w:w="120"/>
-              <w:bottom w:type="dxa" w:w="80"/>
-              <w:right w:type="dxa" w:w="120"/>
-            </w:tcMar>
-          </w:tcPr>
-          <w:p>
-            <w:pPr>
-              <w:spacing w:after="0" w:line="270"/>
-            </w:pPr>
-            <w:r>
-              <w:t xml:space="preserve">a composição: o trem</w:t>
-            </w:r>
-          </w:p>
-        </w:tc>
-        <w:tc>
-          <w:tcPr>
-            <w:tcW w:type="dxa" w:w="3700"/>
-            <w:tcBorders>
-              <w:top w:val="single" w:color="C2D2D6" w:sz="4"/>
-              <w:left w:val="single" w:color="C2D2D6" w:sz="4"/>
-              <w:bottom w:val="single" w:color="C2D2D6" w:sz="4"/>
-              <w:right w:val="single" w:color="C2D2D6" w:sz="4"/>
-            </w:tcBorders>
-            <w:tcMar>
-              <w:top w:type="dxa" w:w="80"/>
-              <w:left w:type="dxa" w:w="120"/>
-              <w:bottom w:type="dxa" w:w="80"/>
-              <w:right w:type="dxa" w:w="120"/>
-            </w:tcMar>
-          </w:tcPr>
-          <w:p>
-            <w:pPr>
-              <w:spacing w:after="0" w:line="270"/>
-            </w:pPr>
-            <w:r>
-              <w:t xml:space="preserve">o texto do contrato</w:t>
-            </w:r>
-          </w:p>
-        </w:tc>
-      </w:tr>
-      <w:tr>
-        <w:tc>
-          <w:tcPr>
-            <w:tcW w:type="dxa" w:w="2000"/>
+            <w:tcW w:type="dxa" w:w="2400"/>
             <w:tcBorders>
               <w:top w:val="single" w:color="C2D2D6" w:sz="4"/>
               <w:left w:val="single" w:color="C2D2D6" w:sz="4"/>
@@ -795,32 +1403,7 @@
         </w:tc>
         <w:tc>
           <w:tcPr>
-            <w:tcW w:type="dxa" w:w="3326"/>
-            <w:tcBorders>
-              <w:top w:val="single" w:color="C2D2D6" w:sz="4"/>
-              <w:left w:val="single" w:color="C2D2D6" w:sz="4"/>
-              <w:bottom w:val="single" w:color="C2D2D6" w:sz="4"/>
-              <w:right w:val="single" w:color="C2D2D6" w:sz="4"/>
-            </w:tcBorders>
-            <w:tcMar>
-              <w:top w:type="dxa" w:w="80"/>
-              <w:left w:type="dxa" w:w="120"/>
-              <w:bottom w:type="dxa" w:w="80"/>
-              <w:right w:type="dxa" w:w="120"/>
-            </w:tcMar>
-          </w:tcPr>
-          <w:p>
-            <w:pPr>
-              <w:spacing w:after="0" w:line="270"/>
-            </w:pPr>
-            <w:r>
-              <w:t xml:space="preserve">a malha ferroviária</w:t>
-            </w:r>
-          </w:p>
-        </w:tc>
-        <w:tc>
-          <w:tcPr>
-            <w:tcW w:type="dxa" w:w="3700"/>
+            <w:tcW w:type="dxa" w:w="6626"/>
             <w:tcBorders>
               <w:top w:val="single" w:color="C2D2D6" w:sz="4"/>
               <w:left w:val="single" w:color="C2D2D6" w:sz="4"/>
@@ -847,7 +1430,7 @@
       <w:tr>
         <w:tc>
           <w:tcPr>
-            <w:tcW w:type="dxa" w:w="2000"/>
+            <w:tcW w:type="dxa" w:w="2400"/>
             <w:tcBorders>
               <w:top w:val="single" w:color="C2D2D6" w:sz="4"/>
               <w:left w:val="single" w:color="C2D2D6" w:sz="4"/>
@@ -876,32 +1459,7 @@
         </w:tc>
         <w:tc>
           <w:tcPr>
-            <w:tcW w:type="dxa" w:w="3326"/>
-            <w:tcBorders>
-              <w:top w:val="single" w:color="C2D2D6" w:sz="4"/>
-              <w:left w:val="single" w:color="C2D2D6" w:sz="4"/>
-              <w:bottom w:val="single" w:color="C2D2D6" w:sz="4"/>
-              <w:right w:val="single" w:color="C2D2D6" w:sz="4"/>
-            </w:tcBorders>
-            <w:tcMar>
-              <w:top w:type="dxa" w:w="80"/>
-              <w:left w:type="dxa" w:w="120"/>
-              <w:bottom w:type="dxa" w:w="80"/>
-              <w:right w:type="dxa" w:w="120"/>
-            </w:tcMar>
-          </w:tcPr>
-          <w:p>
-            <w:pPr>
-              <w:spacing w:after="0" w:line="270"/>
-            </w:pPr>
-            <w:r>
-              <w:t xml:space="preserve">uma estação</w:t>
-            </w:r>
-          </w:p>
-        </w:tc>
-        <w:tc>
-          <w:tcPr>
-            <w:tcW w:type="dxa" w:w="3700"/>
+            <w:tcW w:type="dxa" w:w="6626"/>
             <w:tcBorders>
               <w:top w:val="single" w:color="C2D2D6" w:sz="4"/>
               <w:left w:val="single" w:color="C2D2D6" w:sz="4"/>
@@ -928,7 +1486,7 @@
       <w:tr>
         <w:tc>
           <w:tcPr>
-            <w:tcW w:type="dxa" w:w="2000"/>
+            <w:tcW w:type="dxa" w:w="2400"/>
             <w:tcBorders>
               <w:top w:val="single" w:color="C2D2D6" w:sz="4"/>
               <w:left w:val="single" w:color="C2D2D6" w:sz="4"/>
@@ -957,32 +1515,7 @@
         </w:tc>
         <w:tc>
           <w:tcPr>
-            <w:tcW w:type="dxa" w:w="3326"/>
-            <w:tcBorders>
-              <w:top w:val="single" w:color="C2D2D6" w:sz="4"/>
-              <w:left w:val="single" w:color="C2D2D6" w:sz="4"/>
-              <w:bottom w:val="single" w:color="C2D2D6" w:sz="4"/>
-              <w:right w:val="single" w:color="C2D2D6" w:sz="4"/>
-            </w:tcBorders>
-            <w:tcMar>
-              <w:top w:type="dxa" w:w="80"/>
-              <w:left w:type="dxa" w:w="120"/>
-              <w:bottom w:type="dxa" w:w="80"/>
-              <w:right w:type="dxa" w:w="120"/>
-            </w:tcMar>
-          </w:tcPr>
-          <w:p>
-            <w:pPr>
-              <w:spacing w:after="0" w:line="270"/>
-            </w:pPr>
-            <w:r>
-              <w:t xml:space="preserve">um trilho; um desvio, quando sai de outro</w:t>
-            </w:r>
-          </w:p>
-        </w:tc>
-        <w:tc>
-          <w:tcPr>
-            <w:tcW w:type="dxa" w:w="3700"/>
+            <w:tcW w:type="dxa" w:w="6626"/>
             <w:tcBorders>
               <w:top w:val="single" w:color="C2D2D6" w:sz="4"/>
               <w:left w:val="single" w:color="C2D2D6" w:sz="4"/>
@@ -1009,7 +1542,7 @@
       <w:tr>
         <w:tc>
           <w:tcPr>
-            <w:tcW w:type="dxa" w:w="2000"/>
+            <w:tcW w:type="dxa" w:w="2400"/>
             <w:tcBorders>
               <w:top w:val="single" w:color="C2D2D6" w:sz="4"/>
               <w:left w:val="single" w:color="C2D2D6" w:sz="4"/>
@@ -1038,51 +1571,26 @@
         </w:tc>
         <w:tc>
           <w:tcPr>
-            <w:tcW w:type="dxa" w:w="3326"/>
-            <w:tcBorders>
-              <w:top w:val="single" w:color="C2D2D6" w:sz="4"/>
-              <w:left w:val="single" w:color="C2D2D6" w:sz="4"/>
-              <w:bottom w:val="single" w:color="C2D2D6" w:sz="4"/>
-              <w:right w:val="single" w:color="C2D2D6" w:sz="4"/>
-            </w:tcBorders>
-            <w:tcMar>
-              <w:top w:type="dxa" w:w="80"/>
-              <w:left w:type="dxa" w:w="120"/>
-              <w:bottom w:type="dxa" w:w="80"/>
-              <w:right w:type="dxa" w:w="120"/>
-            </w:tcMar>
-          </w:tcPr>
-          <w:p>
-            <w:pPr>
-              <w:spacing w:after="0" w:line="270"/>
-            </w:pPr>
-            <w:r>
-              <w:t xml:space="preserve">um entroncamento</w:t>
-            </w:r>
-          </w:p>
-        </w:tc>
-        <w:tc>
-          <w:tcPr>
-            <w:tcW w:type="dxa" w:w="3700"/>
-            <w:tcBorders>
-              <w:top w:val="single" w:color="C2D2D6" w:sz="4"/>
-              <w:left w:val="single" w:color="C2D2D6" w:sz="4"/>
-              <w:bottom w:val="single" w:color="C2D2D6" w:sz="4"/>
-              <w:right w:val="single" w:color="C2D2D6" w:sz="4"/>
-            </w:tcBorders>
-            <w:tcMar>
-              <w:top w:type="dxa" w:w="80"/>
-              <w:left w:type="dxa" w:w="120"/>
-              <w:bottom w:type="dxa" w:w="80"/>
-              <w:right w:type="dxa" w:w="120"/>
-            </w:tcMar>
-          </w:tcPr>
-          <w:p>
-            <w:pPr>
-              <w:spacing w:after="0" w:line="270"/>
-            </w:pPr>
-            <w:r>
-              <w:t xml:space="preserve">a cópia incorporada ao original</w:t>
+            <w:tcW w:type="dxa" w:w="6626"/>
+            <w:tcBorders>
+              <w:top w:val="single" w:color="C2D2D6" w:sz="4"/>
+              <w:left w:val="single" w:color="C2D2D6" w:sz="4"/>
+              <w:bottom w:val="single" w:color="C2D2D6" w:sz="4"/>
+              <w:right w:val="single" w:color="C2D2D6" w:sz="4"/>
+            </w:tcBorders>
+            <w:tcMar>
+              <w:top w:type="dxa" w:w="80"/>
+              <w:left w:type="dxa" w:w="120"/>
+              <w:bottom w:type="dxa" w:w="80"/>
+              <w:right w:type="dxa" w:w="120"/>
+            </w:tcMar>
+          </w:tcPr>
+          <w:p>
+            <w:pPr>
+              <w:spacing w:after="0" w:line="270"/>
+            </w:pPr>
+            <w:r>
+              <w:t xml:space="preserve">a cópia incorporada à linha de onde saiu</w:t>
             </w:r>
           </w:p>
         </w:tc>
@@ -1090,7 +1598,7 @@
       <w:tr>
         <w:tc>
           <w:tcPr>
-            <w:tcW w:type="dxa" w:w="2000"/>
+            <w:tcW w:type="dxa" w:w="2400"/>
             <w:tcBorders>
               <w:top w:val="single" w:color="C2D2D6" w:sz="4"/>
               <w:left w:val="single" w:color="C2D2D6" w:sz="4"/>
@@ -1118,32 +1626,7 @@
         </w:tc>
         <w:tc>
           <w:tcPr>
-            <w:tcW w:type="dxa" w:w="3326"/>
-            <w:tcBorders>
-              <w:top w:val="single" w:color="C2D2D6" w:sz="4"/>
-              <w:left w:val="single" w:color="C2D2D6" w:sz="4"/>
-              <w:bottom w:val="single" w:color="C2D2D6" w:sz="4"/>
-              <w:right w:val="single" w:color="C2D2D6" w:sz="4"/>
-            </w:tcBorders>
-            <w:tcMar>
-              <w:top w:type="dxa" w:w="80"/>
-              <w:left w:type="dxa" w:w="120"/>
-              <w:bottom w:type="dxa" w:w="80"/>
-              <w:right w:type="dxa" w:w="120"/>
-            </w:tcMar>
-          </w:tcPr>
-          <w:p>
-            <w:pPr>
-              <w:spacing w:after="0" w:line="270"/>
-            </w:pPr>
-            <w:r>
-              <w:t xml:space="preserve">a linha em operação</w:t>
-            </w:r>
-          </w:p>
-        </w:tc>
-        <w:tc>
-          <w:tcPr>
-            <w:tcW w:type="dxa" w:w="3700"/>
+            <w:tcW w:type="dxa" w:w="6626"/>
             <w:tcBorders>
               <w:top w:val="single" w:color="C2D2D6" w:sz="4"/>
               <w:left w:val="single" w:color="C2D2D6" w:sz="4"/>
@@ -1170,7 +1653,7 @@
       <w:tr>
         <w:tc>
           <w:tcPr>
-            <w:tcW w:type="dxa" w:w="2000"/>
+            <w:tcW w:type="dxa" w:w="2400"/>
             <w:tcBorders>
               <w:top w:val="single" w:color="C2D2D6" w:sz="4"/>
               <w:left w:val="single" w:color="C2D2D6" w:sz="4"/>
@@ -1198,32 +1681,7 @@
         </w:tc>
         <w:tc>
           <w:tcPr>
-            <w:tcW w:type="dxa" w:w="3326"/>
-            <w:tcBorders>
-              <w:top w:val="single" w:color="C2D2D6" w:sz="4"/>
-              <w:left w:val="single" w:color="C2D2D6" w:sz="4"/>
-              <w:bottom w:val="single" w:color="C2D2D6" w:sz="4"/>
-              <w:right w:val="single" w:color="C2D2D6" w:sz="4"/>
-            </w:tcBorders>
-            <w:tcMar>
-              <w:top w:type="dxa" w:w="80"/>
-              <w:left w:type="dxa" w:w="120"/>
-              <w:bottom w:type="dxa" w:w="80"/>
-              <w:right w:type="dxa" w:w="120"/>
-            </w:tcMar>
-          </w:tcPr>
-          <w:p>
-            <w:pPr>
-              <w:spacing w:after="0" w:line="270"/>
-            </w:pPr>
-            <w:r>
-              <w:t xml:space="preserve">a linha da próxima composição</w:t>
-            </w:r>
-          </w:p>
-        </w:tc>
-        <w:tc>
-          <w:tcPr>
-            <w:tcW w:type="dxa" w:w="3700"/>
+            <w:tcW w:type="dxa" w:w="6626"/>
             <w:tcBorders>
               <w:top w:val="single" w:color="C2D2D6" w:sz="4"/>
               <w:left w:val="single" w:color="C2D2D6" w:sz="4"/>
@@ -1250,7 +1708,7 @@
       <w:tr>
         <w:tc>
           <w:tcPr>
-            <w:tcW w:type="dxa" w:w="2000"/>
+            <w:tcW w:type="dxa" w:w="2400"/>
             <w:tcBorders>
               <w:top w:val="single" w:color="C2D2D6" w:sz="4"/>
               <w:left w:val="single" w:color="C2D2D6" w:sz="4"/>
@@ -1278,32 +1736,7 @@
         </w:tc>
         <w:tc>
           <w:tcPr>
-            <w:tcW w:type="dxa" w:w="3326"/>
-            <w:tcBorders>
-              <w:top w:val="single" w:color="C2D2D6" w:sz="4"/>
-              <w:left w:val="single" w:color="C2D2D6" w:sz="4"/>
-              <w:bottom w:val="single" w:color="C2D2D6" w:sz="4"/>
-              <w:right w:val="single" w:color="C2D2D6" w:sz="4"/>
-            </w:tcBorders>
-            <w:tcMar>
-              <w:top w:type="dxa" w:w="80"/>
-              <w:left w:type="dxa" w:w="120"/>
-              <w:bottom w:type="dxa" w:w="80"/>
-              <w:right w:type="dxa" w:w="120"/>
-            </w:tcMar>
-          </w:tcPr>
-          <w:p>
-            <w:pPr>
-              <w:spacing w:after="0" w:line="270"/>
-            </w:pPr>
-            <w:r>
-              <w:t xml:space="preserve">o desvio de obra</w:t>
-            </w:r>
-          </w:p>
-        </w:tc>
-        <w:tc>
-          <w:tcPr>
-            <w:tcW w:type="dxa" w:w="3700"/>
+            <w:tcW w:type="dxa" w:w="6626"/>
             <w:tcBorders>
               <w:top w:val="single" w:color="C2D2D6" w:sz="4"/>
               <w:left w:val="single" w:color="C2D2D6" w:sz="4"/>
@@ -1330,7 +1763,7 @@
       <w:tr>
         <w:tc>
           <w:tcPr>
-            <w:tcW w:type="dxa" w:w="2000"/>
+            <w:tcW w:type="dxa" w:w="2400"/>
             <w:tcBorders>
               <w:top w:val="single" w:color="C2D2D6" w:sz="4"/>
               <w:left w:val="single" w:color="C2D2D6" w:sz="4"/>
@@ -1358,32 +1791,7 @@
         </w:tc>
         <w:tc>
           <w:tcPr>
-            <w:tcW w:type="dxa" w:w="3326"/>
-            <w:tcBorders>
-              <w:top w:val="single" w:color="C2D2D6" w:sz="4"/>
-              <w:left w:val="single" w:color="C2D2D6" w:sz="4"/>
-              <w:bottom w:val="single" w:color="C2D2D6" w:sz="4"/>
-              <w:right w:val="single" w:color="C2D2D6" w:sz="4"/>
-            </w:tcBorders>
-            <w:tcMar>
-              <w:top w:type="dxa" w:w="80"/>
-              <w:left w:type="dxa" w:w="120"/>
-              <w:bottom w:type="dxa" w:w="80"/>
-              <w:right w:type="dxa" w:w="120"/>
-            </w:tcMar>
-          </w:tcPr>
-          <w:p>
-            <w:pPr>
-              <w:spacing w:after="0" w:line="270"/>
-            </w:pPr>
-            <w:r>
-              <w:t xml:space="preserve">o pátio de vistoria</w:t>
-            </w:r>
-          </w:p>
-        </w:tc>
-        <w:tc>
-          <w:tcPr>
-            <w:tcW w:type="dxa" w:w="3700"/>
+            <w:tcW w:type="dxa" w:w="6626"/>
             <w:tcBorders>
               <w:top w:val="single" w:color="C2D2D6" w:sz="4"/>
               <w:left w:val="single" w:color="C2D2D6" w:sz="4"/>
@@ -1410,7 +1818,7 @@
       <w:tr>
         <w:tc>
           <w:tcPr>
-            <w:tcW w:type="dxa" w:w="2000"/>
+            <w:tcW w:type="dxa" w:w="2400"/>
             <w:tcBorders>
               <w:top w:val="single" w:color="C2D2D6" w:sz="4"/>
               <w:left w:val="single" w:color="C2D2D6" w:sz="4"/>
@@ -1438,32 +1846,7 @@
         </w:tc>
         <w:tc>
           <w:tcPr>
-            <w:tcW w:type="dxa" w:w="3326"/>
-            <w:tcBorders>
-              <w:top w:val="single" w:color="C2D2D6" w:sz="4"/>
-              <w:left w:val="single" w:color="C2D2D6" w:sz="4"/>
-              <w:bottom w:val="single" w:color="C2D2D6" w:sz="4"/>
-              <w:right w:val="single" w:color="C2D2D6" w:sz="4"/>
-            </w:tcBorders>
-            <w:tcMar>
-              <w:top w:type="dxa" w:w="80"/>
-              <w:left w:type="dxa" w:w="120"/>
-              <w:bottom w:type="dxa" w:w="80"/>
-              <w:right w:type="dxa" w:w="120"/>
-            </w:tcMar>
-          </w:tcPr>
-          <w:p>
-            <w:pPr>
-              <w:spacing w:after="0" w:line="270"/>
-            </w:pPr>
-            <w:r>
-              <w:t xml:space="preserve">o desvio de emergência</w:t>
-            </w:r>
-          </w:p>
-        </w:tc>
-        <w:tc>
-          <w:tcPr>
-            <w:tcW w:type="dxa" w:w="3700"/>
+            <w:tcW w:type="dxa" w:w="6626"/>
             <w:tcBorders>
               <w:top w:val="single" w:color="C2D2D6" w:sz="4"/>
               <w:left w:val="single" w:color="C2D2D6" w:sz="4"/>
@@ -1490,7 +1873,7 @@
       <w:tr>
         <w:tc>
           <w:tcPr>
-            <w:tcW w:type="dxa" w:w="2000"/>
+            <w:tcW w:type="dxa" w:w="2400"/>
             <w:tcBorders>
               <w:top w:val="single" w:color="C2D2D6" w:sz="4"/>
               <w:left w:val="single" w:color="C2D2D6" w:sz="4"/>
@@ -1519,51 +1902,26 @@
         </w:tc>
         <w:tc>
           <w:tcPr>
-            <w:tcW w:type="dxa" w:w="3326"/>
-            <w:tcBorders>
-              <w:top w:val="single" w:color="C2D2D6" w:sz="4"/>
-              <w:left w:val="single" w:color="C2D2D6" w:sz="4"/>
-              <w:bottom w:val="single" w:color="C2D2D6" w:sz="4"/>
-              <w:right w:val="single" w:color="C2D2D6" w:sz="4"/>
-            </w:tcBorders>
-            <w:tcMar>
-              <w:top w:type="dxa" w:w="80"/>
-              <w:left w:type="dxa" w:w="120"/>
-              <w:bottom w:type="dxa" w:w="80"/>
-              <w:right w:type="dxa" w:w="120"/>
-            </w:tcMar>
-          </w:tcPr>
-          <w:p>
-            <w:pPr>
-              <w:spacing w:after="0" w:line="270"/>
-            </w:pPr>
-            <w:r>
-              <w:t xml:space="preserve">a placa da estação</w:t>
-            </w:r>
-          </w:p>
-        </w:tc>
-        <w:tc>
-          <w:tcPr>
-            <w:tcW w:type="dxa" w:w="3700"/>
-            <w:tcBorders>
-              <w:top w:val="single" w:color="C2D2D6" w:sz="4"/>
-              <w:left w:val="single" w:color="C2D2D6" w:sz="4"/>
-              <w:bottom w:val="single" w:color="C2D2D6" w:sz="4"/>
-              <w:right w:val="single" w:color="C2D2D6" w:sz="4"/>
-            </w:tcBorders>
-            <w:tcMar>
-              <w:top w:type="dxa" w:w="80"/>
-              <w:left w:type="dxa" w:w="120"/>
-              <w:bottom w:type="dxa" w:w="80"/>
-              <w:right w:type="dxa" w:w="120"/>
-            </w:tcMar>
-          </w:tcPr>
-          <w:p>
-            <w:pPr>
-              <w:spacing w:after="0" w:line="270"/>
-            </w:pPr>
-            <w:r>
-              <w:t xml:space="preserve">o número da versão assinada</w:t>
+            <w:tcW w:type="dxa" w:w="6626"/>
+            <w:tcBorders>
+              <w:top w:val="single" w:color="C2D2D6" w:sz="4"/>
+              <w:left w:val="single" w:color="C2D2D6" w:sz="4"/>
+              <w:bottom w:val="single" w:color="C2D2D6" w:sz="4"/>
+              <w:right w:val="single" w:color="C2D2D6" w:sz="4"/>
+            </w:tcBorders>
+            <w:tcMar>
+              <w:top w:type="dxa" w:w="80"/>
+              <w:left w:type="dxa" w:w="120"/>
+              <w:bottom w:type="dxa" w:w="80"/>
+              <w:right w:type="dxa" w:w="120"/>
+            </w:tcMar>
+          </w:tcPr>
+          <w:p>
+            <w:pPr>
+              <w:spacing w:after="0" w:line="270"/>
+            </w:pPr>
+            <w:r>
+              <w:t xml:space="preserve">o número da versão que foi para produção</w:t>
             </w:r>
           </w:p>
         </w:tc>
@@ -1571,7 +1929,7 @@
       <w:tr>
         <w:tc>
           <w:tcPr>
-            <w:tcW w:type="dxa" w:w="2000"/>
+            <w:tcW w:type="dxa" w:w="2400"/>
             <w:tcBorders>
               <w:top w:val="single" w:color="C2D2D6" w:sz="4"/>
               <w:left w:val="single" w:color="C2D2D6" w:sz="4"/>
@@ -1600,32 +1958,7 @@
         </w:tc>
         <w:tc>
           <w:tcPr>
-            <w:tcW w:type="dxa" w:w="3326"/>
-            <w:tcBorders>
-              <w:top w:val="single" w:color="C2D2D6" w:sz="4"/>
-              <w:left w:val="single" w:color="C2D2D6" w:sz="4"/>
-              <w:bottom w:val="single" w:color="C2D2D6" w:sz="4"/>
-              <w:right w:val="single" w:color="C2D2D6" w:sz="4"/>
-            </w:tcBorders>
-            <w:tcMar>
-              <w:top w:type="dxa" w:w="80"/>
-              <w:left w:type="dxa" w:w="120"/>
-              <w:bottom w:type="dxa" w:w="80"/>
-              <w:right w:type="dxa" w:w="120"/>
-            </w:tcMar>
-          </w:tcPr>
-          <w:p>
-            <w:pPr>
-              <w:spacing w:after="0" w:line="270"/>
-            </w:pPr>
-            <w:r>
-              <w:t xml:space="preserve">o pedido de passagem pela cancela</w:t>
-            </w:r>
-          </w:p>
-        </w:tc>
-        <w:tc>
-          <w:tcPr>
-            <w:tcW w:type="dxa" w:w="3700"/>
+            <w:tcW w:type="dxa" w:w="6626"/>
             <w:tcBorders>
               <w:top w:val="single" w:color="C2D2D6" w:sz="4"/>
               <w:left w:val="single" w:color="C2D2D6" w:sz="4"/>
@@ -1652,7 +1985,7 @@
       <w:tr>
         <w:tc>
           <w:tcPr>
-            <w:tcW w:type="dxa" w:w="2000"/>
+            <w:tcW w:type="dxa" w:w="2400"/>
             <w:tcBorders>
               <w:top w:val="single" w:color="C2D2D6" w:sz="4"/>
               <w:left w:val="single" w:color="C2D2D6" w:sz="4"/>
@@ -1681,32 +2014,7 @@
         </w:tc>
         <w:tc>
           <w:tcPr>
-            <w:tcW w:type="dxa" w:w="3326"/>
-            <w:tcBorders>
-              <w:top w:val="single" w:color="C2D2D6" w:sz="4"/>
-              <w:left w:val="single" w:color="C2D2D6" w:sz="4"/>
-              <w:bottom w:val="single" w:color="C2D2D6" w:sz="4"/>
-              <w:right w:val="single" w:color="C2D2D6" w:sz="4"/>
-            </w:tcBorders>
-            <w:tcMar>
-              <w:top w:type="dxa" w:w="80"/>
-              <w:left w:type="dxa" w:w="120"/>
-              <w:bottom w:type="dxa" w:w="80"/>
-              <w:right w:type="dxa" w:w="120"/>
-            </w:tcMar>
-          </w:tcPr>
-          <w:p>
-            <w:pPr>
-              <w:spacing w:after="0" w:line="270"/>
-            </w:pPr>
-            <w:r>
-              <w:t xml:space="preserve">o controlador que libera a passagem</w:t>
-            </w:r>
-          </w:p>
-        </w:tc>
-        <w:tc>
-          <w:tcPr>
-            <w:tcW w:type="dxa" w:w="3700"/>
+            <w:tcW w:type="dxa" w:w="6626"/>
             <w:tcBorders>
               <w:top w:val="single" w:color="C2D2D6" w:sz="4"/>
               <w:left w:val="single" w:color="C2D2D6" w:sz="4"/>
@@ -1733,7 +2041,7 @@
       <w:tr>
         <w:tc>
           <w:tcPr>
-            <w:tcW w:type="dxa" w:w="2000"/>
+            <w:tcW w:type="dxa" w:w="2400"/>
             <w:tcBorders>
               <w:top w:val="single" w:color="C2D2D6" w:sz="4"/>
               <w:left w:val="single" w:color="C2D2D6" w:sz="4"/>
@@ -1762,32 +2070,7 @@
         </w:tc>
         <w:tc>
           <w:tcPr>
-            <w:tcW w:type="dxa" w:w="3326"/>
-            <w:tcBorders>
-              <w:top w:val="single" w:color="C2D2D6" w:sz="4"/>
-              <w:left w:val="single" w:color="C2D2D6" w:sz="4"/>
-              <w:bottom w:val="single" w:color="C2D2D6" w:sz="4"/>
-              <w:right w:val="single" w:color="C2D2D6" w:sz="4"/>
-            </w:tcBorders>
-            <w:tcMar>
-              <w:top w:type="dxa" w:w="80"/>
-              <w:left w:type="dxa" w:w="120"/>
-              <w:bottom w:type="dxa" w:w="80"/>
-              <w:right w:type="dxa" w:w="120"/>
-            </w:tcMar>
-          </w:tcPr>
-          <w:p>
-            <w:pPr>
-              <w:spacing w:after="0" w:line="270"/>
-            </w:pPr>
-            <w:r>
-              <w:t xml:space="preserve">dois trens no mesmo trecho</w:t>
-            </w:r>
-          </w:p>
-        </w:tc>
-        <w:tc>
-          <w:tcPr>
-            <w:tcW w:type="dxa" w:w="3700"/>
+            <w:tcW w:type="dxa" w:w="6626"/>
             <w:tcBorders>
               <w:top w:val="single" w:color="C2D2D6" w:sz="4"/>
               <w:left w:val="single" w:color="C2D2D6" w:sz="4"/>
@@ -1814,7 +2097,7 @@
       <w:tr>
         <w:tc>
           <w:tcPr>
-            <w:tcW w:type="dxa" w:w="2000"/>
+            <w:tcW w:type="dxa" w:w="2400"/>
             <w:tcBorders>
               <w:top w:val="single" w:color="C2D2D6" w:sz="4"/>
               <w:left w:val="single" w:color="C2D2D6" w:sz="4"/>
@@ -1843,32 +2126,7 @@
         </w:tc>
         <w:tc>
           <w:tcPr>
-            <w:tcW w:type="dxa" w:w="3326"/>
-            <w:tcBorders>
-              <w:top w:val="single" w:color="C2D2D6" w:sz="4"/>
-              <w:left w:val="single" w:color="C2D2D6" w:sz="4"/>
-              <w:bottom w:val="single" w:color="C2D2D6" w:sz="4"/>
-              <w:right w:val="single" w:color="C2D2D6" w:sz="4"/>
-            </w:tcBorders>
-            <w:tcMar>
-              <w:top w:type="dxa" w:w="80"/>
-              <w:left w:type="dxa" w:w="120"/>
-              <w:bottom w:type="dxa" w:w="80"/>
-              <w:right w:type="dxa" w:w="120"/>
-            </w:tcMar>
-          </w:tcPr>
-          <w:p>
-            <w:pPr>
-              <w:spacing w:after="0" w:line="270"/>
-            </w:pPr>
-            <w:r>
-              <w:t xml:space="preserve">a volta obrigatória para a develop</w:t>
-            </w:r>
-          </w:p>
-        </w:tc>
-        <w:tc>
-          <w:tcPr>
-            <w:tcW w:type="dxa" w:w="3700"/>
+            <w:tcW w:type="dxa" w:w="6626"/>
             <w:tcBorders>
               <w:top w:val="single" w:color="C2D2D6" w:sz="4"/>
               <w:left w:val="single" w:color="C2D2D6" w:sz="4"/>
@@ -1897,6 +2155,14 @@
       <w:pPr>
         <w:spacing w:after="120"/>
       </w:pPr>
+    </w:p>
+    <w:p>
+      <w:pPr>
+        <w:spacing w:after="120" w:line="300"/>
+      </w:pPr>
+      <w:r>
+        <w:t xml:space="preserve">A ponte entre as partes é o slide 18, "Os trilhos viram linhas do tempo": o mesmo desenho dos trilhos, sem os dormentes e com as versões.</w:t>
+      </w:r>
     </w:p>
     <w:p>
       <w:pPr>
@@ -2047,7 +2313,7 @@
         <w:t xml:space="preserve">Monte o quadro. </w:t>
       </w:r>
       <w:r>
-        <w:t xml:space="preserve">Um frame por grupo para a Dinâmica 1: as 12 cartas misturadas, cinco raias (main, develop, feature/*, release/*, hotfix/*), um canto "Não pode!" e etiquetas em branco para "sai de / vai para". Um frame por grupo para a Dinâmica 3: os oito eventos e as peças da malha (trilhos das cinco cores, estações redondas e placas laranja). Tudo está no material das dinâmicas.</w:t>
+        <w:t xml:space="preserve">Um frame por grupo para a Dinâmica 1: as 12 cartas misturadas, cinco raias (main, develop, feature/*, release/*, hotfix/*), um canto "Não pode!" e etiquetas em branco para "sai de / vai para". Um frame por grupo para a Dinâmica 3: os oito eventos e as peças da linha do tempo (linhas das cinco cores, bolinhas para as versões e etiquetas laranja para os números). Tudo está no material das dinâmicas.</w:t>
       </w:r>
     </w:p>
     <w:p>
@@ -2067,7 +2333,7 @@
         <w:t xml:space="preserve">Crie as enquetes </w:t>
       </w:r>
       <w:r>
-        <w:t xml:space="preserve">(Forms no Teams). A enquete-gancho: "O que garante que nenhuma mudança se perde?", com as opções A) Cada um manda a sua versão por e-mail, B) Uma pessoa edita de cada vez, C) Cada área trabalha numa cópia, com regra para voltar, D) Todo mundo edita o mesmo arquivo. Para a Dinâmica 2, uma enquete com as quatro opções: Fast-forward, Merge commit, Squash e Rebase; dá para reaproveitar a mesma nas oito rodadas.</w:t>
+        <w:t xml:space="preserve">(Forms no Teams). A enquete-gancho: "Como reformar um vagão sem parar o trem?", com as opções A) Parar o trem até a reforma acabar, B) Reformar o vagão com o trem andando, C) Levar o vagão para um desvio e engatar de volta quando estiver pronto, D) Comprar um trem novo a cada mudança. Para a Dinâmica 2, uma enquete com as quatro opções: Fast-forward, Merge commit, Squash e Rebase; dá para reaproveitar a mesma nas oito rodadas.</w:t>
       </w:r>
     </w:p>
     <w:p>
@@ -2437,7 +2703,11 @@
               <w:spacing w:after="0" w:line="270"/>
             </w:pPr>
             <w:r>
-              <w:t xml:space="preserve">0:10</w:t>
+              <w:rPr>
+                <w:b/>
+                <w:bCs/>
+              </w:rPr>
+              <w:t xml:space="preserve">Parte 1</w:t>
             </w:r>
           </w:p>
         </w:tc>
@@ -2462,7 +2732,7 @@
               <w:spacing w:after="0" w:line="270"/>
             </w:pPr>
             <w:r>
-              <w:t xml:space="preserve">20</w:t>
+              <w:t xml:space="preserve"/>
             </w:r>
           </w:p>
         </w:tc>
@@ -2487,7 +2757,11 @@
               <w:spacing w:after="0" w:line="270"/>
             </w:pPr>
             <w:r>
-              <w:t xml:space="preserve">Bloco 1 — Por que versionar (o contrato)</w:t>
+              <w:rPr>
+                <w:b/>
+                <w:bCs/>
+              </w:rPr>
+              <w:t xml:space="preserve">O trem</w:t>
             </w:r>
           </w:p>
         </w:tc>
@@ -2512,7 +2786,7 @@
               <w:spacing w:after="0" w:line="270"/>
             </w:pPr>
             <w:r>
-              <w:t xml:space="preserve">4–8</w:t>
+              <w:t xml:space="preserve"/>
             </w:r>
           </w:p>
         </w:tc>
@@ -2539,7 +2813,7 @@
               <w:spacing w:after="0" w:line="270"/>
             </w:pPr>
             <w:r>
-              <w:t xml:space="preserve">0:30</w:t>
+              <w:t xml:space="preserve">0:10</w:t>
             </w:r>
           </w:p>
         </w:tc>
@@ -2589,7 +2863,7 @@
               <w:spacing w:after="0" w:line="270"/>
             </w:pPr>
             <w:r>
-              <w:t xml:space="preserve">Bloco 2 — A malha ferroviária: os cinco trilhos</w:t>
+              <w:t xml:space="preserve">Bloco 1 — O trem e os trilhos</w:t>
             </w:r>
           </w:p>
         </w:tc>
@@ -2614,7 +2888,7 @@
               <w:spacing w:after="0" w:line="270"/>
             </w:pPr>
             <w:r>
-              <w:t xml:space="preserve">9–15</w:t>
+              <w:t xml:space="preserve">4–12</w:t>
             </w:r>
           </w:p>
         </w:tc>
@@ -2641,7 +2915,7 @@
               <w:spacing w:after="0" w:line="270"/>
             </w:pPr>
             <w:r>
-              <w:t xml:space="preserve">0:55</w:t>
+              <w:t xml:space="preserve">0:35</w:t>
             </w:r>
           </w:p>
         </w:tc>
@@ -2720,7 +2994,7 @@
               <w:spacing w:after="0" w:line="270"/>
             </w:pPr>
             <w:r>
-              <w:t xml:space="preserve">16</w:t>
+              <w:t xml:space="preserve">13</w:t>
             </w:r>
           </w:p>
         </w:tc>
@@ -2747,7 +3021,7 @@
               <w:spacing w:after="0" w:line="270"/>
             </w:pPr>
             <w:r>
-              <w:t xml:space="preserve">1:15</w:t>
+              <w:t xml:space="preserve">0:55</w:t>
             </w:r>
           </w:p>
         </w:tc>
@@ -2822,7 +3096,7 @@
               <w:spacing w:after="0" w:line="270"/>
             </w:pPr>
             <w:r>
-              <w:t xml:space="preserve">17</w:t>
+              <w:t xml:space="preserve">14</w:t>
             </w:r>
           </w:p>
         </w:tc>
@@ -2849,6 +3123,218 @@
               <w:spacing w:after="0" w:line="270"/>
             </w:pPr>
             <w:r>
+              <w:rPr>
+                <w:b/>
+                <w:bCs/>
+              </w:rPr>
+              <w:t xml:space="preserve">Parte 2</w:t>
+            </w:r>
+          </w:p>
+        </w:tc>
+        <w:tc>
+          <w:tcPr>
+            <w:tcW w:type="dxa" w:w="800"/>
+            <w:tcBorders>
+              <w:top w:val="single" w:color="C2D2D6" w:sz="4"/>
+              <w:left w:val="single" w:color="C2D2D6" w:sz="4"/>
+              <w:bottom w:val="single" w:color="C2D2D6" w:sz="4"/>
+              <w:right w:val="single" w:color="C2D2D6" w:sz="4"/>
+            </w:tcBorders>
+            <w:tcMar>
+              <w:top w:type="dxa" w:w="80"/>
+              <w:left w:type="dxa" w:w="120"/>
+              <w:bottom w:type="dxa" w:w="80"/>
+              <w:right w:type="dxa" w:w="120"/>
+            </w:tcMar>
+          </w:tcPr>
+          <w:p>
+            <w:pPr>
+              <w:spacing w:after="0" w:line="270"/>
+            </w:pPr>
+            <w:r>
+              <w:t xml:space="preserve"/>
+            </w:r>
+          </w:p>
+        </w:tc>
+        <w:tc>
+          <w:tcPr>
+            <w:tcW w:type="dxa" w:w="5826"/>
+            <w:tcBorders>
+              <w:top w:val="single" w:color="C2D2D6" w:sz="4"/>
+              <w:left w:val="single" w:color="C2D2D6" w:sz="4"/>
+              <w:bottom w:val="single" w:color="C2D2D6" w:sz="4"/>
+              <w:right w:val="single" w:color="C2D2D6" w:sz="4"/>
+            </w:tcBorders>
+            <w:tcMar>
+              <w:top w:type="dxa" w:w="80"/>
+              <w:left w:type="dxa" w:w="120"/>
+              <w:bottom w:type="dxa" w:w="80"/>
+              <w:right w:type="dxa" w:w="120"/>
+            </w:tcMar>
+          </w:tcPr>
+          <w:p>
+            <w:pPr>
+              <w:spacing w:after="0" w:line="270"/>
+            </w:pPr>
+            <w:r>
+              <w:rPr>
+                <w:b/>
+                <w:bCs/>
+              </w:rPr>
+              <w:t xml:space="preserve">O contrato</w:t>
+            </w:r>
+          </w:p>
+        </w:tc>
+        <w:tc>
+          <w:tcPr>
+            <w:tcW w:type="dxa" w:w="1300"/>
+            <w:tcBorders>
+              <w:top w:val="single" w:color="C2D2D6" w:sz="4"/>
+              <w:left w:val="single" w:color="C2D2D6" w:sz="4"/>
+              <w:bottom w:val="single" w:color="C2D2D6" w:sz="4"/>
+              <w:right w:val="single" w:color="C2D2D6" w:sz="4"/>
+            </w:tcBorders>
+            <w:tcMar>
+              <w:top w:type="dxa" w:w="80"/>
+              <w:left w:type="dxa" w:w="120"/>
+              <w:bottom w:type="dxa" w:w="80"/>
+              <w:right w:type="dxa" w:w="120"/>
+            </w:tcMar>
+          </w:tcPr>
+          <w:p>
+            <w:pPr>
+              <w:spacing w:after="0" w:line="270"/>
+            </w:pPr>
+            <w:r>
+              <w:t xml:space="preserve"/>
+            </w:r>
+          </w:p>
+        </w:tc>
+      </w:tr>
+      <w:tr>
+        <w:tc>
+          <w:tcPr>
+            <w:tcW w:type="dxa" w:w="1100"/>
+            <w:tcBorders>
+              <w:top w:val="single" w:color="C2D2D6" w:sz="4"/>
+              <w:left w:val="single" w:color="C2D2D6" w:sz="4"/>
+              <w:bottom w:val="single" w:color="C2D2D6" w:sz="4"/>
+              <w:right w:val="single" w:color="C2D2D6" w:sz="4"/>
+            </w:tcBorders>
+            <w:tcMar>
+              <w:top w:type="dxa" w:w="80"/>
+              <w:left w:type="dxa" w:w="120"/>
+              <w:bottom w:type="dxa" w:w="80"/>
+              <w:right w:type="dxa" w:w="120"/>
+            </w:tcMar>
+          </w:tcPr>
+          <w:p>
+            <w:pPr>
+              <w:spacing w:after="0" w:line="270"/>
+            </w:pPr>
+            <w:r>
+              <w:t xml:space="preserve">1:05</w:t>
+            </w:r>
+          </w:p>
+        </w:tc>
+        <w:tc>
+          <w:tcPr>
+            <w:tcW w:type="dxa" w:w="800"/>
+            <w:tcBorders>
+              <w:top w:val="single" w:color="C2D2D6" w:sz="4"/>
+              <w:left w:val="single" w:color="C2D2D6" w:sz="4"/>
+              <w:bottom w:val="single" w:color="C2D2D6" w:sz="4"/>
+              <w:right w:val="single" w:color="C2D2D6" w:sz="4"/>
+            </w:tcBorders>
+            <w:tcMar>
+              <w:top w:type="dxa" w:w="80"/>
+              <w:left w:type="dxa" w:w="120"/>
+              <w:bottom w:type="dxa" w:w="80"/>
+              <w:right w:type="dxa" w:w="120"/>
+            </w:tcMar>
+          </w:tcPr>
+          <w:p>
+            <w:pPr>
+              <w:spacing w:after="0" w:line="270"/>
+            </w:pPr>
+            <w:r>
+              <w:t xml:space="preserve">20</w:t>
+            </w:r>
+          </w:p>
+        </w:tc>
+        <w:tc>
+          <w:tcPr>
+            <w:tcW w:type="dxa" w:w="5826"/>
+            <w:tcBorders>
+              <w:top w:val="single" w:color="C2D2D6" w:sz="4"/>
+              <w:left w:val="single" w:color="C2D2D6" w:sz="4"/>
+              <w:bottom w:val="single" w:color="C2D2D6" w:sz="4"/>
+              <w:right w:val="single" w:color="C2D2D6" w:sz="4"/>
+            </w:tcBorders>
+            <w:tcMar>
+              <w:top w:type="dxa" w:w="80"/>
+              <w:left w:type="dxa" w:w="120"/>
+              <w:bottom w:type="dxa" w:w="80"/>
+              <w:right w:type="dxa" w:w="120"/>
+            </w:tcMar>
+          </w:tcPr>
+          <w:p>
+            <w:pPr>
+              <w:spacing w:after="0" w:line="270"/>
+            </w:pPr>
+            <w:r>
+              <w:t xml:space="preserve">Bloco 2 — O contrato: o que fica registrado</w:t>
+            </w:r>
+          </w:p>
+        </w:tc>
+        <w:tc>
+          <w:tcPr>
+            <w:tcW w:type="dxa" w:w="1300"/>
+            <w:tcBorders>
+              <w:top w:val="single" w:color="C2D2D6" w:sz="4"/>
+              <w:left w:val="single" w:color="C2D2D6" w:sz="4"/>
+              <w:bottom w:val="single" w:color="C2D2D6" w:sz="4"/>
+              <w:right w:val="single" w:color="C2D2D6" w:sz="4"/>
+            </w:tcBorders>
+            <w:tcMar>
+              <w:top w:type="dxa" w:w="80"/>
+              <w:left w:type="dxa" w:w="120"/>
+              <w:bottom w:type="dxa" w:w="80"/>
+              <w:right w:type="dxa" w:w="120"/>
+            </w:tcMar>
+          </w:tcPr>
+          <w:p>
+            <w:pPr>
+              <w:spacing w:after="0" w:line="270"/>
+            </w:pPr>
+            <w:r>
+              <w:t xml:space="preserve">15–19</w:t>
+            </w:r>
+          </w:p>
+        </w:tc>
+      </w:tr>
+      <w:tr>
+        <w:tc>
+          <w:tcPr>
+            <w:tcW w:type="dxa" w:w="1100"/>
+            <w:tcBorders>
+              <w:top w:val="single" w:color="C2D2D6" w:sz="4"/>
+              <w:left w:val="single" w:color="C2D2D6" w:sz="4"/>
+              <w:bottom w:val="single" w:color="C2D2D6" w:sz="4"/>
+              <w:right w:val="single" w:color="C2D2D6" w:sz="4"/>
+            </w:tcBorders>
+            <w:tcMar>
+              <w:top w:type="dxa" w:w="80"/>
+              <w:left w:type="dxa" w:w="120"/>
+              <w:bottom w:type="dxa" w:w="80"/>
+              <w:right w:type="dxa" w:w="120"/>
+            </w:tcMar>
+          </w:tcPr>
+          <w:p>
+            <w:pPr>
+              <w:spacing w:after="0" w:line="270"/>
+            </w:pPr>
+            <w:r>
               <w:t xml:space="preserve">1:25</w:t>
             </w:r>
           </w:p>
@@ -2924,7 +3410,7 @@
               <w:spacing w:after="0" w:line="270"/>
             </w:pPr>
             <w:r>
-              <w:t xml:space="preserve">18–26</w:t>
+              <w:t xml:space="preserve">20–28</w:t>
             </w:r>
           </w:p>
         </w:tc>
@@ -3030,7 +3516,7 @@
               <w:spacing w:after="0" w:line="270"/>
             </w:pPr>
             <w:r>
-              <w:t xml:space="preserve">27–28</w:t>
+              <w:t xml:space="preserve">29–30</w:t>
             </w:r>
           </w:p>
         </w:tc>
@@ -3107,7 +3593,7 @@
               <w:spacing w:after="0" w:line="270"/>
             </w:pPr>
             <w:r>
-              <w:t xml:space="preserve">Bloco 4 — A viagem no Modelo VIC</w:t>
+              <w:t xml:space="preserve">Bloco 4 — Versões e as regras do Modelo VIC</w:t>
             </w:r>
           </w:p>
         </w:tc>
@@ -3132,7 +3618,7 @@
               <w:spacing w:after="0" w:line="270"/>
             </w:pPr>
             <w:r>
-              <w:t xml:space="preserve">29–34</w:t>
+              <w:t xml:space="preserve">31–36</w:t>
             </w:r>
           </w:p>
         </w:tc>
@@ -3213,7 +3699,7 @@
                 <w:b/>
                 <w:bCs/>
               </w:rPr>
-              <w:t xml:space="preserve">Dinâmica 3 — A viagem do Contratos Online</w:t>
+              <w:t xml:space="preserve">Dinâmica 3 — A vida de uma versão</w:t>
             </w:r>
           </w:p>
         </w:tc>
@@ -3238,7 +3724,7 @@
               <w:spacing w:after="0" w:line="270"/>
             </w:pPr>
             <w:r>
-              <w:t xml:space="preserve">35</w:t>
+              <w:t xml:space="preserve">37</w:t>
             </w:r>
           </w:p>
         </w:tc>
@@ -3340,7 +3826,7 @@
               <w:spacing w:after="0" w:line="270"/>
             </w:pPr>
             <w:r>
-              <w:t xml:space="preserve">36–39</w:t>
+              <w:t xml:space="preserve">38–41</w:t>
             </w:r>
           </w:p>
         </w:tc>
@@ -3407,7 +3893,7 @@
               <w:spacing w:after="80" w:line="290"/>
             </w:pPr>
             <w:r>
-              <w:t xml:space="preserve">No bloco 4, passe rápido pelos slides 33 (divergência) e 34 (o resumo das diretrizes): os dois servem de consulta depois.</w:t>
+              <w:t xml:space="preserve">No bloco 4, passe rápido pelos slides 35 (divergência) e 36 (o resumo das diretrizes): os dois servem de consulta depois.</w:t>
             </w:r>
           </w:p>
           <w:p>
@@ -3500,7 +3986,7 @@
               <w:spacing w:after="80" w:line="290"/>
             </w:pPr>
             <w:r>
-              <w:t xml:space="preserve">No fechamento, peça que cada pessoa escreva no chat a pergunta do slide 37 que vai fazer na próxima reunião com o time.</w:t>
+              <w:t xml:space="preserve">No fechamento, peça que cada pessoa escreva no chat a pergunta do slide 39 que vai fazer na próxima reunião com o time.</w:t>
             </w:r>
           </w:p>
           <w:p>
@@ -3559,7 +4045,7 @@
         <w:t xml:space="preserve">Objetivo: </w:t>
       </w:r>
       <w:r>
-        <w:t xml:space="preserve">acolher, combinar as regras do remoto e plantar a pergunta que fecha a oficina.</w:t>
+        <w:t xml:space="preserve">acolher, combinar as regras do remoto, apresentar as duas partes e plantar a pergunta que fecha a oficina.</w:t>
       </w:r>
     </w:p>
     <w:p>
@@ -3585,7 +4071,7 @@
         <w:spacing w:after="80" w:line="290"/>
       </w:pPr>
       <w:r>
-        <w:t xml:space="preserve">Slide 2 — Agenda e combinados: câmera opcional, microfone fechado fora das salas, chat aberto o tempo todo.</w:t>
+        <w:t xml:space="preserve">Slide 2 — Agenda e combinados. Mostre as duas partes: a primeira, com um trem, só fala de trilhos; a segunda troca para um contrato.</w:t>
       </w:r>
     </w:p>
     <w:p>
@@ -3598,7 +4084,7 @@
         <w:spacing w:after="80" w:line="290"/>
       </w:pPr>
       <w:r>
-        <w:t xml:space="preserve">Slide 3 — Abra a enquete-gancho. Não comente a resposta.</w:t>
+        <w:t xml:space="preserve">Slide 3 — Abra a enquete-gancho, "Como reformar um vagão sem parar o trem?". Não comente a resposta.</w:t>
       </w:r>
     </w:p>
     <w:p>
@@ -3615,7 +4101,7 @@
           <w:iCs/>
           <w:color w:val="22292E"/>
         </w:rPr>
-        <w:t xml:space="preserve">Guardem a resposta de vocês. A gente volta a essa pergunta no fim, e cada opção conta um pedaço da história.</w:t>
+        <w:t xml:space="preserve">Guardem a resposta de vocês. A gente volta a essa pergunta no fim.</w:t>
       </w:r>
     </w:p>
     <w:p>
@@ -3623,7 +4109,7 @@
         <w:pStyle w:val="Heading2"/>
       </w:pPr>
       <w:r>
-        <w:t xml:space="preserve">Bloco 1 — Por que versionar — 20 min (slides 4 a 8)</w:t>
+        <w:t xml:space="preserve">Parte 1 · Bloco 1 — O trem e os trilhos — 25 min (slides 4 a 12)</w:t>
       </w:r>
     </w:p>
     <w:p>
@@ -3638,7 +4124,7 @@
         <w:t xml:space="preserve">Objetivo: </w:t>
       </w:r>
       <w:r>
-        <w:t xml:space="preserve">mostrar o problema que o Git e o GitFlow resolvem, com o contrato e suas minutas.</w:t>
+        <w:t xml:space="preserve">mostrar para que servem as branches e apresentar os cinco trilhos, de onde cada um sai e para onde vai. Nada de versão, de commit nem de tipo de merge: isso fica para a parte 2.</w:t>
       </w:r>
     </w:p>
     <w:p>
@@ -3650,124 +4136,7 @@
           <w:b/>
           <w:bCs/>
         </w:rPr>
-        <w:t xml:space="preserve">Slide 5 — Qual destes vale?</w:t>
-      </w:r>
-    </w:p>
-    <w:p>
-      <w:pPr>
-        <w:pBdr>
-          <w:left w:val="single" w:color="F39200" w:sz="18" w:space="12"/>
-        </w:pBdr>
-        <w:spacing w:before="60" w:after="140" w:line="300"/>
-        <w:ind w:left="360"/>
-      </w:pPr>
-      <w:r>
-        <w:rPr>
-          <w:i/>
-          <w:iCs/>
-          <w:color w:val="22292E"/>
-        </w:rPr>
-        <w:t xml:space="preserve">Todo mundo já viu essa pasta. Qual destes é o contrato que vale? O problema não é falta de cuidado: arquivo copiado não diz quem mudou, o quê, nem por quê, e nenhum deles diz que é o oficial.</w:t>
-      </w:r>
-    </w:p>
-    <w:p>
-      <w:pPr>
-        <w:spacing w:after="120" w:line="300"/>
-      </w:pPr>
-      <w:r>
-        <w:rPr>
-          <w:b/>
-          <w:bCs/>
-        </w:rPr>
-        <w:t xml:space="preserve">Slide 6 — O Git guarda cada versão, rubricada.</w:t>
-      </w:r>
-      <w:r>
-        <w:t xml:space="preserve"> O commit é a rubrica: quem, quando, o quê e por quê. O repositório é a pasta com todas as versões, para sempre; dá para comparar duas e voltar a qualquer uma. Isso responde a pergunta 2 do slide anterior, mas não a 1 nem a 3.</w:t>
-      </w:r>
-    </w:p>
-    <w:p>
-      <w:pPr>
-        <w:spacing w:after="120" w:line="300"/>
-      </w:pPr>
-      <w:r>
-        <w:rPr>
-          <w:b/>
-          <w:bCs/>
-        </w:rPr>
-        <w:t xml:space="preserve">Slide 7 — O que o GitFlow responde.</w:t>
-      </w:r>
-      <w:r>
-        <w:t xml:space="preserve"> Duas perguntas: qual versão vale e como várias pessoas mudam ao mesmo tempo sem atropelar. O GitFlow foi publicado em 2010 por Vincent Driessen e virou modelo de mercado. No Modelo VIC, ele é regra: a Diretriz 2 exige aderência ao GitFlow, com a develop e a main presentes e protegidas.</w:t>
-      </w:r>
-    </w:p>
-    <w:p>
-      <w:pPr>
-        <w:spacing w:after="120" w:line="300"/>
-      </w:pPr>
-      <w:r>
-        <w:rPr>
-          <w:b/>
-          <w:bCs/>
-        </w:rPr>
-        <w:t xml:space="preserve">Slide 8 — Duas lentes.</w:t>
-      </w:r>
-      <w:r>
-        <w:t xml:space="preserve"> Combine com a turma o papel de cada analogia: a ferrovia para ver, o contrato para entender. A frase do fim resume a oficina:</w:t>
-      </w:r>
-    </w:p>
-    <w:p>
-      <w:pPr>
-        <w:pBdr>
-          <w:left w:val="single" w:color="F39200" w:sz="18" w:space="12"/>
-        </w:pBdr>
-        <w:spacing w:before="60" w:after="140" w:line="300"/>
-        <w:ind w:left="360"/>
-      </w:pPr>
-      <w:r>
-        <w:rPr>
-          <w:i/>
-          <w:iCs/>
-          <w:color w:val="22292E"/>
-        </w:rPr>
-        <w:t xml:space="preserve">GitFlow é o regulamento da ferrovia: diz quais trilhos existem, de onde cada um sai, para onde vai e quem libera a passagem.</w:t>
-      </w:r>
-    </w:p>
-    <w:p>
-      <w:pPr>
-        <w:pStyle w:val="Heading2"/>
-      </w:pPr>
-      <w:r>
-        <w:t xml:space="preserve">Bloco 2 — A malha ferroviária — 25 min (slides 9 a 15)</w:t>
-      </w:r>
-    </w:p>
-    <w:p>
-      <w:pPr>
-        <w:spacing w:after="120" w:line="300"/>
-      </w:pPr>
-      <w:r>
-        <w:rPr>
-          <w:b/>
-          <w:bCs/>
-        </w:rPr>
-        <w:t xml:space="preserve">Objetivo: </w:t>
-      </w:r>
-      <w:r>
-        <w:t xml:space="preserve">apresentar os cinco trilhos e a regra de origem e destino de cada um.</w:t>
-      </w:r>
-    </w:p>
-    <w:p>
-      <w:pPr>
-        <w:spacing w:after="120" w:line="300"/>
-      </w:pPr>
-      <w:r>
-        <w:rPr>
-          <w:b/>
-          <w:bCs/>
-        </w:rPr>
-        <w:t xml:space="preserve">Slide 10 — Trilho, estação, desvio e entroncamento.</w:t>
-      </w:r>
-      <w:r>
-        <w:t xml:space="preserve"> Leia o desenho da esquerda para a direita: o tempo corre para a direita.</w:t>
+        <w:t xml:space="preserve">Slide 5 — O software é um trem.</w:t>
       </w:r>
     </w:p>
     <w:p>
@@ -3778,7 +4147,7 @@
       <w:r>
         <w:drawing>
           <wp:inline distT="0" distB="0" distL="0" distR="0">
-            <wp:extent cx="4000500" cy="1314450"/>
+            <wp:extent cx="3619500" cy="695325"/>
             <wp:effectExtent t="0" r="0" b="0" l="0"/>
             <wp:docPr id="1" name="" descr="" title=""/>
             <wp:cNvGraphicFramePr>
@@ -3803,7 +4172,7 @@
                   <pic:spPr bwMode="auto">
                     <a:xfrm>
                       <a:off x="0" y="0"/>
-                      <a:ext cx="4000500" cy="1314450"/>
+                      <a:ext cx="3619500" cy="695325"/>
                     </a:xfrm>
                     <a:prstGeom prst="rect">
                       <a:avLst/>
@@ -3830,7 +4199,7 @@
           <w:iCs/>
           <w:color w:val="22292E"/>
         </w:rPr>
-        <w:t xml:space="preserve">A linha azul é um trilho. Cada bolinha é uma estação, um commit. Em B sai um desvio: alguém foi trabalhar separado, sem fechar a linha. F1 e F2 são as paradas desse trabalho. Em M, o desvio volta: isso é o merge. E o trem? O trem é a versão do produto, o texto do contrato. Os trilhos e as estações são o caminho e o registro dela.</w:t>
+        <w:t xml:space="preserve">O trem é o sistema, o app do banco inteiro. Cada vagão é uma funcionalidade: Login, Pix, Extrato, Cartões. Mudar o software é mexer nos vagões: ganhar um vagão novo, melhorar um vagão ou consertar um vagão com defeito. E o trem está sempre rodando, com os clientes dentro.</w:t>
       </w:r>
     </w:p>
     <w:p>
@@ -3842,55 +4211,10 @@
           <w:b/>
           <w:bCs/>
         </w:rPr>
-        <w:t xml:space="preserve">Slide 11 — Dois trilhos permanentes.</w:t>
-      </w:r>
-      <w:r>
-        <w:t xml:space="preserve"> A main é a linha em operação, o contrato assinado; a develop é a linha da próxima composição, a minuta consolidada. Ninguém escreve direto em nenhum dos dois (Diretriz 7).</w:t>
-      </w:r>
-    </w:p>
-    <w:p>
-      <w:pPr>
-        <w:spacing w:after="120" w:line="300"/>
-      </w:pPr>
-      <w:r>
-        <w:rPr>
-          <w:b/>
-          <w:bCs/>
-        </w:rPr>
-        <w:t xml:space="preserve">Pergunta para a turma: </w:t>
-      </w:r>
-      <w:r>
-        <w:t xml:space="preserve">"Se a develop é a minuta, quando ela vira contrato assinado?" (Quando passa pela vistoria, a release, e entra na main.)</w:t>
-      </w:r>
-    </w:p>
-    <w:p>
-      <w:pPr>
-        <w:spacing w:after="120" w:line="300"/>
-      </w:pPr>
-      <w:r>
-        <w:rPr>
-          <w:b/>
-          <w:bCs/>
-        </w:rPr>
-        <w:t xml:space="preserve">Slide 12 — Três trilhos temporários.</w:t>
-      </w:r>
-      <w:r>
-        <w:t xml:space="preserve"> O asterisco quer dizer "qualquer nome". Feature é obra: uma novidade. Release é vistoria: a versão para de receber novidades e só recebe correção. Hotfix é emergência em produção. Chame a atenção para a última linha de cada cartão: release e hotfix voltam para dois lugares. Temporário quer dizer que, depois da junção, o desvio é apagado (Diretriz 3).</w:t>
-      </w:r>
-    </w:p>
-    <w:p>
-      <w:pPr>
-        <w:spacing w:after="120" w:line="300"/>
-      </w:pPr>
-      <w:r>
-        <w:rPr>
-          <w:b/>
-          <w:bCs/>
-        </w:rPr>
-        <w:t xml:space="preserve">Slide 13 — A malha completa.</w:t>
-      </w:r>
-      <w:r>
-        <w:t xml:space="preserve"> Percorra o desenho devagar; é o slide mais importante do bloco.</w:t>
+        <w:t xml:space="preserve">Slide 6 — Um trilho para cada trabalho.</w:t>
+      </w:r>
+      <w:r>
+        <w:t xml:space="preserve"> É a ideia central da parte 1.</w:t>
       </w:r>
     </w:p>
     <w:p>
@@ -3901,7 +4225,7 @@
       <w:r>
         <w:drawing>
           <wp:inline distT="0" distB="0" distL="0" distR="0">
-            <wp:extent cx="4476750" cy="2124075"/>
+            <wp:extent cx="4000500" cy="1114425"/>
             <wp:effectExtent t="0" r="0" b="0" l="0"/>
             <wp:docPr id="1" name="" descr="" title=""/>
             <wp:cNvGraphicFramePr>
@@ -3926,7 +4250,7 @@
                   <pic:spPr bwMode="auto">
                     <a:xfrm>
                       <a:off x="0" y="0"/>
-                      <a:ext cx="4476750" cy="2124075"/>
+                      <a:ext cx="4000500" cy="1114425"/>
                     </a:xfrm>
                     <a:prstGeom prst="rect">
                       <a:avLst/>
@@ -3941,67 +4265,27 @@
     </w:p>
     <w:p>
       <w:pPr>
-        <w:pStyle w:val="ListParagraph"/>
-        <w:numPr>
-          <w:ilvl w:val="0"/>
-          <w:numId w:val="6"/>
-        </w:numPr>
-        <w:spacing w:after="80" w:line="290"/>
-      </w:pPr>
-      <w:r>
-        <w:t xml:space="preserve">A obra A sai da develop e volta.</w:t>
-      </w:r>
-    </w:p>
-    <w:p>
-      <w:pPr>
-        <w:pStyle w:val="ListParagraph"/>
-        <w:numPr>
-          <w:ilvl w:val="0"/>
-          <w:numId w:val="6"/>
-        </w:numPr>
-        <w:spacing w:after="80" w:line="290"/>
-      </w:pPr>
-      <w:r>
-        <w:t xml:space="preserve">Do mesmo ponto saem a vistoria (release) e a obra B.</w:t>
-      </w:r>
-    </w:p>
-    <w:p>
-      <w:pPr>
-        <w:pStyle w:val="ListParagraph"/>
-        <w:numPr>
-          <w:ilvl w:val="0"/>
-          <w:numId w:val="6"/>
-        </w:numPr>
-        <w:spacing w:after="80" w:line="290"/>
-      </w:pPr>
-      <w:r>
-        <w:t xml:space="preserve">A vistoria recebe uma correção, entra na main com a placa v1.1.0.31 e volta para a develop.</w:t>
-      </w:r>
-    </w:p>
-    <w:p>
-      <w:pPr>
-        <w:pStyle w:val="ListParagraph"/>
-        <w:numPr>
-          <w:ilvl w:val="0"/>
-          <w:numId w:val="6"/>
-        </w:numPr>
-        <w:spacing w:after="80" w:line="290"/>
-      </w:pPr>
-      <w:r>
-        <w:t xml:space="preserve">Uma emergência sai da main, entra na main com a placa v1.1.1.33 e também volta para a develop.</w:t>
-      </w:r>
-    </w:p>
-    <w:p>
-      <w:pPr>
-        <w:pStyle w:val="ListParagraph"/>
-        <w:numPr>
-          <w:ilvl w:val="0"/>
-          <w:numId w:val="6"/>
-        </w:numPr>
-        <w:spacing w:after="80" w:line="290"/>
-      </w:pPr>
-      <w:r>
-        <w:t xml:space="preserve">A obra B, mais longa, entra na develop e vai esperar a próxima vistoria.</w:t>
+        <w:pBdr>
+          <w:left w:val="single" w:color="F39200" w:sz="18" w:space="12"/>
+        </w:pBdr>
+        <w:spacing w:before="60" w:after="140" w:line="300"/>
+        <w:ind w:left="360"/>
+      </w:pPr>
+      <w:r>
+        <w:rPr>
+          <w:i/>
+          <w:iCs/>
+          <w:color w:val="22292E"/>
+        </w:rPr>
+        <w:t xml:space="preserve">O trem continua rodando na linha. O vagão novo vai para um desvio, onde a equipe trabalha com calma, sem atrapalhar ninguém. Quando fica pronto, volta e é engatado. Branch é isso: um trilho separado para trabalhar.</w:t>
+      </w:r>
+    </w:p>
+    <w:p>
+      <w:pPr>
+        <w:spacing w:after="120" w:line="300"/>
+      </w:pPr>
+      <w:r>
+        <w:t xml:space="preserve">Por enquanto, "engatar de volta" basta. Se alguém perguntar como se junta, diga que é o assunto da parte 2.</w:t>
       </w:r>
     </w:p>
     <w:p>
@@ -4013,10 +4297,10 @@
           <w:b/>
           <w:bCs/>
         </w:rPr>
-        <w:t xml:space="preserve">Slide 14 — De onde sai, para onde vai.</w:t>
-      </w:r>
-      <w:r>
-        <w:t xml:space="preserve"> É a tabela da Diretriz 2. A regra de ouro, tudo o que entra na main volta para a develop, é o merge back, que volta no bloco 4.</w:t>
+        <w:t xml:space="preserve">Slide 7 — GitFlow é o regulamento da ferrovia.</w:t>
+      </w:r>
+      <w:r>
+        <w:t xml:space="preserve"> O GitFlow foi publicado em 2010 por Vincent Driessen e virou modelo de mercado. Não é uma ferramenta: é um combinado, que diz quais trilhos existem, de onde cada um sai, para onde vai e quem libera a passagem. No Modelo VIC, ele é regra (Diretriz 2).</w:t>
       </w:r>
     </w:p>
     <w:p>
@@ -4028,50 +4312,10 @@
           <w:b/>
           <w:bCs/>
         </w:rPr>
-        <w:t xml:space="preserve">Slide 15 — O nome diz o trilho.</w:t>
-      </w:r>
-      <w:r>
-        <w:t xml:space="preserve"> Os nomes seguem a Diretriz 11, e é por eles que as ferramentas e os indicadores reconhecem cada trilho. A placa é a tag; o número de quatro partes é explicado no bloco 4. Por ora: placa na main é versão que foi para produção (Diretriz 10).</w:t>
-      </w:r>
-    </w:p>
-    <w:p>
-      <w:pPr>
-        <w:pStyle w:val="Heading2"/>
-      </w:pPr>
-      <w:r>
-        <w:t xml:space="preserve">Dinâmica 1 — 20 min (slide 16)</w:t>
-      </w:r>
-    </w:p>
-    <w:p>
-      <w:pPr>
-        <w:spacing w:after="120" w:line="300"/>
-      </w:pPr>
-      <w:r>
-        <w:t xml:space="preserve">Conduza conforme a seção 5.</w:t>
-      </w:r>
-    </w:p>
-    <w:p>
-      <w:pPr>
-        <w:pStyle w:val="Heading2"/>
-      </w:pPr>
-      <w:r>
-        <w:t xml:space="preserve">Intervalo — 10 min (slide 17)</w:t>
-      </w:r>
-    </w:p>
-    <w:p>
-      <w:pPr>
-        <w:spacing w:after="120" w:line="300"/>
-      </w:pPr>
-      <w:r>
-        <w:t xml:space="preserve">Antes de sair, deixe a enquete da Dinâmica 2 pronta.</w:t>
-      </w:r>
-    </w:p>
-    <w:p>
-      <w:pPr>
-        <w:pStyle w:val="Heading2"/>
-      </w:pPr>
-      <w:r>
-        <w:t xml:space="preserve">Bloco 3 — Os tipos de merge — 30 min (slides 18 a 26)</w:t>
+        <w:t xml:space="preserve">Slide 8 — Dois trilhos permanentes.</w:t>
+      </w:r>
+      <w:r>
+        <w:t xml:space="preserve"> A main é a linha comercial: o trem completo, com passageiros, o que está em produção. A develop é o pátio de montagem: a próxima composição, com os vagões que já saíram prontos da oficina. Ninguém mexe direto em nenhum dos dois (Diretriz 7).</w:t>
       </w:r>
     </w:p>
     <w:p>
@@ -4083,10 +4327,10 @@
           <w:b/>
           <w:bCs/>
         </w:rPr>
-        <w:t xml:space="preserve">Objetivo: </w:t>
-      </w:r>
-      <w:r>
-        <w:t xml:space="preserve">mostrar que há quatro jeitos de juntar um desvio, que todos levam o mesmo conteúdo e que a diferença é a história que fica registrada.</w:t>
+        <w:t xml:space="preserve">Pergunta para a turma: </w:t>
+      </w:r>
+      <w:r>
+        <w:t xml:space="preserve">"Quando a composição do pátio vai para a linha comercial?" (Depois da vistoria, a release: o próximo slide.)</w:t>
       </w:r>
     </w:p>
     <w:p>
@@ -4098,10 +4342,25 @@
           <w:b/>
           <w:bCs/>
         </w:rPr>
-        <w:t xml:space="preserve">Slide 19 — Antes de juntar: a linha andou?</w:t>
-      </w:r>
-      <w:r>
-        <w:t xml:space="preserve"> É a pergunta que decide tudo. Se a develop não andou desde que o desvio saiu, juntar é trivial. Se andou, há três escolhas. Os quatro slides seguintes usam sempre o mesmo desenho: develop com A, B e C; desvio com F1 e F2.</w:t>
+        <w:t xml:space="preserve">Slide 9 — Três trilhos temporários.</w:t>
+      </w:r>
+      <w:r>
+        <w:t xml:space="preserve"> Chame a atenção para o tamanho do que roda em cada um: a feature e o hotfix cuidam de um vagão só; a release cuida da composição inteira. A release e o hotfix voltam para dois lugares; a feature, para um. Temporário quer dizer que, depois que o trabalho volta, o desvio é desmontado (Diretriz 3).</w:t>
+      </w:r>
+    </w:p>
+    <w:p>
+      <w:pPr>
+        <w:spacing w:after="120" w:line="300"/>
+      </w:pPr>
+      <w:r>
+        <w:rPr>
+          <w:b/>
+          <w:bCs/>
+        </w:rPr>
+        <w:t xml:space="preserve">Slide 10 — A malha completa.</w:t>
+      </w:r>
+      <w:r>
+        <w:t xml:space="preserve"> Percorra o desenho devagar; é o slide mais importante do bloco.</w:t>
       </w:r>
     </w:p>
     <w:p>
@@ -4112,7 +4371,7 @@
       <w:r>
         <w:drawing>
           <wp:inline distT="0" distB="0" distL="0" distR="0">
-            <wp:extent cx="2857500" cy="1123950"/>
+            <wp:extent cx="4476750" cy="2038350"/>
             <wp:effectExtent t="0" r="0" b="0" l="0"/>
             <wp:docPr id="1" name="" descr="" title=""/>
             <wp:cNvGraphicFramePr>
@@ -4137,7 +4396,7 @@
                   <pic:spPr bwMode="auto">
                     <a:xfrm>
                       <a:off x="0" y="0"/>
-                      <a:ext cx="2857500" cy="1123950"/>
+                      <a:ext cx="4476750" cy="2038350"/>
                     </a:xfrm>
                     <a:prstGeom prst="rect">
                       <a:avLst/>
@@ -4152,6 +4411,71 @@
     </w:p>
     <w:p>
       <w:pPr>
+        <w:pStyle w:val="ListParagraph"/>
+        <w:numPr>
+          <w:ilvl w:val="0"/>
+          <w:numId w:val="6"/>
+        </w:numPr>
+        <w:spacing w:after="80" w:line="290"/>
+      </w:pPr>
+      <w:r>
+        <w:t xml:space="preserve">Em cima, a main: o trem comercial, com passageiros.</w:t>
+      </w:r>
+    </w:p>
+    <w:p>
+      <w:pPr>
+        <w:pStyle w:val="ListParagraph"/>
+        <w:numPr>
+          <w:ilvl w:val="0"/>
+          <w:numId w:val="6"/>
+        </w:numPr>
+        <w:spacing w:after="80" w:line="290"/>
+      </w:pPr>
+      <w:r>
+        <w:t xml:space="preserve">Embaixo, a develop: o pátio, montando a próxima composição. O vagão tracejado é o lugar do que ainda está na oficina.</w:t>
+      </w:r>
+    </w:p>
+    <w:p>
+      <w:pPr>
+        <w:pStyle w:val="ListParagraph"/>
+        <w:numPr>
+          <w:ilvl w:val="0"/>
+          <w:numId w:val="6"/>
+        </w:numPr>
+        <w:spacing w:after="80" w:line="290"/>
+      </w:pPr>
+      <w:r>
+        <w:t xml:space="preserve">Na feature, o vagão Cartões é construído e volta para o pátio.</w:t>
+      </w:r>
+    </w:p>
+    <w:p>
+      <w:pPr>
+        <w:pStyle w:val="ListParagraph"/>
+        <w:numPr>
+          <w:ilvl w:val="0"/>
+          <w:numId w:val="6"/>
+        </w:numPr>
+        <w:spacing w:after="80" w:line="290"/>
+      </w:pPr>
+      <w:r>
+        <w:t xml:space="preserve">Quando a composição do pátio fica pronta, vai inteira para a vistoria, a release. Aprovada, entra na linha comercial e também volta para o pátio.</w:t>
+      </w:r>
+    </w:p>
+    <w:p>
+      <w:pPr>
+        <w:pStyle w:val="ListParagraph"/>
+        <w:numPr>
+          <w:ilvl w:val="0"/>
+          <w:numId w:val="6"/>
+        </w:numPr>
+        <w:spacing w:after="80" w:line="290"/>
+      </w:pPr>
+      <w:r>
+        <w:t xml:space="preserve">Quando um vagão do trem comercial dá defeito, ele vai para o desvio de emergência, o hotfix. O conserto volta para o trem comercial e para o pátio.</w:t>
+      </w:r>
+    </w:p>
+    <w:p>
+      <w:pPr>
         <w:spacing w:after="120" w:line="300"/>
       </w:pPr>
       <w:r>
@@ -4159,10 +4483,10 @@
           <w:b/>
           <w:bCs/>
         </w:rPr>
-        <w:t xml:space="preserve">Slide 20 — Fast-forward.</w:t>
-      </w:r>
-      <w:r>
-        <w:t xml:space="preserve"> O marcador da develop só pula para a frente, até F2: não há junção, porque não há o que juntar. O histórico fica reto e perde o desenho do desvio. No GitFlow original, as junções evitam o fast-forward justamente para que o desvio continue visível.</w:t>
+        <w:t xml:space="preserve">Slide 11 — De onde sai, para onde vai.</w:t>
+      </w:r>
+      <w:r>
+        <w:t xml:space="preserve"> É a tabela da Diretriz 2, em linguagem de trem. Insista na regra de ouro:</w:t>
       </w:r>
     </w:p>
     <w:p>
@@ -4179,7 +4503,15 @@
           <w:iCs/>
           <w:color w:val="22292E"/>
         </w:rPr>
-        <w:t xml:space="preserve">No contrato: ninguém mexeu na minuta desde que você pegou a sua cópia. Então a sua cópia passa a ser a minuta.</w:t>
+        <w:t xml:space="preserve">Se o vagão consertado volta só para o trem comercial, a próxima composição, que está sendo montada no pátio com o vagão antigo, sai com o mesmo defeito.</w:t>
+      </w:r>
+    </w:p>
+    <w:p>
+      <w:pPr>
+        <w:spacing w:after="120" w:line="300"/>
+      </w:pPr>
+      <w:r>
+        <w:t xml:space="preserve">Na parte 2, essa volta ganha um nome: merge back.</w:t>
       </w:r>
     </w:p>
     <w:p>
@@ -4191,10 +4523,77 @@
           <w:b/>
           <w:bCs/>
         </w:rPr>
-        <w:t xml:space="preserve">Slide 21 — Merge commit.</w:t>
-      </w:r>
-      <w:r>
-        <w:t xml:space="preserve"> A junção vira uma estação própria, M. Nada é reescrito; o mapa guarda quando o desvio saiu e quando voltou. É o jeito do GitFlow original, em todas as junções.</w:t>
+        <w:t xml:space="preserve">Slide 12 — O nome diz o trilho.</w:t>
+      </w:r>
+      <w:r>
+        <w:t xml:space="preserve"> Os nomes seguem a Diretriz 11, e é por eles que as ferramentas e os indicadores reconhecem cada trilho. Os números da release e do hotfix são números de versão; eles ficam para a parte 2.</w:t>
+      </w:r>
+    </w:p>
+    <w:p>
+      <w:pPr>
+        <w:pStyle w:val="Heading2"/>
+      </w:pPr>
+      <w:r>
+        <w:t xml:space="preserve">Dinâmica 1 — 20 min (slide 13)</w:t>
+      </w:r>
+    </w:p>
+    <w:p>
+      <w:pPr>
+        <w:spacing w:after="120" w:line="300"/>
+      </w:pPr>
+      <w:r>
+        <w:t xml:space="preserve">Conduza conforme a seção 5.</w:t>
+      </w:r>
+    </w:p>
+    <w:p>
+      <w:pPr>
+        <w:pStyle w:val="Heading2"/>
+      </w:pPr>
+      <w:r>
+        <w:t xml:space="preserve">Intervalo — 10 min (slide 14)</w:t>
+      </w:r>
+    </w:p>
+    <w:p>
+      <w:pPr>
+        <w:spacing w:after="120" w:line="300"/>
+      </w:pPr>
+      <w:r>
+        <w:t xml:space="preserve">Antes de sair, deixe a enquete da Dinâmica 2 pronta. O slide avisa que, na volta, o trem dá lugar ao contrato.</w:t>
+      </w:r>
+    </w:p>
+    <w:p>
+      <w:pPr>
+        <w:pStyle w:val="Heading2"/>
+      </w:pPr>
+      <w:r>
+        <w:t xml:space="preserve">Parte 2 · Bloco 2 — O contrato — 20 min (slides 15 a 19)</w:t>
+      </w:r>
+    </w:p>
+    <w:p>
+      <w:pPr>
+        <w:spacing w:after="120" w:line="300"/>
+      </w:pPr>
+      <w:r>
+        <w:rPr>
+          <w:b/>
+          <w:bCs/>
+        </w:rPr>
+        <w:t xml:space="preserve">Objetivo: </w:t>
+      </w:r>
+      <w:r>
+        <w:t xml:space="preserve">mostrar o que fica registrado em cada trilho, com o contrato e as suas minutas, e ligar os trilhos da parte 1 às linhas do tempo.</w:t>
+      </w:r>
+    </w:p>
+    <w:p>
+      <w:pPr>
+        <w:spacing w:after="120" w:line="300"/>
+      </w:pPr>
+      <w:r>
+        <w:rPr>
+          <w:b/>
+          <w:bCs/>
+        </w:rPr>
+        <w:t xml:space="preserve">Slide 16 — Qual destes vale?</w:t>
       </w:r>
     </w:p>
     <w:p>
@@ -4211,7 +4610,7 @@
           <w:iCs/>
           <w:color w:val="22292E"/>
         </w:rPr>
-        <w:t xml:space="preserve">No contrato: a cláusula entra com todas as versões, e alguém anota "incorporada em 12/10, aprovada por fulano".</w:t>
+        <w:t xml:space="preserve">Todo mundo já viu essa pasta. Qual destes é o contrato que vale? O problema não é falta de cuidado: arquivo copiado não diz quem mudou, o quê, nem por quê, e nenhum deles diz que é o oficial.</w:t>
       </w:r>
     </w:p>
     <w:p>
@@ -4223,27 +4622,10 @@
           <w:b/>
           <w:bCs/>
         </w:rPr>
-        <w:t xml:space="preserve">Slide 22 — Squash.</w:t>
-      </w:r>
-      <w:r>
-        <w:t xml:space="preserve"> Espremer: as paradas do desvio viram uma estação só. Útil quando o desvio tem muitas paradas pequenas ("ajuste", "ajuste 2", "agora vai"). Perde o passo a passo, e o desvio deve ser apagado depois: ele não serve mais para continuar o trabalho. Curiosidade: por isso a Diretriz 4 não mede a divergência só pelo número de commits, que o squash reduz sem reduzir a divergência real.</w:t>
-      </w:r>
-    </w:p>
-    <w:p>
-      <w:pPr>
-        <w:pBdr>
-          <w:left w:val="single" w:color="F39200" w:sz="18" w:space="12"/>
-        </w:pBdr>
-        <w:spacing w:before="60" w:after="140" w:line="300"/>
-        <w:ind w:left="360"/>
-      </w:pPr>
-      <w:r>
-        <w:rPr>
-          <w:i/>
-          <w:iCs/>
-          <w:color w:val="22292E"/>
-        </w:rPr>
-        <w:t xml:space="preserve">No contrato: passar a limpo. Entra o texto final da cláusula, sem os rascunhos.</w:t>
+        <w:t xml:space="preserve">Slide 17 — O Git guarda cada versão, rubricada.</w:t>
+      </w:r>
+      <w:r>
+        <w:t xml:space="preserve"> O commit é a rubrica: quem, quando, o quê e por quê. O repositório é a pasta com todas as versões, para sempre; dá para comparar duas e voltar a qualquer uma.</w:t>
       </w:r>
     </w:p>
     <w:p>
@@ -4255,610 +4637,10 @@
           <w:b/>
           <w:bCs/>
         </w:rPr>
-        <w:t xml:space="preserve">Slide 23 — Rebase.</w:t>
-      </w:r>
-      <w:r>
-        <w:t xml:space="preserve"> Mudar a base: o desvio, que saía de B, passa a sair de C. As estações são reconstruídas e ganham o apóstrofo (F1′, F2′): mesmo conteúdo, outra identidade e outra data. Depois do rebase, a junção vira um fast-forward.</w:t>
-      </w:r>
-    </w:p>
-    <w:p>
-      <w:pPr>
-        <w:pBdr>
-          <w:left w:val="single" w:color="F39200" w:sz="18" w:space="12"/>
-        </w:pBdr>
-        <w:spacing w:before="60" w:after="140" w:line="300"/>
-        <w:ind w:left="360"/>
-      </w:pPr>
-      <w:r>
-        <w:rPr>
-          <w:i/>
-          <w:iCs/>
-          <w:color w:val="22292E"/>
-        </w:rPr>
-        <w:t xml:space="preserve">No contrato: antes de pedir o visto, você refaz a sua cópia em cima da minuta mais recente. Só que ninguém faz isso numa cópia que outras pessoas estão lendo: seria trocar as páginas debaixo do nariz delas.</w:t>
-      </w:r>
-    </w:p>
-    <w:p>
-      <w:pPr>
-        <w:spacing w:after="120" w:line="300"/>
-      </w:pPr>
-      <w:r>
-        <w:rPr>
-          <w:b/>
-          <w:bCs/>
-        </w:rPr>
-        <w:t xml:space="preserve">Slide 24 — Lado a lado.</w:t>
-      </w:r>
-      <w:r>
-        <w:t xml:space="preserve"> Resumo para fotografar. Insista na frase de baixo: nenhum tipo de merge perde a mudança em si.</w:t>
-      </w:r>
-    </w:p>
-    <w:p>
-      <w:pPr>
-        <w:spacing w:after="120" w:line="300"/>
-      </w:pPr>
-      <w:r>
-        <w:rPr>
-          <w:b/>
-          <w:bCs/>
-        </w:rPr>
-        <w:t xml:space="preserve">Slide 25 — Os botões.</w:t>
-      </w:r>
-      <w:r>
-        <w:t xml:space="preserve"> As plataformas do Modelo VIC são o GitHub e o Azure DevOps, e os botões aparecem na conclusão do pull request. O fast-forward puro não tem botão próprio: acontece quando a linha não andou ou depois de um rebase. O semi-linear, do Azure DevOps, faz o rebase e ainda cria a estação de junção. Quem escolhe o tipo é a política do repositório; na dúvida, o Integrador (Diretriz 6).</w:t>
-      </w:r>
-    </w:p>
-    <w:p>
-      <w:pPr>
-        <w:spacing w:after="120" w:line="300"/>
-      </w:pPr>
-      <w:r>
-        <w:rPr>
-          <w:b/>
-          <w:bCs/>
-        </w:rPr>
-        <w:t xml:space="preserve">Slide 26 — Conflito.</w:t>
-      </w:r>
-      <w:r>
-        <w:t xml:space="preserve"> Não é erro de ninguém: é o Git avisando que duas mudanças disputam o mesmo trecho e que ele não vai adivinhar qual vale. Pode acontecer em qualquer tipo de merge.</w:t>
-      </w:r>
-    </w:p>
-    <w:p>
-      <w:pPr>
-        <w:pBdr>
-          <w:left w:val="single" w:color="F39200" w:sz="18" w:space="12"/>
-        </w:pBdr>
-        <w:spacing w:before="60" w:after="140" w:line="300"/>
-        <w:ind w:left="360"/>
-      </w:pPr>
-      <w:r>
-        <w:rPr>
-          <w:i/>
-          <w:iCs/>
-          <w:color w:val="22292E"/>
-        </w:rPr>
-        <w:t xml:space="preserve">O jurídico pôs a multa em 2%; o comercial, em 1%. Quem decide? Não é o Git, e muitas vezes não é o time técnico: é o negócio. Quando o conflito é de regra, o time vai precisar de vocês.</w:t>
-      </w:r>
-    </w:p>
-    <w:p>
-      <w:pPr>
-        <w:pStyle w:val="Heading2"/>
-      </w:pPr>
-      <w:r>
-        <w:t xml:space="preserve">Dinâmica 2 — 15 min (slides 27 e 28)</w:t>
-      </w:r>
-    </w:p>
-    <w:p>
-      <w:pPr>
-        <w:spacing w:after="120" w:line="300"/>
-      </w:pPr>
-      <w:r>
-        <w:t xml:space="preserve">Conduza conforme a seção 5.</w:t>
-      </w:r>
-    </w:p>
-    <w:p>
-      <w:pPr>
-        <w:pStyle w:val="Heading2"/>
-      </w:pPr>
-      <w:r>
-        <w:t xml:space="preserve">Bloco 4 — A viagem no Modelo VIC — 15 min (slides 29 a 34)</w:t>
-      </w:r>
-    </w:p>
-    <w:p>
-      <w:pPr>
-        <w:spacing w:after="120" w:line="300"/>
-      </w:pPr>
-      <w:r>
-        <w:rPr>
-          <w:b/>
-          <w:bCs/>
-        </w:rPr>
-        <w:t xml:space="preserve">Objetivo: </w:t>
-      </w:r>
-      <w:r>
-        <w:t xml:space="preserve">ligar o fluxo às regras do Modelo VIC. São seis slides em 15 minutos: não se demore em nenhum.</w:t>
-      </w:r>
-    </w:p>
-    <w:p>
-      <w:pPr>
-        <w:spacing w:after="120" w:line="300"/>
-      </w:pPr>
-      <w:r>
-        <w:rPr>
-          <w:b/>
-          <w:bCs/>
-        </w:rPr>
-        <w:t xml:space="preserve">Slide 30 — A cancela.</w:t>
-      </w:r>
-      <w:r>
-        <w:t xml:space="preserve"> Push direto na main e na develop é bloqueado (Diretriz 7). Toda mudança chega por pull request, o pedido de passagem, em dois momentos (Diretriz 8): a aprovação, pelos revisores do time, e a completude, pelo Integrador, que efetiva o merge. É na completude que se escolhe o tipo de merge. O PR fica guardado como evidência para auditoria.</w:t>
-      </w:r>
-    </w:p>
-    <w:p>
-      <w:pPr>
-        <w:spacing w:after="120" w:line="300"/>
-      </w:pPr>
-      <w:r>
-        <w:rPr>
-          <w:b/>
-          <w:bCs/>
-        </w:rPr>
-        <w:t xml:space="preserve">Slide 31 — Merge back.</w:t>
-      </w:r>
-      <w:r>
-        <w:t xml:space="preserve"> Toda release e todo hotfix que entram na main voltam para a develop, ao fim de cada ciclo (Diretriz 5).</w:t>
-      </w:r>
-    </w:p>
-    <w:p>
-      <w:pPr>
-        <w:pBdr>
-          <w:left w:val="single" w:color="F39200" w:sz="18" w:space="12"/>
-        </w:pBdr>
-        <w:spacing w:before="60" w:after="140" w:line="300"/>
-        <w:ind w:left="360"/>
-      </w:pPr>
-      <w:r>
-        <w:rPr>
-          <w:i/>
-          <w:iCs/>
-          <w:color w:val="22292E"/>
-        </w:rPr>
-        <w:t xml:space="preserve">Se a correção feita na vistoria não volta para a develop, a próxima versão, que é montada a partir da develop, sai com o erro de novo. É o aditivo que ninguém passou para a minuta.</w:t>
-      </w:r>
-    </w:p>
-    <w:p>
-      <w:pPr>
-        <w:spacing w:after="120" w:line="300"/>
-      </w:pPr>
-      <w:r>
-        <w:rPr>
-          <w:b/>
-          <w:bCs/>
-        </w:rPr>
-        <w:t xml:space="preserve">Slide 32 — O número da versão.</w:t>
-      </w:r>
-      <w:r>
-        <w:t xml:space="preserve"> MAJOR muda o que já valia; MINOR traz novidade sem mudar o que existia; PATCH corrige. As três partes são o SemVer (Diretriz 9). A quarta, o BUILD, identifica a montagem, e só versão com os quatro números vai para produção: é o Padrão VEC (Diretriz 10). Cada versão publicada tem a sua nota de versão, com o que foi adicionado, alterado e corrigido (Diretriz 13).</w:t>
-      </w:r>
-    </w:p>
-    <w:p>
-      <w:pPr>
-        <w:spacing w:after="120" w:line="300"/>
-      </w:pPr>
-      <w:r>
-        <w:rPr>
-          <w:b/>
-          <w:bCs/>
-        </w:rPr>
-        <w:t xml:space="preserve">Slide 33 — Desvio curto, junção frequente.</w:t>
-      </w:r>
-      <w:r>
-        <w:t xml:space="preserve"> Quanto mais tempo uma área fica com a sua cópia sem olhar a minuta, mais difícil é juntar depois. O Modelo VIC mede isso, a divergência, e fixa limites por faixa de maturidade; os números do slide são os da faixa 3, a meta institucional (Diretriz 4).</w:t>
-      </w:r>
-    </w:p>
-    <w:p>
-      <w:pPr>
-        <w:spacing w:after="120" w:line="300"/>
-      </w:pPr>
-      <w:r>
-        <w:rPr>
-          <w:b/>
-          <w:bCs/>
-        </w:rPr>
-        <w:t xml:space="preserve">Slide 34 — O que você viu hoje.</w:t>
-      </w:r>
-      <w:r>
-        <w:t xml:space="preserve"> Não leia a tabela inteira: escolha duas linhas. As Diretrizes 1 e 12 ficam de fora porque tratam de testes e do conteúdo dos arquivos, não do fluxo.</w:t>
-      </w:r>
-    </w:p>
-    <w:p>
-      <w:pPr>
-        <w:pStyle w:val="Heading2"/>
-      </w:pPr>
-      <w:r>
-        <w:t xml:space="preserve">Dinâmica 3 — 25 min (slide 35)</w:t>
-      </w:r>
-    </w:p>
-    <w:p>
-      <w:pPr>
-        <w:spacing w:after="120" w:line="300"/>
-      </w:pPr>
-      <w:r>
-        <w:t xml:space="preserve">Conduza conforme a seção 5.</w:t>
-      </w:r>
-    </w:p>
-    <w:p>
-      <w:pPr>
-        <w:pStyle w:val="Heading2"/>
-      </w:pPr>
-      <w:r>
-        <w:t xml:space="preserve">Fechamento — 10 min (slides 36 a 39)</w:t>
-      </w:r>
-    </w:p>
-    <w:p>
-      <w:pPr>
-        <w:spacing w:after="120" w:line="300"/>
-      </w:pPr>
-      <w:r>
-        <w:rPr>
-          <w:b/>
-          <w:bCs/>
-        </w:rPr>
-        <w:t xml:space="preserve">Slide 36 — Voltando à enquete.</w:t>
-      </w:r>
-      <w:r>
-        <w:t xml:space="preserve"> A resposta é C: cada trilho é uma cópia, e o GitFlow é a regra de como e quando as cópias voltam. A é a pasta do FINAL_v3: ninguém sabe qual vale. B funciona, mas é uma fila: ninguém trabalha em paralelo. D é o atropelo: um salva por cima do outro. Repita a enquete e mostre a diferença em relação ao começo.</w:t>
-      </w:r>
-    </w:p>
-    <w:p>
-      <w:pPr>
-        <w:spacing w:after="120" w:line="300"/>
-      </w:pPr>
-      <w:r>
-        <w:rPr>
-          <w:b/>
-          <w:bCs/>
-        </w:rPr>
-        <w:t xml:space="preserve">Slide 37 — Perguntas que você já pode fazer ao time.</w:t>
-      </w:r>
-      <w:r>
-        <w:t xml:space="preserve"> É o ganho prático da oficina. Peça que cada pessoa escolha a pergunta que vai fazer na próxima reunião.</w:t>
-      </w:r>
-    </w:p>
-    <w:p>
-      <w:pPr>
-        <w:spacing w:after="120" w:line="300"/>
-      </w:pPr>
-      <w:r>
-        <w:rPr>
-          <w:b/>
-          <w:bCs/>
-        </w:rPr>
-        <w:t xml:space="preserve">Slide 38 — Para levar.</w:t>
-      </w:r>
-      <w:r>
-        <w:t xml:space="preserve"> Três frases: cada trem no seu trilho; juntar é escolher a história; tudo o que chega à main volta para a develop. Envie a cartilha de bolso no chat.</w:t>
-      </w:r>
-    </w:p>
-    <w:p>
-      <w:pPr>
-        <w:spacing w:after="120" w:line="300"/>
-      </w:pPr>
-      <w:r>
-        <w:rPr>
-          <w:b/>
-          <w:bCs/>
-        </w:rPr>
-        <w:t xml:space="preserve">Slide 39 — "Cada trem no seu trilho."</w:t>
-      </w:r>
-      <w:r>
-        <w:t xml:space="preserve"> Agradeça e abra para dúvidas.</w:t>
-      </w:r>
-    </w:p>
-    <w:p>
-      <w:pPr>
-        <w:pStyle w:val="Heading1"/>
-        <w:pageBreakBefore/>
-      </w:pPr>
-      <w:r>
-        <w:t xml:space="preserve">5. As dinâmicas</w:t>
-      </w:r>
-    </w:p>
-    <w:p>
-      <w:pPr>
-        <w:pStyle w:val="Heading2"/>
-      </w:pPr>
-      <w:r>
-        <w:t xml:space="preserve">Dinâmica 1 — Qual trilho? (20 min)</w:t>
-      </w:r>
-    </w:p>
-    <w:p>
-      <w:pPr>
-        <w:spacing w:after="120" w:line="300"/>
-      </w:pPr>
-      <w:r>
-        <w:rPr>
-          <w:b/>
-          <w:bCs/>
-        </w:rPr>
-        <w:t xml:space="preserve">Objetivo: </w:t>
-      </w:r>
-      <w:r>
-        <w:t xml:space="preserve">associar situações do dia a dia de um sistema ao trilho certo, com a origem e o destino.</w:t>
-      </w:r>
-    </w:p>
-    <w:p>
-      <w:pPr>
-        <w:pStyle w:val="ListParagraph"/>
-        <w:numPr>
-          <w:ilvl w:val="0"/>
-          <w:numId w:val="7"/>
-        </w:numPr>
-        <w:spacing w:after="80" w:line="290"/>
-      </w:pPr>
-      <w:r>
-        <w:t xml:space="preserve">Faça a primeira carta com a turma, no slide 16: "Desde ontem, o app em produção cobra a tarifa em dobro" vai para hotfix/*, sai da main e volta para a main e para a develop.</w:t>
-      </w:r>
-    </w:p>
-    <w:p>
-      <w:pPr>
-        <w:pStyle w:val="ListParagraph"/>
-        <w:numPr>
-          <w:ilvl w:val="0"/>
-          <w:numId w:val="7"/>
-        </w:numPr>
-        <w:spacing w:after="80" w:line="290"/>
-      </w:pPr>
-      <w:r>
-        <w:t xml:space="preserve">Abra as salas por 12 minutos. Cada grupo arrasta as 12 cartas para as cinco raias (ou para o canto "Não pode!") e cola em cada uma a etiqueta "sai de / vai para".</w:t>
-      </w:r>
-    </w:p>
-    <w:p>
-      <w:pPr>
-        <w:pStyle w:val="ListParagraph"/>
-        <w:numPr>
-          <w:ilvl w:val="0"/>
-          <w:numId w:val="7"/>
-        </w:numPr>
-        <w:spacing w:after="80" w:line="290"/>
-      </w:pPr>
-      <w:r>
-        <w:t xml:space="preserve">Visite as salas. Se um grupo travar, pergunte: "isso já está com o cliente? É novidade ou é conserto? Dá para esperar a próxima versão?".</w:t>
-      </w:r>
-    </w:p>
-    <w:p>
-      <w:pPr>
-        <w:pStyle w:val="ListParagraph"/>
-        <w:numPr>
-          <w:ilvl w:val="0"/>
-          <w:numId w:val="7"/>
-        </w:numPr>
-        <w:spacing w:after="80" w:line="290"/>
-      </w:pPr>
-      <w:r>
-        <w:t xml:space="preserve">Na volta (8 min), peça a cada grupo a carta de que teve mais dúvida.</w:t>
-      </w:r>
-    </w:p>
-    <w:p>
-      <w:pPr>
-        <w:spacing w:after="120" w:line="300"/>
-      </w:pPr>
-      <w:r>
-        <w:rPr>
-          <w:b/>
-          <w:bCs/>
-        </w:rPr>
-        <w:t xml:space="preserve">Perguntas para a volta:</w:t>
-      </w:r>
-    </w:p>
-    <w:p>
-      <w:pPr>
-        <w:pStyle w:val="ListParagraph"/>
-        <w:numPr>
-          <w:ilvl w:val="0"/>
-          <w:numId w:val="3"/>
-        </w:numPr>
-        <w:spacing w:after="80" w:line="290"/>
-      </w:pPr>
-      <w:r>
-        <w:t xml:space="preserve">"Na homologação da 2.4, um texto da tela está errado": por que não abre uma feature? (A vistoria já começou: correção entra na própria release.)</w:t>
-      </w:r>
-    </w:p>
-    <w:p>
-      <w:pPr>
-        <w:pStyle w:val="ListParagraph"/>
-        <w:numPr>
-          <w:ilvl w:val="0"/>
-          <w:numId w:val="3"/>
-        </w:numPr>
-        <w:spacing w:after="80" w:line="290"/>
-      </w:pPr>
-      <w:r>
-        <w:t xml:space="preserve">"A correção urgente de ontem também precisa estar na próxima versão": que trilho é esse? (Nenhum novo: é o merge back do hotfix para a develop.)</w:t>
-      </w:r>
-    </w:p>
-    <w:p>
-      <w:pPr>
-        <w:pStyle w:val="ListParagraph"/>
-        <w:numPr>
-          <w:ilvl w:val="0"/>
-          <w:numId w:val="3"/>
-        </w:numPr>
-        <w:spacing w:after="80" w:line="290"/>
-      </w:pPr>
-      <w:r>
-        <w:t xml:space="preserve">"Alterar direto a versão em produção, porque é rapidinho": por que não pode? (A main é protegida; tudo passa pela cancela do pull request.)</w:t>
-      </w:r>
-    </w:p>
-    <w:p>
-      <w:pPr>
-        <w:spacing w:after="120" w:line="300"/>
-      </w:pPr>
-      <w:r>
-        <w:rPr>
-          <w:b/>
-          <w:bCs/>
-        </w:rPr>
-        <w:t xml:space="preserve">Gabarito: </w:t>
-      </w:r>
-      <w:r>
-        <w:t xml:space="preserve">no material das dinâmicas.</w:t>
-      </w:r>
-    </w:p>
-    <w:p>
-      <w:pPr>
-        <w:pStyle w:val="Heading2"/>
-      </w:pPr>
-      <w:r>
-        <w:t xml:space="preserve">Dinâmica 2 — Qual foi o merge? (15 min)</w:t>
-      </w:r>
-    </w:p>
-    <w:p>
-      <w:pPr>
-        <w:spacing w:after="120" w:line="300"/>
-      </w:pPr>
-      <w:r>
-        <w:rPr>
-          <w:b/>
-          <w:bCs/>
-        </w:rPr>
-        <w:t xml:space="preserve">Objetivo: </w:t>
-      </w:r>
-      <w:r>
-        <w:t xml:space="preserve">reconhecer os quatro tipos de merge pelo desenho e pela intenção.</w:t>
-      </w:r>
-    </w:p>
-    <w:p>
-      <w:pPr>
-        <w:pStyle w:val="ListParagraph"/>
-        <w:numPr>
-          <w:ilvl w:val="0"/>
-          <w:numId w:val="8"/>
-        </w:numPr>
-        <w:spacing w:after="80" w:line="290"/>
-      </w:pPr>
-      <w:r>
-        <w:t xml:space="preserve">Slide 27, rodadas 1 a 4: uma rodada por vez, com a enquete das quatro opções e 30 segundos para votar. Mostre o resultado e comente em 30 segundos.</w:t>
-      </w:r>
-    </w:p>
-    <w:p>
-      <w:pPr>
-        <w:pStyle w:val="ListParagraph"/>
-        <w:numPr>
-          <w:ilvl w:val="0"/>
-          <w:numId w:val="8"/>
-        </w:numPr>
-        <w:spacing w:after="80" w:line="290"/>
-      </w:pPr>
-      <w:r>
-        <w:t xml:space="preserve">Slide 28, rodadas 5 a 8: a mesma enquete, agora com situações em texto: "qual você escolheria?".</w:t>
-      </w:r>
-    </w:p>
-    <w:p>
-      <w:pPr>
-        <w:spacing w:after="120" w:line="300"/>
-      </w:pPr>
-      <w:r>
-        <w:rPr>
-          <w:b/>
-          <w:bCs/>
-        </w:rPr>
-        <w:t xml:space="preserve">Respostas: </w:t>
-      </w:r>
-      <w:r>
-        <w:t xml:space="preserve">1 squash; 2 fast-forward; 3 rebase; 4 merge commit; 5 merge commit; 6 squash; 7 rebase; 8 fast-forward.</w:t>
-      </w:r>
-    </w:p>
-    <w:p>
-      <w:pPr>
-        <w:spacing w:after="120" w:line="300"/>
-      </w:pPr>
-      <w:r>
-        <w:rPr>
-          <w:b/>
-          <w:bCs/>
-        </w:rPr>
-        <w:t xml:space="preserve">O que observar: </w:t>
-      </w:r>
-      <w:r>
-        <w:t xml:space="preserve">a rodada 2 é a pegadinha: o desenho não tem C, porque partiu do "antes" em que a linha não andou. Na rodada 7, quem responder merge commit (trazer a develop para dentro do desvio) também resolve, e é a resposta certa quando o desvio é compartilhado com outras pessoas; reforce que o rebase é só para o próprio desvio.</w:t>
-      </w:r>
-    </w:p>
-    <w:p>
-      <w:pPr>
-        <w:pStyle w:val="Heading2"/>
-      </w:pPr>
-      <w:r>
-        <w:t xml:space="preserve">Dinâmica 3 — A viagem do Contratos Online (25 min)</w:t>
-      </w:r>
-    </w:p>
-    <w:p>
-      <w:pPr>
-        <w:spacing w:after="120" w:line="300"/>
-      </w:pPr>
-      <w:r>
-        <w:rPr>
-          <w:b/>
-          <w:bCs/>
-        </w:rPr>
-        <w:t xml:space="preserve">Objetivo: </w:t>
-      </w:r>
-      <w:r>
-        <w:t xml:space="preserve">montar, em grupo, uma malha completa a partir de uma história, com release, hotfix e merge back.</w:t>
-      </w:r>
-    </w:p>
-    <w:p>
-      <w:pPr>
-        <w:spacing w:after="120" w:line="300"/>
-      </w:pPr>
-      <w:r>
-        <w:rPr>
-          <w:b/>
-          <w:bCs/>
-        </w:rPr>
-        <w:t xml:space="preserve">Caso: </w:t>
-      </w:r>
-      <w:r>
-        <w:t xml:space="preserve">o Contratos Online é um sistema fictício; em produção está a versão v2.3.0.97. Os oito eventos estão no slide 35 e no frame de cada grupo.</w:t>
-      </w:r>
-    </w:p>
-    <w:p>
-      <w:pPr>
-        <w:pStyle w:val="ListParagraph"/>
-        <w:numPr>
-          <w:ilvl w:val="0"/>
-          <w:numId w:val="9"/>
-        </w:numPr>
-        <w:spacing w:after="80" w:line="290"/>
-      </w:pPr>
-      <w:r>
-        <w:t xml:space="preserve">Explique a tarefa: desenhar a malha, na ordem dos eventos, numerando cada estação com o número do evento.</w:t>
-      </w:r>
-    </w:p>
-    <w:p>
-      <w:pPr>
-        <w:pStyle w:val="ListParagraph"/>
-        <w:numPr>
-          <w:ilvl w:val="0"/>
-          <w:numId w:val="9"/>
-        </w:numPr>
-        <w:spacing w:after="80" w:line="290"/>
-      </w:pPr>
-      <w:r>
-        <w:t xml:space="preserve">Salas por 15 minutos.</w:t>
-      </w:r>
-    </w:p>
-    <w:p>
-      <w:pPr>
-        <w:pStyle w:val="ListParagraph"/>
-        <w:numPr>
-          <w:ilvl w:val="0"/>
-          <w:numId w:val="9"/>
-        </w:numPr>
-        <w:spacing w:after="80" w:line="290"/>
-      </w:pPr>
-      <w:r>
-        <w:t xml:space="preserve">Na volta (10 min), um grupo mostra a malha e os outros comparam. Depois, mostre o gabarito.</w:t>
+        <w:t xml:space="preserve">Slide 18 — Os trilhos viram linhas do tempo.</w:t>
+      </w:r>
+      <w:r>
+        <w:t xml:space="preserve"> É a ponte entre as partes.</w:t>
       </w:r>
     </w:p>
     <w:p>
@@ -4869,7 +4651,7 @@
       <w:r>
         <w:drawing>
           <wp:inline distT="0" distB="0" distL="0" distR="0">
-            <wp:extent cx="4476750" cy="2305050"/>
+            <wp:extent cx="3810000" cy="1247775"/>
             <wp:effectExtent t="0" r="0" b="0" l="0"/>
             <wp:docPr id="1" name="" descr="" title=""/>
             <wp:cNvGraphicFramePr>
@@ -4894,6 +4676,879 @@
                   <pic:spPr bwMode="auto">
                     <a:xfrm>
                       <a:off x="0" y="0"/>
+                      <a:ext cx="3810000" cy="1247775"/>
+                    </a:xfrm>
+                    <a:prstGeom prst="rect">
+                      <a:avLst/>
+                    </a:prstGeom>
+                  </pic:spPr>
+                </pic:pic>
+              </a:graphicData>
+            </a:graphic>
+          </wp:inline>
+        </w:drawing>
+      </w:r>
+    </w:p>
+    <w:p>
+      <w:pPr>
+        <w:pBdr>
+          <w:left w:val="single" w:color="F39200" w:sz="18" w:space="12"/>
+        </w:pBdr>
+        <w:spacing w:before="60" w:after="140" w:line="300"/>
+        <w:ind w:left="360"/>
+      </w:pPr>
+      <w:r>
+        <w:rPr>
+          <w:i/>
+          <w:iCs/>
+          <w:color w:val="22292E"/>
+        </w:rPr>
+        <w:t xml:space="preserve">Tirem os dormentes dos trilhos: cada trilho vira uma linha do tempo, e cada bolinha é uma versão rubricada, um commit. Em B, alguém tira uma cópia para redigir uma cláusula; F1 e F2 são as versões dessa cópia; em M, a cópia é incorporada à minuta. Isso é o merge.</w:t>
+      </w:r>
+    </w:p>
+    <w:p>
+      <w:pPr>
+        <w:spacing w:after="120" w:line="300"/>
+      </w:pPr>
+      <w:r>
+        <w:rPr>
+          <w:b/>
+          <w:bCs/>
+        </w:rPr>
+        <w:t xml:space="preserve">Slide 19 — A mesma malha, no contrato.</w:t>
+      </w:r>
+      <w:r>
+        <w:t xml:space="preserve"> O mesmo desenho da malha dos trens, agora com as versões. O vagão virou cláusula: a feature é uma área redigindo uma cláusula; a release é a versão para assinatura, que só aceita correção de redação; o hotfix é o aditivo urgente. As etiquetas laranja na main são os números das versões que foram para produção, as tags; voltam no bloco 4.</w:t>
+      </w:r>
+    </w:p>
+    <w:p>
+      <w:pPr>
+        <w:pStyle w:val="Heading2"/>
+      </w:pPr>
+      <w:r>
+        <w:t xml:space="preserve">Bloco 3 — Os tipos de merge — 30 min (slides 20 a 28)</w:t>
+      </w:r>
+    </w:p>
+    <w:p>
+      <w:pPr>
+        <w:spacing w:after="120" w:line="300"/>
+      </w:pPr>
+      <w:r>
+        <w:rPr>
+          <w:b/>
+          <w:bCs/>
+        </w:rPr>
+        <w:t xml:space="preserve">Objetivo: </w:t>
+      </w:r>
+      <w:r>
+        <w:t xml:space="preserve">mostrar que há quatro jeitos de incorporar uma cópia, que todos levam o mesmo conteúdo e que a diferença é a história que fica registrada.</w:t>
+      </w:r>
+    </w:p>
+    <w:p>
+      <w:pPr>
+        <w:spacing w:after="120" w:line="300"/>
+      </w:pPr>
+      <w:r>
+        <w:rPr>
+          <w:b/>
+          <w:bCs/>
+        </w:rPr>
+        <w:t xml:space="preserve">Slide 21 — Antes de juntar: a minuta andou?</w:t>
+      </w:r>
+      <w:r>
+        <w:t xml:space="preserve"> É a pergunta que decide tudo. Se ninguém mexeu na minuta desde que a cópia saiu, juntar é trivial. Se mexeu, há três escolhas. Os quatro slides seguintes usam sempre o mesmo desenho: a develop com A, B e C; a cópia da cláusula de multa com F1 e F2.</w:t>
+      </w:r>
+    </w:p>
+    <w:p>
+      <w:pPr>
+        <w:spacing w:before="80" w:after="160"/>
+        <w:jc w:val="center"/>
+      </w:pPr>
+      <w:r>
+        <w:drawing>
+          <wp:inline distT="0" distB="0" distL="0" distR="0">
+            <wp:extent cx="2857500" cy="1123950"/>
+            <wp:effectExtent t="0" r="0" b="0" l="0"/>
+            <wp:docPr id="1" name="" descr="" title=""/>
+            <wp:cNvGraphicFramePr>
+              <a:graphicFrameLocks xmlns:a="http://schemas.openxmlformats.org/drawingml/2006/main" noChangeAspect="1"/>
+            </wp:cNvGraphicFramePr>
+            <a:graphic xmlns:a="http://schemas.openxmlformats.org/drawingml/2006/main">
+              <a:graphicData uri="http://schemas.openxmlformats.org/drawingml/2006/picture">
+                <pic:pic xmlns:pic="http://schemas.openxmlformats.org/drawingml/2006/picture">
+                  <pic:nvPicPr>
+                    <pic:cNvPr id="0" name="" descr=""/>
+                    <pic:cNvPicPr>
+                      <a:picLocks noChangeAspect="1" noChangeArrowheads="1"/>
+                    </pic:cNvPicPr>
+                  </pic:nvPicPr>
+                  <pic:blipFill>
+                    <a:blip r:embed="rId13" cstate="none"/>
+                    <a:srcRect/>
+                    <a:stretch>
+                      <a:fillRect/>
+                    </a:stretch>
+                  </pic:blipFill>
+                  <pic:spPr bwMode="auto">
+                    <a:xfrm>
+                      <a:off x="0" y="0"/>
+                      <a:ext cx="2857500" cy="1123950"/>
+                    </a:xfrm>
+                    <a:prstGeom prst="rect">
+                      <a:avLst/>
+                    </a:prstGeom>
+                  </pic:spPr>
+                </pic:pic>
+              </a:graphicData>
+            </a:graphic>
+          </wp:inline>
+        </w:drawing>
+      </w:r>
+    </w:p>
+    <w:p>
+      <w:pPr>
+        <w:spacing w:after="120" w:line="300"/>
+      </w:pPr>
+      <w:r>
+        <w:rPr>
+          <w:b/>
+          <w:bCs/>
+        </w:rPr>
+        <w:t xml:space="preserve">Slide 22 — Fast-forward.</w:t>
+      </w:r>
+      <w:r>
+        <w:t xml:space="preserve"> O marcador da develop só pula para a frente, até F2: não há junção, porque não há o que juntar. O histórico fica reto e perde o desenho da cópia. No GitFlow original, as junções evitam o fast-forward justamente para que a cópia continue visível.</w:t>
+      </w:r>
+    </w:p>
+    <w:p>
+      <w:pPr>
+        <w:pBdr>
+          <w:left w:val="single" w:color="F39200" w:sz="18" w:space="12"/>
+        </w:pBdr>
+        <w:spacing w:before="60" w:after="140" w:line="300"/>
+        <w:ind w:left="360"/>
+      </w:pPr>
+      <w:r>
+        <w:rPr>
+          <w:i/>
+          <w:iCs/>
+          <w:color w:val="22292E"/>
+        </w:rPr>
+        <w:t xml:space="preserve">Ninguém mexeu na minuta desde que você tirou a sua cópia. Então a sua cópia passa a ser a minuta.</w:t>
+      </w:r>
+    </w:p>
+    <w:p>
+      <w:pPr>
+        <w:spacing w:after="120" w:line="300"/>
+      </w:pPr>
+      <w:r>
+        <w:rPr>
+          <w:b/>
+          <w:bCs/>
+        </w:rPr>
+        <w:t xml:space="preserve">Slide 23 — Merge commit.</w:t>
+      </w:r>
+      <w:r>
+        <w:t xml:space="preserve"> A junção vira uma versão própria, M. Nada é reescrito; o histórico guarda quando a cópia saiu e quando voltou. É o jeito do GitFlow original, em todas as junções.</w:t>
+      </w:r>
+    </w:p>
+    <w:p>
+      <w:pPr>
+        <w:pBdr>
+          <w:left w:val="single" w:color="F39200" w:sz="18" w:space="12"/>
+        </w:pBdr>
+        <w:spacing w:before="60" w:after="140" w:line="300"/>
+        <w:ind w:left="360"/>
+      </w:pPr>
+      <w:r>
+        <w:rPr>
+          <w:i/>
+          <w:iCs/>
+          <w:color w:val="22292E"/>
+        </w:rPr>
+        <w:t xml:space="preserve">A cláusula entra com todas as versões, e alguém anota "incorporada em 12/10, aprovada por fulano".</w:t>
+      </w:r>
+    </w:p>
+    <w:p>
+      <w:pPr>
+        <w:spacing w:after="120" w:line="300"/>
+      </w:pPr>
+      <w:r>
+        <w:rPr>
+          <w:b/>
+          <w:bCs/>
+        </w:rPr>
+        <w:t xml:space="preserve">Slide 24 — Squash.</w:t>
+      </w:r>
+      <w:r>
+        <w:t xml:space="preserve"> Espremer: as versões da cópia viram uma só. Útil quando a cópia tem muitas versões pequenas ("ajuste", "ajuste 2", "agora vai"). Perde o passo a passo, e a cópia deve ser apagada depois: ela não serve mais para continuar o trabalho. Curiosidade: por isso a Diretriz 4 não mede a divergência só pelo número de commits, que o squash reduz sem reduzir a divergência real.</w:t>
+      </w:r>
+    </w:p>
+    <w:p>
+      <w:pPr>
+        <w:pBdr>
+          <w:left w:val="single" w:color="F39200" w:sz="18" w:space="12"/>
+        </w:pBdr>
+        <w:spacing w:before="60" w:after="140" w:line="300"/>
+        <w:ind w:left="360"/>
+      </w:pPr>
+      <w:r>
+        <w:rPr>
+          <w:i/>
+          <w:iCs/>
+          <w:color w:val="22292E"/>
+        </w:rPr>
+        <w:t xml:space="preserve">Passar a limpo: entra o texto final da cláusula, sem os rascunhos.</w:t>
+      </w:r>
+    </w:p>
+    <w:p>
+      <w:pPr>
+        <w:spacing w:after="120" w:line="300"/>
+      </w:pPr>
+      <w:r>
+        <w:rPr>
+          <w:b/>
+          <w:bCs/>
+        </w:rPr>
+        <w:t xml:space="preserve">Slide 25 — Rebase.</w:t>
+      </w:r>
+      <w:r>
+        <w:t xml:space="preserve"> Mudar a base: a cópia, que saía de B, passa a sair de C. As versões são refeitas e ganham o apóstrofo (F1′, F2′): mesmo conteúdo, outra identidade e outra data. Depois do rebase, a junção vira um fast-forward.</w:t>
+      </w:r>
+    </w:p>
+    <w:p>
+      <w:pPr>
+        <w:pBdr>
+          <w:left w:val="single" w:color="F39200" w:sz="18" w:space="12"/>
+        </w:pBdr>
+        <w:spacing w:before="60" w:after="140" w:line="300"/>
+        <w:ind w:left="360"/>
+      </w:pPr>
+      <w:r>
+        <w:rPr>
+          <w:i/>
+          <w:iCs/>
+          <w:color w:val="22292E"/>
+        </w:rPr>
+        <w:t xml:space="preserve">Antes de pedir o visto, você refaz a sua cópia em cima da minuta mais recente. Só que ninguém faz isso numa cópia que outras pessoas estão lendo: seria trocar as páginas debaixo do nariz delas.</w:t>
+      </w:r>
+    </w:p>
+    <w:p>
+      <w:pPr>
+        <w:spacing w:after="120" w:line="300"/>
+      </w:pPr>
+      <w:r>
+        <w:rPr>
+          <w:b/>
+          <w:bCs/>
+        </w:rPr>
+        <w:t xml:space="preserve">Slide 26 — Lado a lado.</w:t>
+      </w:r>
+      <w:r>
+        <w:t xml:space="preserve"> Resumo para fotografar. Insista na frase de baixo: nenhum tipo de merge perde a mudança em si.</w:t>
+      </w:r>
+    </w:p>
+    <w:p>
+      <w:pPr>
+        <w:spacing w:after="120" w:line="300"/>
+      </w:pPr>
+      <w:r>
+        <w:rPr>
+          <w:b/>
+          <w:bCs/>
+        </w:rPr>
+        <w:t xml:space="preserve">Slide 27 — Os botões.</w:t>
+      </w:r>
+      <w:r>
+        <w:t xml:space="preserve"> As plataformas do Modelo VIC são o GitHub e o Azure DevOps, e os botões aparecem na conclusão do pull request. O fast-forward puro não tem botão próprio: acontece quando a minuta não andou ou depois de um rebase. O semi-linear, do Azure DevOps, faz o rebase e ainda cria a versão de junção. Quem escolhe o tipo é a política do repositório; na dúvida, o Integrador (Diretriz 6).</w:t>
+      </w:r>
+    </w:p>
+    <w:p>
+      <w:pPr>
+        <w:spacing w:after="120" w:line="300"/>
+      </w:pPr>
+      <w:r>
+        <w:rPr>
+          <w:b/>
+          <w:bCs/>
+        </w:rPr>
+        <w:t xml:space="preserve">Slide 28 — Conflito.</w:t>
+      </w:r>
+      <w:r>
+        <w:t xml:space="preserve"> Não é erro de ninguém: é o Git avisando que duas mudanças disputam o mesmo trecho e que ele não vai adivinhar qual vale. Pode acontecer em qualquer tipo de merge.</w:t>
+      </w:r>
+    </w:p>
+    <w:p>
+      <w:pPr>
+        <w:pBdr>
+          <w:left w:val="single" w:color="F39200" w:sz="18" w:space="12"/>
+        </w:pBdr>
+        <w:spacing w:before="60" w:after="140" w:line="300"/>
+        <w:ind w:left="360"/>
+      </w:pPr>
+      <w:r>
+        <w:rPr>
+          <w:i/>
+          <w:iCs/>
+          <w:color w:val="22292E"/>
+        </w:rPr>
+        <w:t xml:space="preserve">O jurídico pôs a multa em 2%; o comercial, em 1%. Quem decide? Não é o Git, e muitas vezes não é o time técnico: é o negócio. Quando o conflito é de regra, o time vai precisar de vocês.</w:t>
+      </w:r>
+    </w:p>
+    <w:p>
+      <w:pPr>
+        <w:pStyle w:val="Heading2"/>
+      </w:pPr>
+      <w:r>
+        <w:t xml:space="preserve">Dinâmica 2 — 15 min (slides 29 e 30)</w:t>
+      </w:r>
+    </w:p>
+    <w:p>
+      <w:pPr>
+        <w:spacing w:after="120" w:line="300"/>
+      </w:pPr>
+      <w:r>
+        <w:t xml:space="preserve">Conduza conforme a seção 5.</w:t>
+      </w:r>
+    </w:p>
+    <w:p>
+      <w:pPr>
+        <w:pStyle w:val="Heading2"/>
+      </w:pPr>
+      <w:r>
+        <w:t xml:space="preserve">Bloco 4 — Versões e as regras do Modelo VIC — 15 min (slides 31 a 36)</w:t>
+      </w:r>
+    </w:p>
+    <w:p>
+      <w:pPr>
+        <w:spacing w:after="120" w:line="300"/>
+      </w:pPr>
+      <w:r>
+        <w:rPr>
+          <w:b/>
+          <w:bCs/>
+        </w:rPr>
+        <w:t xml:space="preserve">Objetivo: </w:t>
+      </w:r>
+      <w:r>
+        <w:t xml:space="preserve">ligar o fluxo às regras do Modelo VIC. São seis slides em 15 minutos: não se demore em nenhum.</w:t>
+      </w:r>
+    </w:p>
+    <w:p>
+      <w:pPr>
+        <w:spacing w:after="120" w:line="300"/>
+      </w:pPr>
+      <w:r>
+        <w:rPr>
+          <w:b/>
+          <w:bCs/>
+        </w:rPr>
+        <w:t xml:space="preserve">Slide 32 — Nada entra sem visto.</w:t>
+      </w:r>
+      <w:r>
+        <w:t xml:space="preserve"> Mudança direta na main e na develop é bloqueada (Diretriz 7). Toda mudança chega por pull request, o pedido de visto, em dois momentos (Diretriz 8): a aprovação, pelos revisores do time, e a completude, pelo Integrador, que efetiva o merge. É na completude que se escolhe o tipo de merge. O PR fica guardado como evidência para auditoria. É o "quem libera a passagem" do regulamento da ferrovia.</w:t>
+      </w:r>
+    </w:p>
+    <w:p>
+      <w:pPr>
+        <w:spacing w:after="120" w:line="300"/>
+      </w:pPr>
+      <w:r>
+        <w:rPr>
+          <w:b/>
+          <w:bCs/>
+        </w:rPr>
+        <w:t xml:space="preserve">Slide 33 — Merge back.</w:t>
+      </w:r>
+      <w:r>
+        <w:t xml:space="preserve"> Toda release e todo hotfix que entram na main voltam para a develop, ao fim de cada ciclo (Diretriz 5). É a regra de ouro da parte 1, agora com nome.</w:t>
+      </w:r>
+    </w:p>
+    <w:p>
+      <w:pPr>
+        <w:pBdr>
+          <w:left w:val="single" w:color="F39200" w:sz="18" w:space="12"/>
+        </w:pBdr>
+        <w:spacing w:before="60" w:after="140" w:line="300"/>
+        <w:ind w:left="360"/>
+      </w:pPr>
+      <w:r>
+        <w:rPr>
+          <w:i/>
+          <w:iCs/>
+          <w:color w:val="22292E"/>
+        </w:rPr>
+        <w:t xml:space="preserve">Se a correção feita na versão para assinatura não volta para a minuta, a próxima versão, que é redigida a partir da minuta, sai com o erro de novo. É o aditivo que ninguém passou para a minuta, ou o vagão consertado que não voltou para o pátio.</w:t>
+      </w:r>
+    </w:p>
+    <w:p>
+      <w:pPr>
+        <w:spacing w:after="120" w:line="300"/>
+      </w:pPr>
+      <w:r>
+        <w:rPr>
+          <w:b/>
+          <w:bCs/>
+        </w:rPr>
+        <w:t xml:space="preserve">Slide 34 — O número da versão.</w:t>
+      </w:r>
+      <w:r>
+        <w:t xml:space="preserve"> MAJOR muda o que já valia; MINOR traz novidade sem mudar o que existia; PATCH corrige. As três partes são o SemVer (Diretriz 9). A quarta, o BUILD, identifica a montagem, e só versão com os quatro números vai para produção: é o Padrão VEC (Diretriz 10). Cada versão publicada tem a sua nota de versão, com o que foi adicionado, alterado e corrigido (Diretriz 13).</w:t>
+      </w:r>
+    </w:p>
+    <w:p>
+      <w:pPr>
+        <w:spacing w:after="120" w:line="300"/>
+      </w:pPr>
+      <w:r>
+        <w:rPr>
+          <w:b/>
+          <w:bCs/>
+        </w:rPr>
+        <w:t xml:space="preserve">Slide 35 — Cópia curta, junção frequente.</w:t>
+      </w:r>
+      <w:r>
+        <w:t xml:space="preserve"> Quanto mais tempo uma área fica com a sua cópia sem olhar a minuta, mais difícil é juntar depois. O Modelo VIC mede isso, a divergência, e fixa limites por faixa de maturidade; os números do slide são os da faixa 3, a meta institucional (Diretriz 4).</w:t>
+      </w:r>
+    </w:p>
+    <w:p>
+      <w:pPr>
+        <w:spacing w:after="120" w:line="300"/>
+      </w:pPr>
+      <w:r>
+        <w:rPr>
+          <w:b/>
+          <w:bCs/>
+        </w:rPr>
+        <w:t xml:space="preserve">Slide 36 — O que você viu hoje.</w:t>
+      </w:r>
+      <w:r>
+        <w:t xml:space="preserve"> Não leia a tabela inteira: escolha duas linhas. As Diretrizes 1 e 12 ficam de fora porque tratam de testes e do conteúdo dos arquivos, não do fluxo.</w:t>
+      </w:r>
+    </w:p>
+    <w:p>
+      <w:pPr>
+        <w:pStyle w:val="Heading2"/>
+      </w:pPr>
+      <w:r>
+        <w:t xml:space="preserve">Dinâmica 3 — 25 min (slide 37)</w:t>
+      </w:r>
+    </w:p>
+    <w:p>
+      <w:pPr>
+        <w:spacing w:after="120" w:line="300"/>
+      </w:pPr>
+      <w:r>
+        <w:t xml:space="preserve">Conduza conforme a seção 5.</w:t>
+      </w:r>
+    </w:p>
+    <w:p>
+      <w:pPr>
+        <w:pStyle w:val="Heading2"/>
+      </w:pPr>
+      <w:r>
+        <w:t xml:space="preserve">Fechamento — 10 min (slides 38 a 41)</w:t>
+      </w:r>
+    </w:p>
+    <w:p>
+      <w:pPr>
+        <w:spacing w:after="120" w:line="300"/>
+      </w:pPr>
+      <w:r>
+        <w:rPr>
+          <w:b/>
+          <w:bCs/>
+        </w:rPr>
+        <w:t xml:space="preserve">Slide 38 — Voltando à enquete.</w:t>
+      </w:r>
+      <w:r>
+        <w:t xml:space="preserve"> A resposta é C: o desvio é a branch, e o engate é o merge. A é parar o sistema: os clientes ficam sem atendimento. B é mexer direto em produção: o passageiro sente cada martelada, e é o que a proteção da main proíbe. D é refazer tudo a cada mudança: caro, e não resolve. Repita a enquete e mostre a diferença em relação ao começo.</w:t>
+      </w:r>
+    </w:p>
+    <w:p>
+      <w:pPr>
+        <w:spacing w:after="120" w:line="300"/>
+      </w:pPr>
+      <w:r>
+        <w:rPr>
+          <w:b/>
+          <w:bCs/>
+        </w:rPr>
+        <w:t xml:space="preserve">Slide 39 — Perguntas que você já pode fazer ao time.</w:t>
+      </w:r>
+      <w:r>
+        <w:t xml:space="preserve"> É o ganho prático da oficina. Peça que cada pessoa escolha a pergunta que vai fazer na próxima reunião.</w:t>
+      </w:r>
+    </w:p>
+    <w:p>
+      <w:pPr>
+        <w:spacing w:after="120" w:line="300"/>
+      </w:pPr>
+      <w:r>
+        <w:rPr>
+          <w:b/>
+          <w:bCs/>
+        </w:rPr>
+        <w:t xml:space="preserve">Slide 40 — Para levar.</w:t>
+      </w:r>
+      <w:r>
+        <w:t xml:space="preserve"> Três frases, a primeira da parte 1 e as outras duas da parte 2: cada trabalho no seu trilho; juntar é escolher a história; tudo o que chega à main volta para a develop. Envie a cartilha de bolso no chat.</w:t>
+      </w:r>
+    </w:p>
+    <w:p>
+      <w:pPr>
+        <w:spacing w:after="120" w:line="300"/>
+      </w:pPr>
+      <w:r>
+        <w:rPr>
+          <w:b/>
+          <w:bCs/>
+        </w:rPr>
+        <w:t xml:space="preserve">Slide 41 — "Cada trabalho no seu trilho."</w:t>
+      </w:r>
+      <w:r>
+        <w:t xml:space="preserve"> Agradeça e abra para dúvidas.</w:t>
+      </w:r>
+    </w:p>
+    <w:p>
+      <w:pPr>
+        <w:pStyle w:val="Heading1"/>
+        <w:pageBreakBefore/>
+      </w:pPr>
+      <w:r>
+        <w:t xml:space="preserve">5. As dinâmicas</w:t>
+      </w:r>
+    </w:p>
+    <w:p>
+      <w:pPr>
+        <w:pStyle w:val="Heading2"/>
+      </w:pPr>
+      <w:r>
+        <w:t xml:space="preserve">Dinâmica 1 — Qual trilho? (20 min)</w:t>
+      </w:r>
+    </w:p>
+    <w:p>
+      <w:pPr>
+        <w:spacing w:after="120" w:line="300"/>
+      </w:pPr>
+      <w:r>
+        <w:rPr>
+          <w:b/>
+          <w:bCs/>
+        </w:rPr>
+        <w:t xml:space="preserve">Objetivo: </w:t>
+      </w:r>
+      <w:r>
+        <w:t xml:space="preserve">associar situações do dia a dia de um sistema ao trilho certo, com a origem e o destino.</w:t>
+      </w:r>
+    </w:p>
+    <w:p>
+      <w:pPr>
+        <w:pStyle w:val="ListParagraph"/>
+        <w:numPr>
+          <w:ilvl w:val="0"/>
+          <w:numId w:val="7"/>
+        </w:numPr>
+        <w:spacing w:after="80" w:line="290"/>
+      </w:pPr>
+      <w:r>
+        <w:t xml:space="preserve">Faça a primeira carta com a turma, no slide 13: "Desde ontem, o app em produção cobra a tarifa em dobro" é um vagão com defeito no trem comercial: hotfix/*, sai da main e volta para a main e para a develop.</w:t>
+      </w:r>
+    </w:p>
+    <w:p>
+      <w:pPr>
+        <w:pStyle w:val="ListParagraph"/>
+        <w:numPr>
+          <w:ilvl w:val="0"/>
+          <w:numId w:val="7"/>
+        </w:numPr>
+        <w:spacing w:after="80" w:line="290"/>
+      </w:pPr>
+      <w:r>
+        <w:t xml:space="preserve">Abra as salas por 12 minutos. Cada grupo arrasta as 12 cartas para as cinco raias (ou para o canto "Não pode!") e cola em cada uma a etiqueta "sai de / vai para".</w:t>
+      </w:r>
+    </w:p>
+    <w:p>
+      <w:pPr>
+        <w:pStyle w:val="ListParagraph"/>
+        <w:numPr>
+          <w:ilvl w:val="0"/>
+          <w:numId w:val="7"/>
+        </w:numPr>
+        <w:spacing w:after="80" w:line="290"/>
+      </w:pPr>
+      <w:r>
+        <w:t xml:space="preserve">Visite as salas. Se um grupo travar, pergunte: "isso já está no trem com passageiros? É um vagão novo ou um conserto? Dá para esperar a próxima composição?".</w:t>
+      </w:r>
+    </w:p>
+    <w:p>
+      <w:pPr>
+        <w:pStyle w:val="ListParagraph"/>
+        <w:numPr>
+          <w:ilvl w:val="0"/>
+          <w:numId w:val="7"/>
+        </w:numPr>
+        <w:spacing w:after="80" w:line="290"/>
+      </w:pPr>
+      <w:r>
+        <w:t xml:space="preserve">Na volta (8 min), peça a cada grupo a carta de que teve mais dúvida.</w:t>
+      </w:r>
+    </w:p>
+    <w:p>
+      <w:pPr>
+        <w:spacing w:after="120" w:line="300"/>
+      </w:pPr>
+      <w:r>
+        <w:rPr>
+          <w:b/>
+          <w:bCs/>
+        </w:rPr>
+        <w:t xml:space="preserve">Perguntas para a volta:</w:t>
+      </w:r>
+    </w:p>
+    <w:p>
+      <w:pPr>
+        <w:pStyle w:val="ListParagraph"/>
+        <w:numPr>
+          <w:ilvl w:val="0"/>
+          <w:numId w:val="3"/>
+        </w:numPr>
+        <w:spacing w:after="80" w:line="290"/>
+      </w:pPr>
+      <w:r>
+        <w:t xml:space="preserve">"Na homologação da 2.4, um texto da tela está errado": por que não abre uma feature? (A vistoria já começou: o conserto é feito na própria release.)</w:t>
+      </w:r>
+    </w:p>
+    <w:p>
+      <w:pPr>
+        <w:pStyle w:val="ListParagraph"/>
+        <w:numPr>
+          <w:ilvl w:val="0"/>
+          <w:numId w:val="3"/>
+        </w:numPr>
+        <w:spacing w:after="80" w:line="290"/>
+      </w:pPr>
+      <w:r>
+        <w:t xml:space="preserve">"A correção urgente de ontem também precisa estar na próxima versão": que trilho é esse? (Nenhum novo: é a volta do hotfix para o pátio, a develop.)</w:t>
+      </w:r>
+    </w:p>
+    <w:p>
+      <w:pPr>
+        <w:pStyle w:val="ListParagraph"/>
+        <w:numPr>
+          <w:ilvl w:val="0"/>
+          <w:numId w:val="3"/>
+        </w:numPr>
+        <w:spacing w:after="80" w:line="290"/>
+      </w:pPr>
+      <w:r>
+        <w:t xml:space="preserve">"Alterar direto a versão em produção, porque é rapidinho": por que não pode? (A main é protegida: ninguém mexe no trem comercial sem autorização.)</w:t>
+      </w:r>
+    </w:p>
+    <w:p>
+      <w:pPr>
+        <w:spacing w:after="120" w:line="300"/>
+      </w:pPr>
+      <w:r>
+        <w:rPr>
+          <w:b/>
+          <w:bCs/>
+        </w:rPr>
+        <w:t xml:space="preserve">Gabarito: </w:t>
+      </w:r>
+      <w:r>
+        <w:t xml:space="preserve">no material das dinâmicas.</w:t>
+      </w:r>
+    </w:p>
+    <w:p>
+      <w:pPr>
+        <w:pStyle w:val="Heading2"/>
+      </w:pPr>
+      <w:r>
+        <w:t xml:space="preserve">Dinâmica 2 — Qual foi o merge? (15 min)</w:t>
+      </w:r>
+    </w:p>
+    <w:p>
+      <w:pPr>
+        <w:spacing w:after="120" w:line="300"/>
+      </w:pPr>
+      <w:r>
+        <w:rPr>
+          <w:b/>
+          <w:bCs/>
+        </w:rPr>
+        <w:t xml:space="preserve">Objetivo: </w:t>
+      </w:r>
+      <w:r>
+        <w:t xml:space="preserve">reconhecer os quatro tipos de merge pelo desenho e pela intenção.</w:t>
+      </w:r>
+    </w:p>
+    <w:p>
+      <w:pPr>
+        <w:pStyle w:val="ListParagraph"/>
+        <w:numPr>
+          <w:ilvl w:val="0"/>
+          <w:numId w:val="8"/>
+        </w:numPr>
+        <w:spacing w:after="80" w:line="290"/>
+      </w:pPr>
+      <w:r>
+        <w:t xml:space="preserve">Slide 29, rodadas 1 a 4: uma rodada por vez, com a enquete das quatro opções e 30 segundos para votar. Mostre o resultado e comente em 30 segundos.</w:t>
+      </w:r>
+    </w:p>
+    <w:p>
+      <w:pPr>
+        <w:pStyle w:val="ListParagraph"/>
+        <w:numPr>
+          <w:ilvl w:val="0"/>
+          <w:numId w:val="8"/>
+        </w:numPr>
+        <w:spacing w:after="80" w:line="290"/>
+      </w:pPr>
+      <w:r>
+        <w:t xml:space="preserve">Slide 30, rodadas 5 a 8: a mesma enquete, agora com situações em texto: "qual você escolheria?".</w:t>
+      </w:r>
+    </w:p>
+    <w:p>
+      <w:pPr>
+        <w:spacing w:after="120" w:line="300"/>
+      </w:pPr>
+      <w:r>
+        <w:rPr>
+          <w:b/>
+          <w:bCs/>
+        </w:rPr>
+        <w:t xml:space="preserve">Respostas: </w:t>
+      </w:r>
+      <w:r>
+        <w:t xml:space="preserve">1 squash; 2 fast-forward; 3 rebase; 4 merge commit; 5 merge commit; 6 squash; 7 rebase; 8 fast-forward.</w:t>
+      </w:r>
+    </w:p>
+    <w:p>
+      <w:pPr>
+        <w:spacing w:after="120" w:line="300"/>
+      </w:pPr>
+      <w:r>
+        <w:rPr>
+          <w:b/>
+          <w:bCs/>
+        </w:rPr>
+        <w:t xml:space="preserve">O que observar: </w:t>
+      </w:r>
+      <w:r>
+        <w:t xml:space="preserve">a rodada 2 é a pegadinha: o desenho não tem C, porque partiu do "antes" em que a minuta não andou. Na rodada 7, quem responder merge commit (trazer a develop para dentro da cópia) também resolve, e é a resposta certa quando a cópia é compartilhada com outras pessoas; reforce que o rebase é só para a própria cópia.</w:t>
+      </w:r>
+    </w:p>
+    <w:p>
+      <w:pPr>
+        <w:pStyle w:val="Heading2"/>
+      </w:pPr>
+      <w:r>
+        <w:t xml:space="preserve">Dinâmica 3 — A vida de uma versão (25 min)</w:t>
+      </w:r>
+    </w:p>
+    <w:p>
+      <w:pPr>
+        <w:spacing w:after="120" w:line="300"/>
+      </w:pPr>
+      <w:r>
+        <w:rPr>
+          <w:b/>
+          <w:bCs/>
+        </w:rPr>
+        <w:t xml:space="preserve">Objetivo: </w:t>
+      </w:r>
+      <w:r>
+        <w:t xml:space="preserve">montar, em grupo, as linhas do tempo de um sistema a partir de uma história, com release, hotfix e merge back.</w:t>
+      </w:r>
+    </w:p>
+    <w:p>
+      <w:pPr>
+        <w:spacing w:after="120" w:line="300"/>
+      </w:pPr>
+      <w:r>
+        <w:rPr>
+          <w:b/>
+          <w:bCs/>
+        </w:rPr>
+        <w:t xml:space="preserve">Caso: </w:t>
+      </w:r>
+      <w:r>
+        <w:t xml:space="preserve">o Contratos Online é um sistema fictício; em produção está a versão v2.3.0.97. Os oito eventos estão no slide 37 e no frame de cada grupo.</w:t>
+      </w:r>
+    </w:p>
+    <w:p>
+      <w:pPr>
+        <w:pStyle w:val="ListParagraph"/>
+        <w:numPr>
+          <w:ilvl w:val="0"/>
+          <w:numId w:val="9"/>
+        </w:numPr>
+        <w:spacing w:after="80" w:line="290"/>
+      </w:pPr>
+      <w:r>
+        <w:t xml:space="preserve">Explique a tarefa: desenhar as linhas do tempo, na ordem dos eventos, numerando cada versão com o número do evento.</w:t>
+      </w:r>
+    </w:p>
+    <w:p>
+      <w:pPr>
+        <w:pStyle w:val="ListParagraph"/>
+        <w:numPr>
+          <w:ilvl w:val="0"/>
+          <w:numId w:val="9"/>
+        </w:numPr>
+        <w:spacing w:after="80" w:line="290"/>
+      </w:pPr>
+      <w:r>
+        <w:t xml:space="preserve">Salas por 15 minutos.</w:t>
+      </w:r>
+    </w:p>
+    <w:p>
+      <w:pPr>
+        <w:pStyle w:val="ListParagraph"/>
+        <w:numPr>
+          <w:ilvl w:val="0"/>
+          <w:numId w:val="9"/>
+        </w:numPr>
+        <w:spacing w:after="80" w:line="290"/>
+      </w:pPr>
+      <w:r>
+        <w:t xml:space="preserve">Na volta (10 min), um grupo mostra o desenho e os outros comparam. Depois, mostre o gabarito.</w:t>
+      </w:r>
+    </w:p>
+    <w:p>
+      <w:pPr>
+        <w:spacing w:before="80" w:after="160"/>
+        <w:jc w:val="center"/>
+      </w:pPr>
+      <w:r>
+        <w:drawing>
+          <wp:inline distT="0" distB="0" distL="0" distR="0">
+            <wp:extent cx="4476750" cy="2305050"/>
+            <wp:effectExtent t="0" r="0" b="0" l="0"/>
+            <wp:docPr id="1" name="" descr="" title=""/>
+            <wp:cNvGraphicFramePr>
+              <a:graphicFrameLocks xmlns:a="http://schemas.openxmlformats.org/drawingml/2006/main" noChangeAspect="1"/>
+            </wp:cNvGraphicFramePr>
+            <a:graphic xmlns:a="http://schemas.openxmlformats.org/drawingml/2006/main">
+              <a:graphicData uri="http://schemas.openxmlformats.org/drawingml/2006/picture">
+                <pic:pic xmlns:pic="http://schemas.openxmlformats.org/drawingml/2006/picture">
+                  <pic:nvPicPr>
+                    <pic:cNvPr id="0" name="" descr=""/>
+                    <pic:cNvPicPr>
+                      <a:picLocks noChangeAspect="1" noChangeArrowheads="1"/>
+                    </pic:cNvPicPr>
+                  </pic:nvPicPr>
+                  <pic:blipFill>
+                    <a:blip r:embed="rId14" cstate="none"/>
+                    <a:srcRect/>
+                    <a:stretch>
+                      <a:fillRect/>
+                    </a:stretch>
+                  </pic:blipFill>
+                  <pic:spPr bwMode="auto">
+                    <a:xfrm>
+                      <a:off x="0" y="0"/>
                       <a:ext cx="4476750" cy="2305050"/>
                     </a:xfrm>
                     <a:prstGeom prst="rect">
@@ -4929,7 +5584,7 @@
         <w:spacing w:after="80" w:line="290"/>
       </w:pPr>
       <w:r>
-        <w:t xml:space="preserve">Trilhos temporários: feature/assinatura, feature/alerta, release/2.4.0 e hotfix/2.4.1.</w:t>
+        <w:t xml:space="preserve">Branches temporárias: feature/assinatura, feature/alerta, release/2.4.0 e hotfix/2.4.1.</w:t>
       </w:r>
     </w:p>
     <w:p>
@@ -4942,7 +5597,7 @@
         <w:spacing w:after="80" w:line="290"/>
       </w:pPr>
       <w:r>
-        <w:t xml:space="preserve">Placas na main: v2.4.0.118 (evento 6) e v2.4.1.121 (evento 7).</w:t>
+        <w:t xml:space="preserve">Números de versão na main: v2.4.0.118 (evento 6) e v2.4.1.121 (evento 7).</w:t>
       </w:r>
     </w:p>
     <w:p>
@@ -4981,7 +5636,7 @@
         <w:spacing w:after="80" w:line="290"/>
       </w:pPr>
       <w:r>
-        <w:t xml:space="preserve">Tipo de merge no evento 3: resposta aberta. No GitFlow original, merge commit, para o desvio ficar visível; squash, se o desvio tiver muitas paradas pequenas. Quem decide é a política do repositório.</w:t>
+        <w:t xml:space="preserve">Tipo de merge no evento 3: resposta aberta. No GitFlow original, merge commit, para a cópia ficar visível; squash, se a cópia tiver muitas versões pequenas. Quem decide é a política do repositório.</w:t>
       </w:r>
     </w:p>
     <w:p>
@@ -5019,7 +5674,7 @@
         <w:spacing w:after="80" w:line="290"/>
       </w:pPr>
       <w:r>
-        <w:t xml:space="preserve">O alerta de vencimento entrando na release/2.4.0: a vistoria já tinha começado; o alerta espera a próxima.</w:t>
+        <w:t xml:space="preserve">O alerta de vencimento entrando na release/2.4.0: a versão já estava em homologação; o alerta espera a próxima.</w:t>
       </w:r>
     </w:p>
     <w:p>
@@ -5045,7 +5700,7 @@
         <w:spacing w:after="80" w:line="290"/>
       </w:pPr>
       <w:r>
-        <w:t xml:space="preserve">Placa na develop: placa de versão só na main.</w:t>
+        <w:t xml:space="preserve">Número de versão na develop: o número só vai na main.</w:t>
       </w:r>
     </w:p>
     <w:p>
@@ -5062,6 +5717,22 @@
         <w:pStyle w:val="Heading3"/>
       </w:pPr>
       <w:r>
+        <w:t xml:space="preserve">Por que duas analogias?</w:t>
+      </w:r>
+    </w:p>
+    <w:p>
+      <w:pPr>
+        <w:spacing w:after="120" w:line="300"/>
+      </w:pPr>
+      <w:r>
+        <w:t xml:space="preserve">Porque cada uma explica bem uma parte. O trem mostra por que existem trilhos separados e para onde cada um leva. O contrato mostra o que fica registrado e como as cópias se juntam, coisas que o trem não explica: um trem de verdade não se copia nem guarda a história de cada vagão.</w:t>
+      </w:r>
+    </w:p>
+    <w:p>
+      <w:pPr>
+        <w:pStyle w:val="Heading3"/>
+      </w:pPr>
+      <w:r>
         <w:t xml:space="preserve">O GitFlow é o mesmo que o Git?</w:t>
       </w:r>
     </w:p>
@@ -5110,6 +5781,22 @@
         <w:pStyle w:val="Heading3"/>
       </w:pPr>
       <w:r>
+        <w:t xml:space="preserve">Numa feature só existe um vagão?</w:t>
+      </w:r>
+    </w:p>
+    <w:p>
+      <w:pPr>
+        <w:spacing w:after="120" w:line="300"/>
+      </w:pPr>
+      <w:r>
+        <w:t xml:space="preserve">Na analogia, sim: é a forma de dizer que a feature cuida de uma funcionalidade. No Git, a branch tem uma cópia do sistema inteiro, mas a equipe só mexe na parte dela.</w:t>
+      </w:r>
+    </w:p>
+    <w:p>
+      <w:pPr>
+        <w:pStyle w:val="Heading3"/>
+      </w:pPr>
+      <w:r>
         <w:t xml:space="preserve">Qual é o melhor tipo de merge?</w:t>
       </w:r>
     </w:p>
@@ -5134,7 +5821,7 @@
         <w:spacing w:after="120" w:line="300"/>
       </w:pPr>
       <w:r>
-        <w:t xml:space="preserve">É seguro no próprio desvio, que só você usa. Perigoso é reescrever a história de um trilho que outras pessoas usam; por isso a main e a develop são protegidas.</w:t>
+        <w:t xml:space="preserve">É seguro na própria cópia, que só você usa. Perigoso é reescrever a história de uma linha que outras pessoas usam; por isso a main e a develop são protegidas.</w:t>
       </w:r>
     </w:p>
     <w:p>
@@ -5150,7 +5837,7 @@
         <w:spacing w:after="120" w:line="300"/>
       </w:pPr>
       <w:r>
-        <w:t xml:space="preserve">Não: o conteúdo inteiro entra na develop. Some só o passo a passo do desvio, que fica registrado no pull request.</w:t>
+        <w:t xml:space="preserve">Não: o conteúdo inteiro entra na develop. Some só o passo a passo da cópia, que fica registrado no pull request.</w:t>
       </w:r>
     </w:p>
     <w:p>
@@ -5166,7 +5853,7 @@
         <w:spacing w:after="120" w:line="300"/>
       </w:pPr>
       <w:r>
-        <w:t xml:space="preserve">Porque ela está em vistoria. Se entrar novidade, o que foi testado deixa de ser o que vai para produção. Novidade espera a próxima release.</w:t>
+        <w:t xml:space="preserve">Porque ela está em vistoria. Se entrar vagão novo, o que foi testado deixa de ser o que vai para produção. Novidade espera a próxima release.</w:t>
       </w:r>
     </w:p>
     <w:p>
@@ -5435,7 +6122,7 @@
                 <w:b/>
                 <w:bCs/>
               </w:rPr>
-              <w:t xml:space="preserve">Commit</w:t>
+              <w:t xml:space="preserve">Branch</w:t>
             </w:r>
           </w:p>
         </w:tc>
@@ -5460,7 +6147,7 @@
               <w:spacing w:after="0" w:line="270"/>
             </w:pPr>
             <w:r>
-              <w:t xml:space="preserve">Uma versão registrada: a estação da ferrovia, a rubrica da minuta.</w:t>
+              <w:t xml:space="preserve">Um trilho: uma linha de trabalho separada. No contrato, uma cópia de trabalho.</w:t>
             </w:r>
           </w:p>
         </w:tc>
@@ -5491,7 +6178,7 @@
                 <w:b/>
                 <w:bCs/>
               </w:rPr>
-              <w:t xml:space="preserve">Branch</w:t>
+              <w:t xml:space="preserve">Commit</w:t>
             </w:r>
           </w:p>
         </w:tc>
@@ -5516,7 +6203,7 @@
               <w:spacing w:after="0" w:line="270"/>
             </w:pPr>
             <w:r>
-              <w:t xml:space="preserve">Uma linha de trabalho: o trilho.</w:t>
+              <w:t xml:space="preserve">Uma versão registrada: a versão rubricada da minuta.</w:t>
             </w:r>
           </w:p>
         </w:tc>
@@ -5572,7 +6259,7 @@
               <w:spacing w:after="0" w:line="270"/>
             </w:pPr>
             <w:r>
-              <w:t xml:space="preserve">A junção de uma branch em outra: o entroncamento.</w:t>
+              <w:t xml:space="preserve">A junção de uma branch em outra: o engate do vagão, a cópia incorporada.</w:t>
             </w:r>
           </w:p>
         </w:tc>
@@ -5684,7 +6371,7 @@
               <w:spacing w:after="0" w:line="270"/>
             </w:pPr>
             <w:r>
-              <w:t xml:space="preserve">Merge sem junção: a linha não andou, e o marcador só avança.</w:t>
+              <w:t xml:space="preserve">Merge sem junção: a minuta não andou, e o marcador só avança.</w:t>
             </w:r>
           </w:p>
         </w:tc>
@@ -5740,7 +6427,7 @@
               <w:spacing w:after="0" w:line="270"/>
             </w:pPr>
             <w:r>
-              <w:t xml:space="preserve">Merge com uma estação de junção, que guarda o desvio no histórico.</w:t>
+              <w:t xml:space="preserve">Merge com uma versão de junção, que guarda a cópia no histórico.</w:t>
             </w:r>
           </w:p>
         </w:tc>
@@ -5796,7 +6483,7 @@
               <w:spacing w:after="0" w:line="270"/>
             </w:pPr>
             <w:r>
-              <w:t xml:space="preserve">Merge que junta todas as estações do desvio numa só.</w:t>
+              <w:t xml:space="preserve">Merge que junta todas as versões da cópia numa só.</w:t>
             </w:r>
           </w:p>
         </w:tc>
@@ -5852,7 +6539,7 @@
               <w:spacing w:after="0" w:line="270"/>
             </w:pPr>
             <w:r>
-              <w:t xml:space="preserve">Reassentar o desvio a partir do ponto atual da linha, com estações novas.</w:t>
+              <w:t xml:space="preserve">Refazer a cópia a partir da versão atual da linha, com versões novas.</w:t>
             </w:r>
           </w:p>
         </w:tc>
@@ -6132,7 +6819,7 @@
               <w:spacing w:after="0" w:line="270"/>
             </w:pPr>
             <w:r>
-              <w:t xml:space="preserve">A placa com o número da versão, na estação da main que foi para produção.</w:t>
+              <w:t xml:space="preserve">O número da versão, preso à versão da main que foi para produção.</w:t>
             </w:r>
           </w:p>
         </w:tc>

</xml_diff>

<commit_message>
Show the feature wagon reaching release in the train map
In the full map the release composition lacked the Cartões wagon being
built in the feature branch, and the commercial train already had it.
Now the commercial train has only Pix and Login, the yard keeps an empty
slot for Cartões, and the release carries Cartões, Pix and Login. The
speaker notes and the facilitator script say so.

Co-Authored-By: Claude Opus 5.5 <noreply@anthropic.com>
Claude-Session: https://claude.ai/code/session_017z8RJ8WcvgeWy5Kw7goBXT
</commit_message>
<xml_diff>
--- a/treinamento/oficina-nos-trilhos/2-roteiro-do-facilitador.docx
+++ b/treinamento/oficina-nos-trilhos/2-roteiro-do-facilitador.docx
@@ -4371,7 +4371,7 @@
       <w:r>
         <w:drawing>
           <wp:inline distT="0" distB="0" distL="0" distR="0">
-            <wp:extent cx="4476750" cy="2038350"/>
+            <wp:extent cx="4476750" cy="1933575"/>
             <wp:effectExtent t="0" r="0" b="0" l="0"/>
             <wp:docPr id="1" name="" descr="" title=""/>
             <wp:cNvGraphicFramePr>
@@ -4396,7 +4396,7 @@
                   <pic:spPr bwMode="auto">
                     <a:xfrm>
                       <a:off x="0" y="0"/>
-                      <a:ext cx="4476750" cy="2038350"/>
+                      <a:ext cx="4476750" cy="1933575"/>
                     </a:xfrm>
                     <a:prstGeom prst="rect">
                       <a:avLst/>
@@ -4445,7 +4445,7 @@
         <w:spacing w:after="80" w:line="290"/>
       </w:pPr>
       <w:r>
-        <w:t xml:space="preserve">Na feature, o vagão Cartões é construído e volta para o pátio.</w:t>
+        <w:t xml:space="preserve">Na feature, o vagão Cartões é construído e volta para o pátio, onde ocupa o lugar tracejado.</w:t>
       </w:r>
     </w:p>
     <w:p>
@@ -4458,7 +4458,7 @@
         <w:spacing w:after="80" w:line="290"/>
       </w:pPr>
       <w:r>
-        <w:t xml:space="preserve">Quando a composição do pátio fica pronta, vai inteira para a vistoria, a release. Aprovada, entra na linha comercial e também volta para o pátio.</w:t>
+        <w:t xml:space="preserve">Quando a composição do pátio fica pronta, vai inteira para a vistoria, a release, já com o Cartões. Aprovada, entra na linha comercial e também volta para o pátio. O trem comercial ainda não tem o Cartões: ele só chega aos passageiros pela vistoria.</w:t>
       </w:r>
     </w:p>
     <w:p>

</xml_diff>